<commit_message>
Update ARC notification to reflect OncoCel + TCT Oncology partnership
OncoCel LLC launches BMTCI at CCCUPR; works in collaboration with
TCT Oncology which operates the allo-HSCT program at Auxilio Mutuo.
Document now clearly shows the dual-site network structure with
OncoCel at CCCUPR and TCT Oncology at HAM.

https://claude.ai/code/session_01D1GqSzvzsb5T4NMhTpgnob
</commit_message>
<xml_diff>
--- a/output/OncoCel_ARC_Volume_Notification.docx
+++ b/output/OncoCel_ARC_Volume_Notification.docx
@@ -119,7 +119,18 @@
           <w:color w:val="2C2C2C"/>
           <w:sz w:val="18"/>
         </w:rPr>
-        <w:t>ARC is the only FACT-accredited apheresis and cell processing provider on the island. As OncoCel scales its three-pillar program — autologous HCT, allogeneic HSCT, and CAR-T cellular therapy — ARC's collection and processing volume will increase significantly. This document provides ARC with advance notice of projected volumes to support capacity planning and contract scope review.</w:t>
+        <w:t>OncoCel works in collaboration with TCT Oncology, which operates the established allogeneic HSCT program and CIBMTR reporting infrastructure at Auxilio Mutuo Hospital (HAM). Together, the OncoCel-TCT partnership creates Puerto Rico's first comprehensive cellular therapy network — with CCCUPR handling autologous HCT and CAR-T, and HAM continuing as the allo-HSCT center through TCT Oncology.</w:t>
+      </w:r>
+    </w:p>
+    <w:p>
+      <w:r>
+        <w:rPr>
+          <w:rFonts w:ascii="Calibri" w:hAnsi="Calibri"/>
+          <w:b w:val="0"/>
+          <w:color w:val="2C2C2C"/>
+          <w:sz w:val="18"/>
+        </w:rPr>
+        <w:t>ARC is the only FACT-accredited apheresis and cell processing provider on the island. As the OncoCel-TCT network scales across both sites, ARC's collection and processing volume will increase significantly. This document provides ARC with advance notice of projected volumes to support capacity planning and contract scope review.</w:t>
       </w:r>
     </w:p>
     <w:p>
@@ -136,7 +147,7 @@
           <w:color w:val="1B2A4A"/>
           <w:sz w:val="17"/>
         </w:rPr>
-        <w:t>Purpose: Give ARC a heads-up on anticipated volume growth so both organizations can plan capacity, amend contract scope, and ensure service continuity.</w:t>
+        <w:t>Purpose: Give ARC a heads-up on anticipated volume growth across the OncoCel (CCCUPR) and TCT Oncology (HAM) network so both organizations can plan capacity, amend contract scope, and ensure service continuity.</w:t>
       </w:r>
     </w:p>
     <w:p>
@@ -727,7 +738,7 @@
           <w:color w:val="2C2C2C"/>
           <w:sz w:val="17"/>
         </w:rPr>
-        <w:t>OncoCel also operates the allogeneic HSCT program at Auxilio Mutuo Hospital (HAM). Patients identified at CCCUPR who need allo-HSCT will be referred to HAM, generating additional donor collection volume for ARC.</w:t>
+        <w:t>OncoCel's partner, TCT Oncology, operates the allogeneic HSCT program at Auxilio Mutuo Hospital (HAM). Patients identified at CCCUPR who need allo-HSCT will be referred to HAM through TCT Oncology, generating additional donor collection volume for ARC across both sites.</w:t>
       </w:r>
     </w:p>
     <w:p>
@@ -1305,7 +1316,7 @@
                 <w:color w:val="2C2C2C"/>
                 <w:sz w:val="16"/>
               </w:rPr>
-              <w:t>Allogeneic donor collections (HAM)</w:t>
+              <w:t>Allo donor collections (HAM via TCT Oncology)</w:t>
             </w:r>
           </w:p>
         </w:tc>
@@ -3825,7 +3836,7 @@
           <w:color w:val="1B2A4A"/>
           <w:sz w:val="17"/>
         </w:rPr>
-        <w:t>ARC is positioned as the sole on-island partner for this growth. No other FACT-accredited provider in Puerto Rico can support the apheresis and cell processing requirements of a multi-modality cellular therapy program.</w:t>
+        <w:t>ARC is positioned as the sole on-island partner for this growth. No other FACT-accredited provider in Puerto Rico can support the apheresis and cell processing requirements of the OncoCel-TCT Oncology cellular therapy network.</w:t>
       </w:r>
     </w:p>
     <w:p>
@@ -4129,7 +4140,7 @@
                 <w:color w:val="2C2C2C"/>
                 <w:sz w:val="16"/>
               </w:rPr>
-              <w:t>First autologous HSC collections</w:t>
+              <w:t>First autologous HSC collections (CCCUPR)</w:t>
             </w:r>
           </w:p>
         </w:tc>
@@ -4228,7 +4239,7 @@
                 <w:color w:val="2C2C2C"/>
                 <w:sz w:val="16"/>
               </w:rPr>
-              <w:t>First CAR-T leukapheresis</w:t>
+              <w:t>First CAR-T leukapheresis (CCCUPR)</w:t>
             </w:r>
           </w:p>
         </w:tc>
@@ -4327,7 +4338,7 @@
                 <w:color w:val="2C2C2C"/>
                 <w:sz w:val="16"/>
               </w:rPr>
-              <w:t>Allo-HSCT donor collections ramp at HAM</w:t>
+              <w:t>Allo-HSCT donor collections ramp (HAM via TCT)</w:t>
             </w:r>
           </w:p>
         </w:tc>
@@ -4698,7 +4709,18 @@
           <w:color w:val="777777"/>
           <w:sz w:val="15"/>
         </w:rPr>
-        <w:t>In collaboration with Centro Comprensivo de Cancer · Universidad de Puerto Rico</w:t>
+        <w:t>In collaboration with TCT Oncology (Auxilio Mutuo Hospital)</w:t>
+      </w:r>
+    </w:p>
+    <w:p>
+      <w:r>
+        <w:rPr>
+          <w:rFonts w:ascii="Calibri" w:hAnsi="Calibri"/>
+          <w:i/>
+          <w:color w:val="777777"/>
+          <w:sz w:val="15"/>
+        </w:rPr>
+        <w:t>Centro Comprensivo de Cancer · Universidad de Puerto Rico</w:t>
       </w:r>
     </w:p>
     <w:p>

</xml_diff>

<commit_message>
Fix roles: TCT Oncology launches at CCCUPR, OncoCel supports
TCT Oncology is the clinical operator launching the BMTCI Program at
CCCUPR and running allo-HSCT at HAM. OncoCel LLC provides strategic,
operational, and research infrastructure support.

https://claude.ai/code/session_01D1GqSzvzsb5T4NMhTpgnob
</commit_message>
<xml_diff>
--- a/output/OncoCel_ARC_Volume_Notification.docx
+++ b/output/OncoCel_ARC_Volume_Notification.docx
@@ -108,7 +108,7 @@
           <w:color w:val="2C2C2C"/>
           <w:sz w:val="18"/>
         </w:rPr>
-        <w:t>OncoCel LLC is launching a BMTCI Program (Hematopoietic Stem Cell Transplantation &amp; Cellular Immunotherapy) at the Centro Comprensivo de Cancer de la Universidad de Puerto Rico (CCCUPR), with clinical operations beginning August 2026.</w:t>
+        <w:t>TCT Oncology is launching a BMTCI Program (Hematopoietic Stem Cell Transplantation &amp; Cellular Immunotherapy) at the Centro Comprensivo de Cancer de la Universidad de Puerto Rico (CCCUPR), with clinical operations beginning August 2026. OncoCel LLC provides strategic, operational, and research infrastructure support to the program.</w:t>
       </w:r>
     </w:p>
     <w:p>
@@ -119,7 +119,7 @@
           <w:color w:val="2C2C2C"/>
           <w:sz w:val="18"/>
         </w:rPr>
-        <w:t>OncoCel works in collaboration with TCT Oncology, which operates the established allogeneic HSCT program and CIBMTR reporting infrastructure at Auxilio Mutuo Hospital (HAM). Together, the OncoCel-TCT partnership creates Puerto Rico's first comprehensive cellular therapy network — with CCCUPR handling autologous HCT and CAR-T, and HAM continuing as the allo-HSCT center through TCT Oncology.</w:t>
+        <w:t>TCT Oncology also operates the established allogeneic HSCT program and CIBMTR reporting infrastructure at Auxilio Mutuo Hospital (HAM). Together, TCT Oncology and OncoCel create Puerto Rico's first comprehensive cellular therapy network — with CCCUPR handling autologous HCT and CAR-T, and HAM continuing as the allo-HSCT center.</w:t>
       </w:r>
     </w:p>
     <w:p>
@@ -130,7 +130,7 @@
           <w:color w:val="2C2C2C"/>
           <w:sz w:val="18"/>
         </w:rPr>
-        <w:t>ARC is the only FACT-accredited apheresis and cell processing provider on the island. As the OncoCel-TCT network scales across both sites, ARC's collection and processing volume will increase significantly. This document provides ARC with advance notice of projected volumes to support capacity planning and contract scope review.</w:t>
+        <w:t>ARC is the only FACT-accredited apheresis and cell processing provider on the island. As TCT Oncology scales across both sites with OncoCel support, ARC's collection and processing volume will increase significantly. This document provides ARC with advance notice of projected volumes to support capacity planning and contract scope review.</w:t>
       </w:r>
     </w:p>
     <w:p>
@@ -147,7 +147,7 @@
           <w:color w:val="1B2A4A"/>
           <w:sz w:val="17"/>
         </w:rPr>
-        <w:t>Purpose: Give ARC a heads-up on anticipated volume growth across the OncoCel (CCCUPR) and TCT Oncology (HAM) network so both organizations can plan capacity, amend contract scope, and ensure service continuity.</w:t>
+        <w:t>Purpose: Give ARC a heads-up on anticipated volume growth across TCT Oncology at CCCUPR and HAM — supported by OncoCel — so both organizations can plan capacity, amend contract scope, and ensure service continuity.</w:t>
       </w:r>
     </w:p>
     <w:p>
@@ -738,7 +738,7 @@
           <w:color w:val="2C2C2C"/>
           <w:sz w:val="17"/>
         </w:rPr>
-        <w:t>OncoCel's partner, TCT Oncology, operates the allogeneic HSCT program at Auxilio Mutuo Hospital (HAM). Patients identified at CCCUPR who need allo-HSCT will be referred to HAM through TCT Oncology, generating additional donor collection volume for ARC across both sites.</w:t>
+        <w:t>TCT Oncology also operates the allogeneic HSCT program at Auxilio Mutuo Hospital (HAM). Patients identified at CCCUPR who need allo-HSCT will be referred to HAM through TCT Oncology, generating additional donor collection volume for ARC across both sites.</w:t>
       </w:r>
     </w:p>
     <w:p>
@@ -3836,7 +3836,7 @@
           <w:color w:val="1B2A4A"/>
           <w:sz w:val="17"/>
         </w:rPr>
-        <w:t>ARC is positioned as the sole on-island partner for this growth. No other FACT-accredited provider in Puerto Rico can support the apheresis and cell processing requirements of the OncoCel-TCT Oncology cellular therapy network.</w:t>
+        <w:t>ARC is positioned as the sole on-island partner for this growth. No other FACT-accredited provider in Puerto Rico can support the apheresis and cell processing requirements of TCT Oncology's cellular therapy network.</w:t>
       </w:r>
     </w:p>
     <w:p>
@@ -4041,7 +4041,7 @@
                 <w:color w:val="2C2C2C"/>
                 <w:sz w:val="16"/>
               </w:rPr>
-              <w:t>OncoCel begins clinical operations at CCCUPR</w:t>
+              <w:t>TCT Oncology launches BMTCI at CCCUPR</w:t>
             </w:r>
           </w:p>
         </w:tc>
@@ -4592,7 +4592,7 @@
           <w:color w:val="007B7F"/>
           <w:sz w:val="18"/>
         </w:rPr>
-        <w:t>OncoCel proposes a meeting with ARC leadership to:</w:t>
+        <w:t>OncoCel, on behalf of TCT Oncology, proposes a meeting with ARC leadership to:</w:t>
       </w:r>
     </w:p>
     <w:p>
@@ -4709,18 +4709,7 @@
           <w:color w:val="777777"/>
           <w:sz w:val="15"/>
         </w:rPr>
-        <w:t>In collaboration with TCT Oncology (Auxilio Mutuo Hospital)</w:t>
-      </w:r>
-    </w:p>
-    <w:p>
-      <w:r>
-        <w:rPr>
-          <w:rFonts w:ascii="Calibri" w:hAnsi="Calibri"/>
-          <w:i/>
-          <w:color w:val="777777"/>
-          <w:sz w:val="15"/>
-        </w:rPr>
-        <w:t>Centro Comprensivo de Cancer · Universidad de Puerto Rico</w:t>
+        <w:t>Supporting TCT Oncology at CCCUPR and Auxilio Mutuo Hospital</w:t>
       </w:r>
     </w:p>
     <w:p>

</xml_diff>

<commit_message>
Rebrand ARC document with official OncoCel Brand Identity System
Applied exact brand palette from OncoCel Logo System (April 2026):
Deep Navy #0C2340, Biotech Blue #1B5E8A, Teal #007C8A, Cyan #00A3B5,
Gold Accent #C4A35A. Letterhead header with gold bar extracted from
brand guide. Section dividers use gold accent. Table headers alternate
between Deep Navy and Teal per brand hierarchy.

https://claude.ai/code/session_01D1GqSzvzsb5T4NMhTpgnob
</commit_message>
<xml_diff>
--- a/output/OncoCel_ARC_Volume_Notification.docx
+++ b/output/OncoCel_ARC_Volume_Notification.docx
@@ -2,6 +2,45 @@
 <file path=word/document.xml><?xml version="1.0" encoding="utf-8"?>
 <w:document xmlns:wpc="http://schemas.microsoft.com/office/word/2010/wordprocessingCanvas" xmlns:mo="http://schemas.microsoft.com/office/mac/office/2008/main" xmlns:mc="http://schemas.openxmlformats.org/markup-compatibility/2006" xmlns:mv="urn:schemas-microsoft-com:mac:vml" xmlns:o="urn:schemas-microsoft-com:office:office" xmlns:r="http://schemas.openxmlformats.org/officeDocument/2006/relationships" xmlns:m="http://schemas.openxmlformats.org/officeDocument/2006/math" xmlns:v="urn:schemas-microsoft-com:vml" xmlns:wp14="http://schemas.microsoft.com/office/word/2010/wordprocessingDrawing" xmlns:wp="http://schemas.openxmlformats.org/drawingml/2006/wordprocessingDrawing" xmlns:w10="urn:schemas-microsoft-com:office:word" xmlns:w="http://schemas.openxmlformats.org/wordprocessingml/2006/main" xmlns:w14="http://schemas.microsoft.com/office/word/2010/wordml" xmlns:wpg="http://schemas.microsoft.com/office/word/2010/wordprocessingGroup" xmlns:wpi="http://schemas.microsoft.com/office/word/2010/wordprocessingInk" xmlns:wne="http://schemas.microsoft.com/office/word/2006/wordml" xmlns:wps="http://schemas.microsoft.com/office/word/2010/wordprocessingShape" mc:Ignorable="w14 wp14">
   <w:body>
+    <w:p>
+      <w:pPr>
+        <w:jc w:val="center"/>
+      </w:pPr>
+      <w:r>
+        <w:drawing>
+          <wp:inline xmlns:a="http://schemas.openxmlformats.org/drawingml/2006/main" xmlns:pic="http://schemas.openxmlformats.org/drawingml/2006/picture">
+            <wp:extent cx="5669280" cy="518216"/>
+            <wp:docPr id="1" name="Picture 1"/>
+            <wp:cNvGraphicFramePr>
+              <a:graphicFrameLocks noChangeAspect="1"/>
+            </wp:cNvGraphicFramePr>
+            <a:graphic>
+              <a:graphicData uri="http://schemas.openxmlformats.org/drawingml/2006/picture">
+                <pic:pic>
+                  <pic:nvPicPr>
+                    <pic:cNvPr id="0" name="oncocel_letterhead.png"/>
+                    <pic:cNvPicPr/>
+                  </pic:nvPicPr>
+                  <pic:blipFill>
+                    <a:blip r:embed="rId9"/>
+                    <a:stretch>
+                      <a:fillRect/>
+                    </a:stretch>
+                  </pic:blipFill>
+                  <pic:spPr>
+                    <a:xfrm>
+                      <a:off x="0" y="0"/>
+                      <a:ext cx="5669280" cy="518216"/>
+                    </a:xfrm>
+                    <a:prstGeom prst="rect"/>
+                  </pic:spPr>
+                </pic:pic>
+              </a:graphicData>
+            </a:graphic>
+          </wp:inline>
+        </w:drawing>
+      </w:r>
+    </w:p>
     <w:p>
       <w:pPr>
         <w:jc w:val="left"/>
@@ -10,34 +49,8 @@
         <w:rPr>
           <w:rFonts w:ascii="Calibri" w:hAnsi="Calibri"/>
           <w:b/>
-          <w:color w:val="1B2A4A"/>
-          <w:sz w:val="52"/>
-        </w:rPr>
-        <w:t>ONCOCEL</w:t>
-      </w:r>
-      <w:r>
-        <w:rPr>
-          <w:rFonts w:ascii="Calibri" w:hAnsi="Calibri"/>
-          <w:color w:val="777777"/>
-          <w:sz w:val="28"/>
-        </w:rPr>
-        <w:t xml:space="preserve">  LLC</w:t>
-      </w:r>
-    </w:p>
-    <w:p>
-      <w:pPr>
-        <w:pBdr>
-          <w:bottom w:val="single" w:sz="10" w:space="1" w:color="007B7F"/>
-        </w:pBdr>
-      </w:pPr>
-    </w:p>
-    <w:p>
-      <w:r>
-        <w:rPr>
-          <w:rFonts w:ascii="Calibri" w:hAnsi="Calibri"/>
-          <w:b/>
-          <w:color w:val="007B7F"/>
-          <w:sz w:val="36"/>
+          <w:color w:val="0C2340"/>
+          <w:sz w:val="40"/>
         </w:rPr>
         <w:t>Volume Growth Notification</w:t>
       </w:r>
@@ -46,7 +59,7 @@
       <w:r>
         <w:rPr>
           <w:rFonts w:ascii="Calibri" w:hAnsi="Calibri"/>
-          <w:color w:val="2C2C2C"/>
+          <w:color w:val="1B5E8A"/>
           <w:sz w:val="22"/>
         </w:rPr>
         <w:t>Prepared for American Red Cross (ARC)</w:t>
@@ -57,7 +70,7 @@
         <w:rPr>
           <w:rFonts w:ascii="Calibri" w:hAnsi="Calibri"/>
           <w:i/>
-          <w:color w:val="777777"/>
+          <w:color w:val="666666"/>
           <w:sz w:val="18"/>
         </w:rPr>
         <w:t>Apheresis &amp; Cell Processing Services — Anticipated Volume Increase</w:t>
@@ -67,10 +80,10 @@
       <w:r>
         <w:rPr>
           <w:rFonts w:ascii="Calibri" w:hAnsi="Calibri"/>
-          <w:color w:val="777777"/>
+          <w:color w:val="999999"/>
           <w:sz w:val="17"/>
         </w:rPr>
-        <w:t>June 2026  |  Confidential</w:t>
+        <w:t>June 2026  ·  Confidential</w:t>
       </w:r>
     </w:p>
     <w:p>
@@ -78,7 +91,7 @@
         <w:rPr>
           <w:rFonts w:ascii="Calibri" w:hAnsi="Calibri"/>
           <w:b/>
-          <w:color w:val="007B7F"/>
+          <w:color w:val="C4A35A"/>
           <w:sz w:val="18"/>
         </w:rPr>
         <w:t xml:space="preserve">01  </w:t>
@@ -87,7 +100,7 @@
         <w:rPr>
           <w:rFonts w:ascii="Calibri" w:hAnsi="Calibri"/>
           <w:b/>
-          <w:color w:val="1B2A4A"/>
+          <w:color w:val="0C2340"/>
           <w:sz w:val="26"/>
         </w:rPr>
         <w:t>CONTEXT</w:t>
@@ -96,7 +109,7 @@
     <w:p>
       <w:pPr>
         <w:pBdr>
-          <w:bottom w:val="single" w:sz="6" w:space="1" w:color="007B7F"/>
+          <w:bottom w:val="single" w:sz="6" w:space="1" w:color="C4A35A"/>
         </w:pBdr>
       </w:pPr>
     </w:p>
@@ -105,7 +118,7 @@
         <w:rPr>
           <w:rFonts w:ascii="Calibri" w:hAnsi="Calibri"/>
           <w:b w:val="0"/>
-          <w:color w:val="2C2C2C"/>
+          <w:color w:val="333333"/>
           <w:sz w:val="18"/>
         </w:rPr>
         <w:t>TCT Oncology is launching a BMTCI Program (Hematopoietic Stem Cell Transplantation &amp; Cellular Immunotherapy) at the Centro Comprensivo de Cancer de la Universidad de Puerto Rico (CCCUPR), with clinical operations beginning August 2026. OncoCel LLC provides strategic, operational, and research infrastructure support to the program.</w:t>
@@ -116,7 +129,7 @@
         <w:rPr>
           <w:rFonts w:ascii="Calibri" w:hAnsi="Calibri"/>
           <w:b w:val="0"/>
-          <w:color w:val="2C2C2C"/>
+          <w:color w:val="333333"/>
           <w:sz w:val="18"/>
         </w:rPr>
         <w:t>TCT Oncology also operates the established allogeneic HSCT program and CIBMTR reporting infrastructure at Auxilio Mutuo Hospital (HAM). Together, TCT Oncology and OncoCel create Puerto Rico's first comprehensive cellular therapy network — with CCCUPR handling autologous HCT and CAR-T, and HAM continuing as the allo-HSCT center.</w:t>
@@ -127,27 +140,27 @@
         <w:rPr>
           <w:rFonts w:ascii="Calibri" w:hAnsi="Calibri"/>
           <w:b w:val="0"/>
-          <w:color w:val="2C2C2C"/>
+          <w:color w:val="333333"/>
           <w:sz w:val="18"/>
         </w:rPr>
-        <w:t>ARC is the only FACT-accredited apheresis and cell processing provider on the island. As TCT Oncology scales across both sites with OncoCel support, ARC's collection and processing volume will increase significantly. This document provides ARC with advance notice of projected volumes to support capacity planning and contract scope review.</w:t>
+        <w:t>ARC is the only FACT-accredited apheresis and cell processing provider on the island. As TCT Oncology scales across both sites with OncoCel support, ARC's collection and processing volume will increase significantly.</w:t>
       </w:r>
     </w:p>
     <w:p>
       <w:pPr>
         <w:ind w:left="216"/>
         <w:pBdr>
-          <w:left w:val="single" w:sz="16" w:space="8" w:color="007B7F"/>
+          <w:left w:val="single" w:sz="18" w:space="8" w:color="C4A35A"/>
         </w:pBdr>
       </w:pPr>
       <w:r>
         <w:rPr>
           <w:rFonts w:ascii="Calibri" w:hAnsi="Calibri"/>
           <w:b/>
-          <w:color w:val="1B2A4A"/>
+          <w:color w:val="0C2340"/>
           <w:sz w:val="17"/>
         </w:rPr>
-        <w:t>Purpose: Give ARC a heads-up on anticipated volume growth across TCT Oncology at CCCUPR and HAM — supported by OncoCel — so both organizations can plan capacity, amend contract scope, and ensure service continuity.</w:t>
+        <w:t>Purpose: Provide ARC advance notice of anticipated volume growth across TCT Oncology at CCCUPR and HAM — supported by OncoCel — to enable capacity planning, contract scope review, and service continuity.</w:t>
       </w:r>
     </w:p>
     <w:p>
@@ -155,7 +168,7 @@
         <w:rPr>
           <w:rFonts w:ascii="Calibri" w:hAnsi="Calibri"/>
           <w:b/>
-          <w:color w:val="007B7F"/>
+          <w:color w:val="C4A35A"/>
           <w:sz w:val="18"/>
         </w:rPr>
         <w:t xml:space="preserve">02  </w:t>
@@ -164,16 +177,16 @@
         <w:rPr>
           <w:rFonts w:ascii="Calibri" w:hAnsi="Calibri"/>
           <w:b/>
-          <w:color w:val="1B2A4A"/>
+          <w:color w:val="0C2340"/>
           <w:sz w:val="26"/>
         </w:rPr>
-        <w:t>ONCOCEL PROGRAM PHASES</w:t>
+        <w:t>PROGRAM PHASES</w:t>
       </w:r>
     </w:p>
     <w:p>
       <w:pPr>
         <w:pBdr>
-          <w:bottom w:val="single" w:sz="6" w:space="1" w:color="007B7F"/>
+          <w:bottom w:val="single" w:sz="6" w:space="1" w:color="C4A35A"/>
         </w:pBdr>
       </w:pPr>
     </w:p>
@@ -194,16 +207,16 @@
         <w:tc>
           <w:tcPr>
             <w:tcW w:type="dxa" w:w="2436"/>
-            <w:shd w:fill="007B7F"/>
+            <w:shd w:fill="007C8A"/>
             <w:tcBorders>
-              <w:top w:val="single" w:sz="2" w:space="0" w:color="007B7F"/>
-              <w:bottom w:val="single" w:sz="2" w:space="0" w:color="007B7F"/>
-              <w:left w:val="single" w:sz="2" w:space="0" w:color="007B7F"/>
-              <w:right w:val="single" w:sz="2" w:space="0" w:color="007B7F"/>
+              <w:top w:val="single" w:sz="2" w:space="0" w:color="007C8A"/>
+              <w:bottom w:val="single" w:sz="2" w:space="0" w:color="007C8A"/>
+              <w:left w:val="single" w:sz="2" w:space="0" w:color="007C8A"/>
+              <w:right w:val="single" w:sz="2" w:space="0" w:color="007C8A"/>
             </w:tcBorders>
             <w:tcMar>
-              <w:top w:w="40" w:type="dxa"/>
-              <w:bottom w:w="40" w:type="dxa"/>
+              <w:top w:w="45" w:type="dxa"/>
+              <w:bottom w:w="45" w:type="dxa"/>
               <w:left w:w="80" w:type="dxa"/>
               <w:right w:w="80" w:type="dxa"/>
             </w:tcMar>
@@ -227,16 +240,16 @@
         <w:tc>
           <w:tcPr>
             <w:tcW w:type="dxa" w:w="2436"/>
-            <w:shd w:fill="007B7F"/>
+            <w:shd w:fill="007C8A"/>
             <w:tcBorders>
-              <w:top w:val="single" w:sz="2" w:space="0" w:color="007B7F"/>
-              <w:bottom w:val="single" w:sz="2" w:space="0" w:color="007B7F"/>
-              <w:left w:val="single" w:sz="2" w:space="0" w:color="007B7F"/>
-              <w:right w:val="single" w:sz="2" w:space="0" w:color="007B7F"/>
+              <w:top w:val="single" w:sz="2" w:space="0" w:color="007C8A"/>
+              <w:bottom w:val="single" w:sz="2" w:space="0" w:color="007C8A"/>
+              <w:left w:val="single" w:sz="2" w:space="0" w:color="007C8A"/>
+              <w:right w:val="single" w:sz="2" w:space="0" w:color="007C8A"/>
             </w:tcBorders>
             <w:tcMar>
-              <w:top w:w="40" w:type="dxa"/>
-              <w:bottom w:w="40" w:type="dxa"/>
+              <w:top w:w="45" w:type="dxa"/>
+              <w:bottom w:w="45" w:type="dxa"/>
               <w:left w:w="80" w:type="dxa"/>
               <w:right w:w="80" w:type="dxa"/>
             </w:tcMar>
@@ -260,16 +273,16 @@
         <w:tc>
           <w:tcPr>
             <w:tcW w:type="dxa" w:w="2436"/>
-            <w:shd w:fill="007B7F"/>
+            <w:shd w:fill="007C8A"/>
             <w:tcBorders>
-              <w:top w:val="single" w:sz="2" w:space="0" w:color="007B7F"/>
-              <w:bottom w:val="single" w:sz="2" w:space="0" w:color="007B7F"/>
-              <w:left w:val="single" w:sz="2" w:space="0" w:color="007B7F"/>
-              <w:right w:val="single" w:sz="2" w:space="0" w:color="007B7F"/>
+              <w:top w:val="single" w:sz="2" w:space="0" w:color="007C8A"/>
+              <w:bottom w:val="single" w:sz="2" w:space="0" w:color="007C8A"/>
+              <w:left w:val="single" w:sz="2" w:space="0" w:color="007C8A"/>
+              <w:right w:val="single" w:sz="2" w:space="0" w:color="007C8A"/>
             </w:tcBorders>
             <w:tcMar>
-              <w:top w:w="40" w:type="dxa"/>
-              <w:bottom w:w="40" w:type="dxa"/>
+              <w:top w:w="45" w:type="dxa"/>
+              <w:bottom w:w="45" w:type="dxa"/>
               <w:left w:w="80" w:type="dxa"/>
               <w:right w:w="80" w:type="dxa"/>
             </w:tcMar>
@@ -293,16 +306,16 @@
         <w:tc>
           <w:tcPr>
             <w:tcW w:type="dxa" w:w="2436"/>
-            <w:shd w:fill="007B7F"/>
+            <w:shd w:fill="007C8A"/>
             <w:tcBorders>
-              <w:top w:val="single" w:sz="2" w:space="0" w:color="007B7F"/>
-              <w:bottom w:val="single" w:sz="2" w:space="0" w:color="007B7F"/>
-              <w:left w:val="single" w:sz="2" w:space="0" w:color="007B7F"/>
-              <w:right w:val="single" w:sz="2" w:space="0" w:color="007B7F"/>
+              <w:top w:val="single" w:sz="2" w:space="0" w:color="007C8A"/>
+              <w:bottom w:val="single" w:sz="2" w:space="0" w:color="007C8A"/>
+              <w:left w:val="single" w:sz="2" w:space="0" w:color="007C8A"/>
+              <w:right w:val="single" w:sz="2" w:space="0" w:color="007C8A"/>
             </w:tcBorders>
             <w:tcMar>
-              <w:top w:w="40" w:type="dxa"/>
-              <w:bottom w:w="40" w:type="dxa"/>
+              <w:top w:w="45" w:type="dxa"/>
+              <w:bottom w:w="45" w:type="dxa"/>
               <w:left w:w="80" w:type="dxa"/>
               <w:right w:w="80" w:type="dxa"/>
             </w:tcMar>
@@ -330,14 +343,14 @@
             <w:tcW w:type="dxa" w:w="2436"/>
             <w:shd w:fill="FFFFFF"/>
             <w:tcBorders>
-              <w:top w:val="single" w:sz="2" w:space="0" w:color="CCCCCC"/>
-              <w:bottom w:val="single" w:sz="2" w:space="0" w:color="CCCCCC"/>
-              <w:left w:val="single" w:sz="2" w:space="0" w:color="CCCCCC"/>
-              <w:right w:val="single" w:sz="2" w:space="0" w:color="CCCCCC"/>
+              <w:top w:val="single" w:sz="2" w:space="0" w:color="D8D8D8"/>
+              <w:bottom w:val="single" w:sz="2" w:space="0" w:color="D8D8D8"/>
+              <w:left w:val="single" w:sz="2" w:space="0" w:color="D8D8D8"/>
+              <w:right w:val="single" w:sz="2" w:space="0" w:color="D8D8D8"/>
             </w:tcBorders>
             <w:tcMar>
-              <w:top w:w="40" w:type="dxa"/>
-              <w:bottom w:w="40" w:type="dxa"/>
+              <w:top w:w="45" w:type="dxa"/>
+              <w:bottom w:w="45" w:type="dxa"/>
               <w:left w:w="80" w:type="dxa"/>
               <w:right w:w="80" w:type="dxa"/>
             </w:tcMar>
@@ -351,7 +364,7 @@
               <w:rPr>
                 <w:rFonts w:ascii="Calibri" w:hAnsi="Calibri"/>
                 <w:b/>
-                <w:color w:val="2C2C2C"/>
+                <w:color w:val="0C2340"/>
                 <w:sz w:val="16"/>
               </w:rPr>
               <w:t>Phase 1</w:t>
@@ -363,14 +376,14 @@
             <w:tcW w:type="dxa" w:w="2436"/>
             <w:shd w:fill="FFFFFF"/>
             <w:tcBorders>
-              <w:top w:val="single" w:sz="2" w:space="0" w:color="CCCCCC"/>
-              <w:bottom w:val="single" w:sz="2" w:space="0" w:color="CCCCCC"/>
-              <w:left w:val="single" w:sz="2" w:space="0" w:color="CCCCCC"/>
-              <w:right w:val="single" w:sz="2" w:space="0" w:color="CCCCCC"/>
+              <w:top w:val="single" w:sz="2" w:space="0" w:color="D8D8D8"/>
+              <w:bottom w:val="single" w:sz="2" w:space="0" w:color="D8D8D8"/>
+              <w:left w:val="single" w:sz="2" w:space="0" w:color="D8D8D8"/>
+              <w:right w:val="single" w:sz="2" w:space="0" w:color="D8D8D8"/>
             </w:tcBorders>
             <w:tcMar>
-              <w:top w:w="40" w:type="dxa"/>
-              <w:bottom w:w="40" w:type="dxa"/>
+              <w:top w:w="45" w:type="dxa"/>
+              <w:bottom w:w="45" w:type="dxa"/>
               <w:left w:w="80" w:type="dxa"/>
               <w:right w:w="80" w:type="dxa"/>
             </w:tcMar>
@@ -383,10 +396,10 @@
             <w:r>
               <w:rPr>
                 <w:rFonts w:ascii="Calibri" w:hAnsi="Calibri"/>
-                <w:color w:val="2C2C2C"/>
+                <w:color w:val="333333"/>
                 <w:sz w:val="16"/>
               </w:rPr>
-              <w:t>Year 1 (Aug 2026-2027)</w:t>
+              <w:t>Year 1 (Aug 2026–2027)</w:t>
             </w:r>
           </w:p>
         </w:tc>
@@ -395,14 +408,14 @@
             <w:tcW w:type="dxa" w:w="2436"/>
             <w:shd w:fill="FFFFFF"/>
             <w:tcBorders>
-              <w:top w:val="single" w:sz="2" w:space="0" w:color="CCCCCC"/>
-              <w:bottom w:val="single" w:sz="2" w:space="0" w:color="CCCCCC"/>
-              <w:left w:val="single" w:sz="2" w:space="0" w:color="CCCCCC"/>
-              <w:right w:val="single" w:sz="2" w:space="0" w:color="CCCCCC"/>
+              <w:top w:val="single" w:sz="2" w:space="0" w:color="D8D8D8"/>
+              <w:bottom w:val="single" w:sz="2" w:space="0" w:color="D8D8D8"/>
+              <w:left w:val="single" w:sz="2" w:space="0" w:color="D8D8D8"/>
+              <w:right w:val="single" w:sz="2" w:space="0" w:color="D8D8D8"/>
             </w:tcBorders>
             <w:tcMar>
-              <w:top w:w="40" w:type="dxa"/>
-              <w:bottom w:w="40" w:type="dxa"/>
+              <w:top w:w="45" w:type="dxa"/>
+              <w:bottom w:w="45" w:type="dxa"/>
               <w:left w:w="80" w:type="dxa"/>
               <w:right w:w="80" w:type="dxa"/>
             </w:tcMar>
@@ -415,7 +428,7 @@
             <w:r>
               <w:rPr>
                 <w:rFonts w:ascii="Calibri" w:hAnsi="Calibri"/>
-                <w:color w:val="2C2C2C"/>
+                <w:color w:val="333333"/>
                 <w:sz w:val="16"/>
               </w:rPr>
               <w:t>Autologous HCT</w:t>
@@ -427,14 +440,14 @@
             <w:tcW w:type="dxa" w:w="2436"/>
             <w:shd w:fill="FFFFFF"/>
             <w:tcBorders>
-              <w:top w:val="single" w:sz="2" w:space="0" w:color="CCCCCC"/>
-              <w:bottom w:val="single" w:sz="2" w:space="0" w:color="CCCCCC"/>
-              <w:left w:val="single" w:sz="2" w:space="0" w:color="CCCCCC"/>
-              <w:right w:val="single" w:sz="2" w:space="0" w:color="CCCCCC"/>
+              <w:top w:val="single" w:sz="2" w:space="0" w:color="D8D8D8"/>
+              <w:bottom w:val="single" w:sz="2" w:space="0" w:color="D8D8D8"/>
+              <w:left w:val="single" w:sz="2" w:space="0" w:color="D8D8D8"/>
+              <w:right w:val="single" w:sz="2" w:space="0" w:color="D8D8D8"/>
             </w:tcBorders>
             <w:tcMar>
-              <w:top w:w="40" w:type="dxa"/>
-              <w:bottom w:w="40" w:type="dxa"/>
+              <w:top w:w="45" w:type="dxa"/>
+              <w:bottom w:w="45" w:type="dxa"/>
               <w:left w:w="80" w:type="dxa"/>
               <w:right w:w="80" w:type="dxa"/>
             </w:tcMar>
@@ -447,10 +460,10 @@
             <w:r>
               <w:rPr>
                 <w:rFonts w:ascii="Calibri" w:hAnsi="Calibri"/>
-                <w:color w:val="2C2C2C"/>
+                <w:color w:val="333333"/>
                 <w:sz w:val="16"/>
               </w:rPr>
-              <w:t>10-15 auto-HCTs</w:t>
+              <w:t>10–15 auto-HCTs</w:t>
             </w:r>
           </w:p>
         </w:tc>
@@ -459,16 +472,16 @@
         <w:tc>
           <w:tcPr>
             <w:tcW w:type="dxa" w:w="2436"/>
-            <w:shd w:fill="F5F7F8"/>
+            <w:shd w:fill="F4F7F8"/>
             <w:tcBorders>
-              <w:top w:val="single" w:sz="2" w:space="0" w:color="CCCCCC"/>
-              <w:bottom w:val="single" w:sz="2" w:space="0" w:color="CCCCCC"/>
-              <w:left w:val="single" w:sz="2" w:space="0" w:color="CCCCCC"/>
-              <w:right w:val="single" w:sz="2" w:space="0" w:color="CCCCCC"/>
+              <w:top w:val="single" w:sz="2" w:space="0" w:color="D8D8D8"/>
+              <w:bottom w:val="single" w:sz="2" w:space="0" w:color="D8D8D8"/>
+              <w:left w:val="single" w:sz="2" w:space="0" w:color="D8D8D8"/>
+              <w:right w:val="single" w:sz="2" w:space="0" w:color="D8D8D8"/>
             </w:tcBorders>
             <w:tcMar>
-              <w:top w:w="40" w:type="dxa"/>
-              <w:bottom w:w="40" w:type="dxa"/>
+              <w:top w:w="45" w:type="dxa"/>
+              <w:bottom w:w="45" w:type="dxa"/>
               <w:left w:w="80" w:type="dxa"/>
               <w:right w:w="80" w:type="dxa"/>
             </w:tcMar>
@@ -482,7 +495,7 @@
               <w:rPr>
                 <w:rFonts w:ascii="Calibri" w:hAnsi="Calibri"/>
                 <w:b/>
-                <w:color w:val="2C2C2C"/>
+                <w:color w:val="0C2340"/>
                 <w:sz w:val="16"/>
               </w:rPr>
               <w:t>Phase 2</w:t>
@@ -492,16 +505,16 @@
         <w:tc>
           <w:tcPr>
             <w:tcW w:type="dxa" w:w="2436"/>
-            <w:shd w:fill="F5F7F8"/>
+            <w:shd w:fill="F4F7F8"/>
             <w:tcBorders>
-              <w:top w:val="single" w:sz="2" w:space="0" w:color="CCCCCC"/>
-              <w:bottom w:val="single" w:sz="2" w:space="0" w:color="CCCCCC"/>
-              <w:left w:val="single" w:sz="2" w:space="0" w:color="CCCCCC"/>
-              <w:right w:val="single" w:sz="2" w:space="0" w:color="CCCCCC"/>
+              <w:top w:val="single" w:sz="2" w:space="0" w:color="D8D8D8"/>
+              <w:bottom w:val="single" w:sz="2" w:space="0" w:color="D8D8D8"/>
+              <w:left w:val="single" w:sz="2" w:space="0" w:color="D8D8D8"/>
+              <w:right w:val="single" w:sz="2" w:space="0" w:color="D8D8D8"/>
             </w:tcBorders>
             <w:tcMar>
-              <w:top w:w="40" w:type="dxa"/>
-              <w:bottom w:w="40" w:type="dxa"/>
+              <w:top w:w="45" w:type="dxa"/>
+              <w:bottom w:w="45" w:type="dxa"/>
               <w:left w:w="80" w:type="dxa"/>
               <w:right w:w="80" w:type="dxa"/>
             </w:tcMar>
@@ -514,26 +527,26 @@
             <w:r>
               <w:rPr>
                 <w:rFonts w:ascii="Calibri" w:hAnsi="Calibri"/>
-                <w:color w:val="2C2C2C"/>
+                <w:color w:val="333333"/>
                 <w:sz w:val="16"/>
               </w:rPr>
-              <w:t>Year 2-3 (2028-2029)</w:t>
+              <w:t>Year 2–3 (2028–2029)</w:t>
             </w:r>
           </w:p>
         </w:tc>
         <w:tc>
           <w:tcPr>
             <w:tcW w:type="dxa" w:w="2436"/>
-            <w:shd w:fill="F5F7F8"/>
+            <w:shd w:fill="F4F7F8"/>
             <w:tcBorders>
-              <w:top w:val="single" w:sz="2" w:space="0" w:color="CCCCCC"/>
-              <w:bottom w:val="single" w:sz="2" w:space="0" w:color="CCCCCC"/>
-              <w:left w:val="single" w:sz="2" w:space="0" w:color="CCCCCC"/>
-              <w:right w:val="single" w:sz="2" w:space="0" w:color="CCCCCC"/>
+              <w:top w:val="single" w:sz="2" w:space="0" w:color="D8D8D8"/>
+              <w:bottom w:val="single" w:sz="2" w:space="0" w:color="D8D8D8"/>
+              <w:left w:val="single" w:sz="2" w:space="0" w:color="D8D8D8"/>
+              <w:right w:val="single" w:sz="2" w:space="0" w:color="D8D8D8"/>
             </w:tcBorders>
             <w:tcMar>
-              <w:top w:w="40" w:type="dxa"/>
-              <w:bottom w:w="40" w:type="dxa"/>
+              <w:top w:w="45" w:type="dxa"/>
+              <w:bottom w:w="45" w:type="dxa"/>
               <w:left w:w="80" w:type="dxa"/>
               <w:right w:w="80" w:type="dxa"/>
             </w:tcMar>
@@ -546,7 +559,7 @@
             <w:r>
               <w:rPr>
                 <w:rFonts w:ascii="Calibri" w:hAnsi="Calibri"/>
-                <w:color w:val="2C2C2C"/>
+                <w:color w:val="333333"/>
                 <w:sz w:val="16"/>
               </w:rPr>
               <w:t>+ CAR-T + Donor Search</w:t>
@@ -556,16 +569,16 @@
         <w:tc>
           <w:tcPr>
             <w:tcW w:type="dxa" w:w="2436"/>
-            <w:shd w:fill="F5F7F8"/>
+            <w:shd w:fill="F4F7F8"/>
             <w:tcBorders>
-              <w:top w:val="single" w:sz="2" w:space="0" w:color="CCCCCC"/>
-              <w:bottom w:val="single" w:sz="2" w:space="0" w:color="CCCCCC"/>
-              <w:left w:val="single" w:sz="2" w:space="0" w:color="CCCCCC"/>
-              <w:right w:val="single" w:sz="2" w:space="0" w:color="CCCCCC"/>
+              <w:top w:val="single" w:sz="2" w:space="0" w:color="D8D8D8"/>
+              <w:bottom w:val="single" w:sz="2" w:space="0" w:color="D8D8D8"/>
+              <w:left w:val="single" w:sz="2" w:space="0" w:color="D8D8D8"/>
+              <w:right w:val="single" w:sz="2" w:space="0" w:color="D8D8D8"/>
             </w:tcBorders>
             <w:tcMar>
-              <w:top w:w="40" w:type="dxa"/>
-              <w:bottom w:w="40" w:type="dxa"/>
+              <w:top w:w="45" w:type="dxa"/>
+              <w:bottom w:w="45" w:type="dxa"/>
               <w:left w:w="80" w:type="dxa"/>
               <w:right w:w="80" w:type="dxa"/>
             </w:tcMar>
@@ -582,7 +595,7 @@
                 <w:color w:val="1E8849"/>
                 <w:sz w:val="16"/>
               </w:rPr>
-              <w:t>20-30+ transplants/yr</w:t>
+              <w:t>20–30+ transplants/yr</w:t>
             </w:r>
           </w:p>
         </w:tc>
@@ -593,14 +606,14 @@
             <w:tcW w:type="dxa" w:w="2436"/>
             <w:shd w:fill="FFFFFF"/>
             <w:tcBorders>
-              <w:top w:val="single" w:sz="2" w:space="0" w:color="CCCCCC"/>
-              <w:bottom w:val="single" w:sz="2" w:space="0" w:color="CCCCCC"/>
-              <w:left w:val="single" w:sz="2" w:space="0" w:color="CCCCCC"/>
-              <w:right w:val="single" w:sz="2" w:space="0" w:color="CCCCCC"/>
+              <w:top w:val="single" w:sz="2" w:space="0" w:color="D8D8D8"/>
+              <w:bottom w:val="single" w:sz="2" w:space="0" w:color="D8D8D8"/>
+              <w:left w:val="single" w:sz="2" w:space="0" w:color="D8D8D8"/>
+              <w:right w:val="single" w:sz="2" w:space="0" w:color="D8D8D8"/>
             </w:tcBorders>
             <w:tcMar>
-              <w:top w:w="40" w:type="dxa"/>
-              <w:bottom w:w="40" w:type="dxa"/>
+              <w:top w:w="45" w:type="dxa"/>
+              <w:bottom w:w="45" w:type="dxa"/>
               <w:left w:w="80" w:type="dxa"/>
               <w:right w:w="80" w:type="dxa"/>
             </w:tcMar>
@@ -614,7 +627,7 @@
               <w:rPr>
                 <w:rFonts w:ascii="Calibri" w:hAnsi="Calibri"/>
                 <w:b/>
-                <w:color w:val="2C2C2C"/>
+                <w:color w:val="0C2340"/>
                 <w:sz w:val="16"/>
               </w:rPr>
               <w:t>Phase 3</w:t>
@@ -626,14 +639,14 @@
             <w:tcW w:type="dxa" w:w="2436"/>
             <w:shd w:fill="FFFFFF"/>
             <w:tcBorders>
-              <w:top w:val="single" w:sz="2" w:space="0" w:color="CCCCCC"/>
-              <w:bottom w:val="single" w:sz="2" w:space="0" w:color="CCCCCC"/>
-              <w:left w:val="single" w:sz="2" w:space="0" w:color="CCCCCC"/>
-              <w:right w:val="single" w:sz="2" w:space="0" w:color="CCCCCC"/>
+              <w:top w:val="single" w:sz="2" w:space="0" w:color="D8D8D8"/>
+              <w:bottom w:val="single" w:sz="2" w:space="0" w:color="D8D8D8"/>
+              <w:left w:val="single" w:sz="2" w:space="0" w:color="D8D8D8"/>
+              <w:right w:val="single" w:sz="2" w:space="0" w:color="D8D8D8"/>
             </w:tcBorders>
             <w:tcMar>
-              <w:top w:w="40" w:type="dxa"/>
-              <w:bottom w:w="40" w:type="dxa"/>
+              <w:top w:w="45" w:type="dxa"/>
+              <w:bottom w:w="45" w:type="dxa"/>
               <w:left w:w="80" w:type="dxa"/>
               <w:right w:w="80" w:type="dxa"/>
             </w:tcMar>
@@ -659,14 +672,14 @@
             <w:tcW w:type="dxa" w:w="2436"/>
             <w:shd w:fill="FFFFFF"/>
             <w:tcBorders>
-              <w:top w:val="single" w:sz="2" w:space="0" w:color="CCCCCC"/>
-              <w:bottom w:val="single" w:sz="2" w:space="0" w:color="CCCCCC"/>
-              <w:left w:val="single" w:sz="2" w:space="0" w:color="CCCCCC"/>
-              <w:right w:val="single" w:sz="2" w:space="0" w:color="CCCCCC"/>
+              <w:top w:val="single" w:sz="2" w:space="0" w:color="D8D8D8"/>
+              <w:bottom w:val="single" w:sz="2" w:space="0" w:color="D8D8D8"/>
+              <w:left w:val="single" w:sz="2" w:space="0" w:color="D8D8D8"/>
+              <w:right w:val="single" w:sz="2" w:space="0" w:color="D8D8D8"/>
             </w:tcBorders>
             <w:tcMar>
-              <w:top w:w="40" w:type="dxa"/>
-              <w:bottom w:w="40" w:type="dxa"/>
+              <w:top w:w="45" w:type="dxa"/>
+              <w:bottom w:w="45" w:type="dxa"/>
               <w:left w:w="80" w:type="dxa"/>
               <w:right w:w="80" w:type="dxa"/>
             </w:tcMar>
@@ -679,7 +692,7 @@
             <w:r>
               <w:rPr>
                 <w:rFonts w:ascii="Calibri" w:hAnsi="Calibri"/>
-                <w:color w:val="2C2C2C"/>
+                <w:color w:val="333333"/>
                 <w:sz w:val="16"/>
               </w:rPr>
               <w:t>+ Allogeneic HCT + Gene Therapy</w:t>
@@ -691,14 +704,14 @@
             <w:tcW w:type="dxa" w:w="2436"/>
             <w:shd w:fill="FFFFFF"/>
             <w:tcBorders>
-              <w:top w:val="single" w:sz="2" w:space="0" w:color="CCCCCC"/>
-              <w:bottom w:val="single" w:sz="2" w:space="0" w:color="CCCCCC"/>
-              <w:left w:val="single" w:sz="2" w:space="0" w:color="CCCCCC"/>
-              <w:right w:val="single" w:sz="2" w:space="0" w:color="CCCCCC"/>
+              <w:top w:val="single" w:sz="2" w:space="0" w:color="D8D8D8"/>
+              <w:bottom w:val="single" w:sz="2" w:space="0" w:color="D8D8D8"/>
+              <w:left w:val="single" w:sz="2" w:space="0" w:color="D8D8D8"/>
+              <w:right w:val="single" w:sz="2" w:space="0" w:color="D8D8D8"/>
             </w:tcBorders>
             <w:tcMar>
-              <w:top w:w="40" w:type="dxa"/>
-              <w:bottom w:w="40" w:type="dxa"/>
+              <w:top w:w="45" w:type="dxa"/>
+              <w:bottom w:w="45" w:type="dxa"/>
               <w:left w:w="80" w:type="dxa"/>
               <w:right w:w="80" w:type="dxa"/>
             </w:tcMar>
@@ -711,7 +724,7 @@
             <w:r>
               <w:rPr>
                 <w:rFonts w:ascii="Calibri" w:hAnsi="Calibri"/>
-                <w:color w:val="2C2C2C"/>
+                <w:color w:val="333333"/>
                 <w:sz w:val="16"/>
               </w:rPr>
               <w:t>Full-spectrum program</w:t>
@@ -725,7 +738,7 @@
         <w:rPr>
           <w:rFonts w:ascii="Calibri" w:hAnsi="Calibri"/>
           <w:b w:val="0"/>
-          <w:color w:val="2C2C2C"/>
+          <w:color w:val="333333"/>
           <w:sz w:val="18"/>
         </w:rPr>
       </w:r>
@@ -735,10 +748,10 @@
         <w:rPr>
           <w:rFonts w:ascii="Calibri" w:hAnsi="Calibri"/>
           <w:b w:val="0"/>
-          <w:color w:val="2C2C2C"/>
+          <w:color w:val="333333"/>
           <w:sz w:val="17"/>
         </w:rPr>
-        <w:t>TCT Oncology also operates the allogeneic HSCT program at Auxilio Mutuo Hospital (HAM). Patients identified at CCCUPR who need allo-HSCT will be referred to HAM through TCT Oncology, generating additional donor collection volume for ARC across both sites.</w:t>
+        <w:t>TCT Oncology also operates the allogeneic HSCT program at Auxilio Mutuo Hospital (HAM). Patients identified at CCCUPR who need allo-HSCT will be referred to HAM, generating additional donor collection volume for ARC across both sites.</w:t>
       </w:r>
     </w:p>
     <w:p>
@@ -746,7 +759,7 @@
         <w:rPr>
           <w:rFonts w:ascii="Calibri" w:hAnsi="Calibri"/>
           <w:b/>
-          <w:color w:val="007B7F"/>
+          <w:color w:val="C4A35A"/>
           <w:sz w:val="18"/>
         </w:rPr>
         <w:t xml:space="preserve">03  </w:t>
@@ -755,7 +768,7 @@
         <w:rPr>
           <w:rFonts w:ascii="Calibri" w:hAnsi="Calibri"/>
           <w:b/>
-          <w:color w:val="1B2A4A"/>
+          <w:color w:val="0C2340"/>
           <w:sz w:val="26"/>
         </w:rPr>
         <w:t>PROJECTED ARC COLLECTION VOLUMES</w:t>
@@ -764,7 +777,7 @@
     <w:p>
       <w:pPr>
         <w:pBdr>
-          <w:bottom w:val="single" w:sz="6" w:space="1" w:color="007B7F"/>
+          <w:bottom w:val="single" w:sz="6" w:space="1" w:color="C4A35A"/>
         </w:pBdr>
       </w:pPr>
     </w:p>
@@ -773,7 +786,7 @@
         <w:rPr>
           <w:rFonts w:ascii="Calibri" w:hAnsi="Calibri"/>
           <w:b/>
-          <w:color w:val="007B7F"/>
+          <w:color w:val="007C8A"/>
           <w:sz w:val="18"/>
         </w:rPr>
         <w:t>All volumes below represent new programmatic activity. This is not a redistribution of existing ARC workload.</w:t>
@@ -797,16 +810,16 @@
         <w:tc>
           <w:tcPr>
             <w:tcW w:type="dxa" w:w="1949"/>
-            <w:shd w:fill="007B7F"/>
+            <w:shd w:fill="007C8A"/>
             <w:tcBorders>
-              <w:top w:val="single" w:sz="2" w:space="0" w:color="007B7F"/>
-              <w:bottom w:val="single" w:sz="2" w:space="0" w:color="007B7F"/>
-              <w:left w:val="single" w:sz="2" w:space="0" w:color="007B7F"/>
-              <w:right w:val="single" w:sz="2" w:space="0" w:color="007B7F"/>
+              <w:top w:val="single" w:sz="2" w:space="0" w:color="007C8A"/>
+              <w:bottom w:val="single" w:sz="2" w:space="0" w:color="007C8A"/>
+              <w:left w:val="single" w:sz="2" w:space="0" w:color="007C8A"/>
+              <w:right w:val="single" w:sz="2" w:space="0" w:color="007C8A"/>
             </w:tcBorders>
             <w:tcMar>
-              <w:top w:w="40" w:type="dxa"/>
-              <w:bottom w:w="40" w:type="dxa"/>
+              <w:top w:w="45" w:type="dxa"/>
+              <w:bottom w:w="45" w:type="dxa"/>
               <w:left w:w="80" w:type="dxa"/>
               <w:right w:w="80" w:type="dxa"/>
             </w:tcMar>
@@ -830,16 +843,16 @@
         <w:tc>
           <w:tcPr>
             <w:tcW w:type="dxa" w:w="1949"/>
-            <w:shd w:fill="007B7F"/>
+            <w:shd w:fill="007C8A"/>
             <w:tcBorders>
-              <w:top w:val="single" w:sz="2" w:space="0" w:color="007B7F"/>
-              <w:bottom w:val="single" w:sz="2" w:space="0" w:color="007B7F"/>
-              <w:left w:val="single" w:sz="2" w:space="0" w:color="007B7F"/>
-              <w:right w:val="single" w:sz="2" w:space="0" w:color="007B7F"/>
+              <w:top w:val="single" w:sz="2" w:space="0" w:color="007C8A"/>
+              <w:bottom w:val="single" w:sz="2" w:space="0" w:color="007C8A"/>
+              <w:left w:val="single" w:sz="2" w:space="0" w:color="007C8A"/>
+              <w:right w:val="single" w:sz="2" w:space="0" w:color="007C8A"/>
             </w:tcBorders>
             <w:tcMar>
-              <w:top w:w="40" w:type="dxa"/>
-              <w:bottom w:w="40" w:type="dxa"/>
+              <w:top w:w="45" w:type="dxa"/>
+              <w:bottom w:w="45" w:type="dxa"/>
               <w:left w:w="80" w:type="dxa"/>
               <w:right w:w="80" w:type="dxa"/>
             </w:tcMar>
@@ -863,16 +876,16 @@
         <w:tc>
           <w:tcPr>
             <w:tcW w:type="dxa" w:w="1949"/>
-            <w:shd w:fill="007B7F"/>
+            <w:shd w:fill="007C8A"/>
             <w:tcBorders>
-              <w:top w:val="single" w:sz="2" w:space="0" w:color="007B7F"/>
-              <w:bottom w:val="single" w:sz="2" w:space="0" w:color="007B7F"/>
-              <w:left w:val="single" w:sz="2" w:space="0" w:color="007B7F"/>
-              <w:right w:val="single" w:sz="2" w:space="0" w:color="007B7F"/>
+              <w:top w:val="single" w:sz="2" w:space="0" w:color="007C8A"/>
+              <w:bottom w:val="single" w:sz="2" w:space="0" w:color="007C8A"/>
+              <w:left w:val="single" w:sz="2" w:space="0" w:color="007C8A"/>
+              <w:right w:val="single" w:sz="2" w:space="0" w:color="007C8A"/>
             </w:tcBorders>
             <w:tcMar>
-              <w:top w:w="40" w:type="dxa"/>
-              <w:bottom w:w="40" w:type="dxa"/>
+              <w:top w:w="45" w:type="dxa"/>
+              <w:bottom w:w="45" w:type="dxa"/>
               <w:left w:w="80" w:type="dxa"/>
               <w:right w:w="80" w:type="dxa"/>
             </w:tcMar>
@@ -896,16 +909,16 @@
         <w:tc>
           <w:tcPr>
             <w:tcW w:type="dxa" w:w="1949"/>
-            <w:shd w:fill="007B7F"/>
+            <w:shd w:fill="007C8A"/>
             <w:tcBorders>
-              <w:top w:val="single" w:sz="2" w:space="0" w:color="007B7F"/>
-              <w:bottom w:val="single" w:sz="2" w:space="0" w:color="007B7F"/>
-              <w:left w:val="single" w:sz="2" w:space="0" w:color="007B7F"/>
-              <w:right w:val="single" w:sz="2" w:space="0" w:color="007B7F"/>
+              <w:top w:val="single" w:sz="2" w:space="0" w:color="007C8A"/>
+              <w:bottom w:val="single" w:sz="2" w:space="0" w:color="007C8A"/>
+              <w:left w:val="single" w:sz="2" w:space="0" w:color="007C8A"/>
+              <w:right w:val="single" w:sz="2" w:space="0" w:color="007C8A"/>
             </w:tcBorders>
             <w:tcMar>
-              <w:top w:w="40" w:type="dxa"/>
-              <w:bottom w:w="40" w:type="dxa"/>
+              <w:top w:w="45" w:type="dxa"/>
+              <w:bottom w:w="45" w:type="dxa"/>
               <w:left w:w="80" w:type="dxa"/>
               <w:right w:w="80" w:type="dxa"/>
             </w:tcMar>
@@ -929,16 +942,16 @@
         <w:tc>
           <w:tcPr>
             <w:tcW w:type="dxa" w:w="1949"/>
-            <w:shd w:fill="007B7F"/>
+            <w:shd w:fill="007C8A"/>
             <w:tcBorders>
-              <w:top w:val="single" w:sz="2" w:space="0" w:color="007B7F"/>
-              <w:bottom w:val="single" w:sz="2" w:space="0" w:color="007B7F"/>
-              <w:left w:val="single" w:sz="2" w:space="0" w:color="007B7F"/>
-              <w:right w:val="single" w:sz="2" w:space="0" w:color="007B7F"/>
+              <w:top w:val="single" w:sz="2" w:space="0" w:color="007C8A"/>
+              <w:bottom w:val="single" w:sz="2" w:space="0" w:color="007C8A"/>
+              <w:left w:val="single" w:sz="2" w:space="0" w:color="007C8A"/>
+              <w:right w:val="single" w:sz="2" w:space="0" w:color="007C8A"/>
             </w:tcBorders>
             <w:tcMar>
-              <w:top w:w="40" w:type="dxa"/>
-              <w:bottom w:w="40" w:type="dxa"/>
+              <w:top w:w="45" w:type="dxa"/>
+              <w:bottom w:w="45" w:type="dxa"/>
               <w:left w:w="80" w:type="dxa"/>
               <w:right w:w="80" w:type="dxa"/>
             </w:tcMar>
@@ -966,14 +979,14 @@
             <w:tcW w:type="dxa" w:w="1949"/>
             <w:shd w:fill="FFFFFF"/>
             <w:tcBorders>
-              <w:top w:val="single" w:sz="2" w:space="0" w:color="CCCCCC"/>
-              <w:bottom w:val="single" w:sz="2" w:space="0" w:color="CCCCCC"/>
-              <w:left w:val="single" w:sz="2" w:space="0" w:color="CCCCCC"/>
-              <w:right w:val="single" w:sz="2" w:space="0" w:color="CCCCCC"/>
+              <w:top w:val="single" w:sz="2" w:space="0" w:color="D8D8D8"/>
+              <w:bottom w:val="single" w:sz="2" w:space="0" w:color="D8D8D8"/>
+              <w:left w:val="single" w:sz="2" w:space="0" w:color="D8D8D8"/>
+              <w:right w:val="single" w:sz="2" w:space="0" w:color="D8D8D8"/>
             </w:tcBorders>
             <w:tcMar>
-              <w:top w:w="40" w:type="dxa"/>
-              <w:bottom w:w="40" w:type="dxa"/>
+              <w:top w:w="45" w:type="dxa"/>
+              <w:bottom w:w="45" w:type="dxa"/>
               <w:left w:w="80" w:type="dxa"/>
               <w:right w:w="80" w:type="dxa"/>
             </w:tcMar>
@@ -987,7 +1000,7 @@
               <w:rPr>
                 <w:rFonts w:ascii="Calibri" w:hAnsi="Calibri"/>
                 <w:b/>
-                <w:color w:val="2C2C2C"/>
+                <w:color w:val="0C2340"/>
                 <w:sz w:val="16"/>
               </w:rPr>
               <w:t>Autologous HSC collections (CCCUPR)</w:t>
@@ -999,14 +1012,14 @@
             <w:tcW w:type="dxa" w:w="1949"/>
             <w:shd w:fill="FFFFFF"/>
             <w:tcBorders>
-              <w:top w:val="single" w:sz="2" w:space="0" w:color="CCCCCC"/>
-              <w:bottom w:val="single" w:sz="2" w:space="0" w:color="CCCCCC"/>
-              <w:left w:val="single" w:sz="2" w:space="0" w:color="CCCCCC"/>
-              <w:right w:val="single" w:sz="2" w:space="0" w:color="CCCCCC"/>
+              <w:top w:val="single" w:sz="2" w:space="0" w:color="D8D8D8"/>
+              <w:bottom w:val="single" w:sz="2" w:space="0" w:color="D8D8D8"/>
+              <w:left w:val="single" w:sz="2" w:space="0" w:color="D8D8D8"/>
+              <w:right w:val="single" w:sz="2" w:space="0" w:color="D8D8D8"/>
             </w:tcBorders>
             <w:tcMar>
-              <w:top w:w="40" w:type="dxa"/>
-              <w:bottom w:w="40" w:type="dxa"/>
+              <w:top w:w="45" w:type="dxa"/>
+              <w:bottom w:w="45" w:type="dxa"/>
               <w:left w:w="80" w:type="dxa"/>
               <w:right w:w="80" w:type="dxa"/>
             </w:tcMar>
@@ -1019,10 +1032,10 @@
             <w:r>
               <w:rPr>
                 <w:rFonts w:ascii="Calibri" w:hAnsi="Calibri"/>
-                <w:color w:val="2C2C2C"/>
+                <w:color w:val="333333"/>
                 <w:sz w:val="16"/>
               </w:rPr>
-              <w:t>12-18</w:t>
+              <w:t>12–18</w:t>
             </w:r>
           </w:p>
         </w:tc>
@@ -1031,14 +1044,14 @@
             <w:tcW w:type="dxa" w:w="1949"/>
             <w:shd w:fill="FFFFFF"/>
             <w:tcBorders>
-              <w:top w:val="single" w:sz="2" w:space="0" w:color="CCCCCC"/>
-              <w:bottom w:val="single" w:sz="2" w:space="0" w:color="CCCCCC"/>
-              <w:left w:val="single" w:sz="2" w:space="0" w:color="CCCCCC"/>
-              <w:right w:val="single" w:sz="2" w:space="0" w:color="CCCCCC"/>
+              <w:top w:val="single" w:sz="2" w:space="0" w:color="D8D8D8"/>
+              <w:bottom w:val="single" w:sz="2" w:space="0" w:color="D8D8D8"/>
+              <w:left w:val="single" w:sz="2" w:space="0" w:color="D8D8D8"/>
+              <w:right w:val="single" w:sz="2" w:space="0" w:color="D8D8D8"/>
             </w:tcBorders>
             <w:tcMar>
-              <w:top w:w="40" w:type="dxa"/>
-              <w:bottom w:w="40" w:type="dxa"/>
+              <w:top w:w="45" w:type="dxa"/>
+              <w:bottom w:w="45" w:type="dxa"/>
               <w:left w:w="80" w:type="dxa"/>
               <w:right w:w="80" w:type="dxa"/>
             </w:tcMar>
@@ -1051,10 +1064,10 @@
             <w:r>
               <w:rPr>
                 <w:rFonts w:ascii="Calibri" w:hAnsi="Calibri"/>
-                <w:color w:val="2C2C2C"/>
+                <w:color w:val="333333"/>
                 <w:sz w:val="16"/>
               </w:rPr>
-              <w:t>22-32</w:t>
+              <w:t>22–32</w:t>
             </w:r>
           </w:p>
         </w:tc>
@@ -1063,14 +1076,14 @@
             <w:tcW w:type="dxa" w:w="1949"/>
             <w:shd w:fill="FFFFFF"/>
             <w:tcBorders>
-              <w:top w:val="single" w:sz="2" w:space="0" w:color="CCCCCC"/>
-              <w:bottom w:val="single" w:sz="2" w:space="0" w:color="CCCCCC"/>
-              <w:left w:val="single" w:sz="2" w:space="0" w:color="CCCCCC"/>
-              <w:right w:val="single" w:sz="2" w:space="0" w:color="CCCCCC"/>
+              <w:top w:val="single" w:sz="2" w:space="0" w:color="D8D8D8"/>
+              <w:bottom w:val="single" w:sz="2" w:space="0" w:color="D8D8D8"/>
+              <w:left w:val="single" w:sz="2" w:space="0" w:color="D8D8D8"/>
+              <w:right w:val="single" w:sz="2" w:space="0" w:color="D8D8D8"/>
             </w:tcBorders>
             <w:tcMar>
-              <w:top w:w="40" w:type="dxa"/>
-              <w:bottom w:w="40" w:type="dxa"/>
+              <w:top w:w="45" w:type="dxa"/>
+              <w:bottom w:w="45" w:type="dxa"/>
               <w:left w:w="80" w:type="dxa"/>
               <w:right w:w="80" w:type="dxa"/>
             </w:tcMar>
@@ -1083,10 +1096,10 @@
             <w:r>
               <w:rPr>
                 <w:rFonts w:ascii="Calibri" w:hAnsi="Calibri"/>
-                <w:color w:val="2C2C2C"/>
+                <w:color w:val="333333"/>
                 <w:sz w:val="16"/>
               </w:rPr>
-              <w:t>30-42</w:t>
+              <w:t>30–42</w:t>
             </w:r>
           </w:p>
         </w:tc>
@@ -1095,14 +1108,14 @@
             <w:tcW w:type="dxa" w:w="1949"/>
             <w:shd w:fill="FFFFFF"/>
             <w:tcBorders>
-              <w:top w:val="single" w:sz="2" w:space="0" w:color="CCCCCC"/>
-              <w:bottom w:val="single" w:sz="2" w:space="0" w:color="CCCCCC"/>
-              <w:left w:val="single" w:sz="2" w:space="0" w:color="CCCCCC"/>
-              <w:right w:val="single" w:sz="2" w:space="0" w:color="CCCCCC"/>
+              <w:top w:val="single" w:sz="2" w:space="0" w:color="D8D8D8"/>
+              <w:bottom w:val="single" w:sz="2" w:space="0" w:color="D8D8D8"/>
+              <w:left w:val="single" w:sz="2" w:space="0" w:color="D8D8D8"/>
+              <w:right w:val="single" w:sz="2" w:space="0" w:color="D8D8D8"/>
             </w:tcBorders>
             <w:tcMar>
-              <w:top w:w="40" w:type="dxa"/>
-              <w:bottom w:w="40" w:type="dxa"/>
+              <w:top w:w="45" w:type="dxa"/>
+              <w:bottom w:w="45" w:type="dxa"/>
               <w:left w:w="80" w:type="dxa"/>
               <w:right w:w="80" w:type="dxa"/>
             </w:tcMar>
@@ -1115,10 +1128,10 @@
             <w:r>
               <w:rPr>
                 <w:rFonts w:ascii="Calibri" w:hAnsi="Calibri"/>
-                <w:color w:val="2C2C2C"/>
+                <w:color w:val="333333"/>
                 <w:sz w:val="16"/>
               </w:rPr>
-              <w:t>40-55</w:t>
+              <w:t>40–55</w:t>
             </w:r>
           </w:p>
         </w:tc>
@@ -1127,16 +1140,16 @@
         <w:tc>
           <w:tcPr>
             <w:tcW w:type="dxa" w:w="1949"/>
-            <w:shd w:fill="F5F7F8"/>
+            <w:shd w:fill="F4F7F8"/>
             <w:tcBorders>
-              <w:top w:val="single" w:sz="2" w:space="0" w:color="CCCCCC"/>
-              <w:bottom w:val="single" w:sz="2" w:space="0" w:color="CCCCCC"/>
-              <w:left w:val="single" w:sz="2" w:space="0" w:color="CCCCCC"/>
-              <w:right w:val="single" w:sz="2" w:space="0" w:color="CCCCCC"/>
+              <w:top w:val="single" w:sz="2" w:space="0" w:color="D8D8D8"/>
+              <w:bottom w:val="single" w:sz="2" w:space="0" w:color="D8D8D8"/>
+              <w:left w:val="single" w:sz="2" w:space="0" w:color="D8D8D8"/>
+              <w:right w:val="single" w:sz="2" w:space="0" w:color="D8D8D8"/>
             </w:tcBorders>
             <w:tcMar>
-              <w:top w:w="40" w:type="dxa"/>
-              <w:bottom w:w="40" w:type="dxa"/>
+              <w:top w:w="45" w:type="dxa"/>
+              <w:bottom w:w="45" w:type="dxa"/>
               <w:left w:w="80" w:type="dxa"/>
               <w:right w:w="80" w:type="dxa"/>
             </w:tcMar>
@@ -1150,7 +1163,7 @@
               <w:rPr>
                 <w:rFonts w:ascii="Calibri" w:hAnsi="Calibri"/>
                 <w:b/>
-                <w:color w:val="2C2C2C"/>
+                <w:color w:val="0C2340"/>
                 <w:sz w:val="16"/>
               </w:rPr>
               <w:t>CAR-T leukapheresis (CCCUPR)</w:t>
@@ -1160,16 +1173,16 @@
         <w:tc>
           <w:tcPr>
             <w:tcW w:type="dxa" w:w="1949"/>
-            <w:shd w:fill="F5F7F8"/>
+            <w:shd w:fill="F4F7F8"/>
             <w:tcBorders>
-              <w:top w:val="single" w:sz="2" w:space="0" w:color="CCCCCC"/>
-              <w:bottom w:val="single" w:sz="2" w:space="0" w:color="CCCCCC"/>
-              <w:left w:val="single" w:sz="2" w:space="0" w:color="CCCCCC"/>
-              <w:right w:val="single" w:sz="2" w:space="0" w:color="CCCCCC"/>
+              <w:top w:val="single" w:sz="2" w:space="0" w:color="D8D8D8"/>
+              <w:bottom w:val="single" w:sz="2" w:space="0" w:color="D8D8D8"/>
+              <w:left w:val="single" w:sz="2" w:space="0" w:color="D8D8D8"/>
+              <w:right w:val="single" w:sz="2" w:space="0" w:color="D8D8D8"/>
             </w:tcBorders>
             <w:tcMar>
-              <w:top w:w="40" w:type="dxa"/>
-              <w:bottom w:w="40" w:type="dxa"/>
+              <w:top w:w="45" w:type="dxa"/>
+              <w:bottom w:w="45" w:type="dxa"/>
               <w:left w:w="80" w:type="dxa"/>
               <w:right w:w="80" w:type="dxa"/>
             </w:tcMar>
@@ -1182,26 +1195,26 @@
             <w:r>
               <w:rPr>
                 <w:rFonts w:ascii="Calibri" w:hAnsi="Calibri"/>
-                <w:color w:val="2C2C2C"/>
+                <w:color w:val="333333"/>
                 <w:sz w:val="16"/>
               </w:rPr>
-              <w:t>4-8</w:t>
+              <w:t>4–8</w:t>
             </w:r>
           </w:p>
         </w:tc>
         <w:tc>
           <w:tcPr>
             <w:tcW w:type="dxa" w:w="1949"/>
-            <w:shd w:fill="F5F7F8"/>
+            <w:shd w:fill="F4F7F8"/>
             <w:tcBorders>
-              <w:top w:val="single" w:sz="2" w:space="0" w:color="CCCCCC"/>
-              <w:bottom w:val="single" w:sz="2" w:space="0" w:color="CCCCCC"/>
-              <w:left w:val="single" w:sz="2" w:space="0" w:color="CCCCCC"/>
-              <w:right w:val="single" w:sz="2" w:space="0" w:color="CCCCCC"/>
+              <w:top w:val="single" w:sz="2" w:space="0" w:color="D8D8D8"/>
+              <w:bottom w:val="single" w:sz="2" w:space="0" w:color="D8D8D8"/>
+              <w:left w:val="single" w:sz="2" w:space="0" w:color="D8D8D8"/>
+              <w:right w:val="single" w:sz="2" w:space="0" w:color="D8D8D8"/>
             </w:tcBorders>
             <w:tcMar>
-              <w:top w:w="40" w:type="dxa"/>
-              <w:bottom w:w="40" w:type="dxa"/>
+              <w:top w:w="45" w:type="dxa"/>
+              <w:bottom w:w="45" w:type="dxa"/>
               <w:left w:w="80" w:type="dxa"/>
               <w:right w:w="80" w:type="dxa"/>
             </w:tcMar>
@@ -1214,26 +1227,26 @@
             <w:r>
               <w:rPr>
                 <w:rFonts w:ascii="Calibri" w:hAnsi="Calibri"/>
-                <w:color w:val="2C2C2C"/>
+                <w:color w:val="333333"/>
                 <w:sz w:val="16"/>
               </w:rPr>
-              <w:t>10-14</w:t>
+              <w:t>10–14</w:t>
             </w:r>
           </w:p>
         </w:tc>
         <w:tc>
           <w:tcPr>
             <w:tcW w:type="dxa" w:w="1949"/>
-            <w:shd w:fill="F5F7F8"/>
+            <w:shd w:fill="F4F7F8"/>
             <w:tcBorders>
-              <w:top w:val="single" w:sz="2" w:space="0" w:color="CCCCCC"/>
-              <w:bottom w:val="single" w:sz="2" w:space="0" w:color="CCCCCC"/>
-              <w:left w:val="single" w:sz="2" w:space="0" w:color="CCCCCC"/>
-              <w:right w:val="single" w:sz="2" w:space="0" w:color="CCCCCC"/>
+              <w:top w:val="single" w:sz="2" w:space="0" w:color="D8D8D8"/>
+              <w:bottom w:val="single" w:sz="2" w:space="0" w:color="D8D8D8"/>
+              <w:left w:val="single" w:sz="2" w:space="0" w:color="D8D8D8"/>
+              <w:right w:val="single" w:sz="2" w:space="0" w:color="D8D8D8"/>
             </w:tcBorders>
             <w:tcMar>
-              <w:top w:w="40" w:type="dxa"/>
-              <w:bottom w:w="40" w:type="dxa"/>
+              <w:top w:w="45" w:type="dxa"/>
+              <w:bottom w:w="45" w:type="dxa"/>
               <w:left w:w="80" w:type="dxa"/>
               <w:right w:w="80" w:type="dxa"/>
             </w:tcMar>
@@ -1246,26 +1259,26 @@
             <w:r>
               <w:rPr>
                 <w:rFonts w:ascii="Calibri" w:hAnsi="Calibri"/>
-                <w:color w:val="2C2C2C"/>
+                <w:color w:val="333333"/>
                 <w:sz w:val="16"/>
               </w:rPr>
-              <w:t>16-22</w:t>
+              <w:t>16–22</w:t>
             </w:r>
           </w:p>
         </w:tc>
         <w:tc>
           <w:tcPr>
             <w:tcW w:type="dxa" w:w="1949"/>
-            <w:shd w:fill="F5F7F8"/>
+            <w:shd w:fill="F4F7F8"/>
             <w:tcBorders>
-              <w:top w:val="single" w:sz="2" w:space="0" w:color="CCCCCC"/>
-              <w:bottom w:val="single" w:sz="2" w:space="0" w:color="CCCCCC"/>
-              <w:left w:val="single" w:sz="2" w:space="0" w:color="CCCCCC"/>
-              <w:right w:val="single" w:sz="2" w:space="0" w:color="CCCCCC"/>
+              <w:top w:val="single" w:sz="2" w:space="0" w:color="D8D8D8"/>
+              <w:bottom w:val="single" w:sz="2" w:space="0" w:color="D8D8D8"/>
+              <w:left w:val="single" w:sz="2" w:space="0" w:color="D8D8D8"/>
+              <w:right w:val="single" w:sz="2" w:space="0" w:color="D8D8D8"/>
             </w:tcBorders>
             <w:tcMar>
-              <w:top w:w="40" w:type="dxa"/>
-              <w:bottom w:w="40" w:type="dxa"/>
+              <w:top w:w="45" w:type="dxa"/>
+              <w:bottom w:w="45" w:type="dxa"/>
               <w:left w:w="80" w:type="dxa"/>
               <w:right w:w="80" w:type="dxa"/>
             </w:tcMar>
@@ -1278,10 +1291,10 @@
             <w:r>
               <w:rPr>
                 <w:rFonts w:ascii="Calibri" w:hAnsi="Calibri"/>
-                <w:color w:val="2C2C2C"/>
+                <w:color w:val="333333"/>
                 <w:sz w:val="16"/>
               </w:rPr>
-              <w:t>30-45</w:t>
+              <w:t>30–45</w:t>
             </w:r>
           </w:p>
         </w:tc>
@@ -1292,14 +1305,14 @@
             <w:tcW w:type="dxa" w:w="1949"/>
             <w:shd w:fill="FFFFFF"/>
             <w:tcBorders>
-              <w:top w:val="single" w:sz="2" w:space="0" w:color="CCCCCC"/>
-              <w:bottom w:val="single" w:sz="2" w:space="0" w:color="CCCCCC"/>
-              <w:left w:val="single" w:sz="2" w:space="0" w:color="CCCCCC"/>
-              <w:right w:val="single" w:sz="2" w:space="0" w:color="CCCCCC"/>
+              <w:top w:val="single" w:sz="2" w:space="0" w:color="D8D8D8"/>
+              <w:bottom w:val="single" w:sz="2" w:space="0" w:color="D8D8D8"/>
+              <w:left w:val="single" w:sz="2" w:space="0" w:color="D8D8D8"/>
+              <w:right w:val="single" w:sz="2" w:space="0" w:color="D8D8D8"/>
             </w:tcBorders>
             <w:tcMar>
-              <w:top w:w="40" w:type="dxa"/>
-              <w:bottom w:w="40" w:type="dxa"/>
+              <w:top w:w="45" w:type="dxa"/>
+              <w:bottom w:w="45" w:type="dxa"/>
               <w:left w:w="80" w:type="dxa"/>
               <w:right w:w="80" w:type="dxa"/>
             </w:tcMar>
@@ -1313,10 +1326,10 @@
               <w:rPr>
                 <w:rFonts w:ascii="Calibri" w:hAnsi="Calibri"/>
                 <w:b/>
-                <w:color w:val="2C2C2C"/>
+                <w:color w:val="0C2340"/>
                 <w:sz w:val="16"/>
               </w:rPr>
-              <w:t>Allo donor collections (HAM via TCT Oncology)</w:t>
+              <w:t>Allo donor collections (HAM via TCT)</w:t>
             </w:r>
           </w:p>
         </w:tc>
@@ -1325,14 +1338,14 @@
             <w:tcW w:type="dxa" w:w="1949"/>
             <w:shd w:fill="FFFFFF"/>
             <w:tcBorders>
-              <w:top w:val="single" w:sz="2" w:space="0" w:color="CCCCCC"/>
-              <w:bottom w:val="single" w:sz="2" w:space="0" w:color="CCCCCC"/>
-              <w:left w:val="single" w:sz="2" w:space="0" w:color="CCCCCC"/>
-              <w:right w:val="single" w:sz="2" w:space="0" w:color="CCCCCC"/>
+              <w:top w:val="single" w:sz="2" w:space="0" w:color="D8D8D8"/>
+              <w:bottom w:val="single" w:sz="2" w:space="0" w:color="D8D8D8"/>
+              <w:left w:val="single" w:sz="2" w:space="0" w:color="D8D8D8"/>
+              <w:right w:val="single" w:sz="2" w:space="0" w:color="D8D8D8"/>
             </w:tcBorders>
             <w:tcMar>
-              <w:top w:w="40" w:type="dxa"/>
-              <w:bottom w:w="40" w:type="dxa"/>
+              <w:top w:w="45" w:type="dxa"/>
+              <w:bottom w:w="45" w:type="dxa"/>
               <w:left w:w="80" w:type="dxa"/>
               <w:right w:w="80" w:type="dxa"/>
             </w:tcMar>
@@ -1345,10 +1358,10 @@
             <w:r>
               <w:rPr>
                 <w:rFonts w:ascii="Calibri" w:hAnsi="Calibri"/>
-                <w:color w:val="2C2C2C"/>
+                <w:color w:val="333333"/>
                 <w:sz w:val="16"/>
               </w:rPr>
-              <w:t>4-6</w:t>
+              <w:t>4–6</w:t>
             </w:r>
           </w:p>
         </w:tc>
@@ -1357,14 +1370,14 @@
             <w:tcW w:type="dxa" w:w="1949"/>
             <w:shd w:fill="FFFFFF"/>
             <w:tcBorders>
-              <w:top w:val="single" w:sz="2" w:space="0" w:color="CCCCCC"/>
-              <w:bottom w:val="single" w:sz="2" w:space="0" w:color="CCCCCC"/>
-              <w:left w:val="single" w:sz="2" w:space="0" w:color="CCCCCC"/>
-              <w:right w:val="single" w:sz="2" w:space="0" w:color="CCCCCC"/>
+              <w:top w:val="single" w:sz="2" w:space="0" w:color="D8D8D8"/>
+              <w:bottom w:val="single" w:sz="2" w:space="0" w:color="D8D8D8"/>
+              <w:left w:val="single" w:sz="2" w:space="0" w:color="D8D8D8"/>
+              <w:right w:val="single" w:sz="2" w:space="0" w:color="D8D8D8"/>
             </w:tcBorders>
             <w:tcMar>
-              <w:top w:w="40" w:type="dxa"/>
-              <w:bottom w:w="40" w:type="dxa"/>
+              <w:top w:w="45" w:type="dxa"/>
+              <w:bottom w:w="45" w:type="dxa"/>
               <w:left w:w="80" w:type="dxa"/>
               <w:right w:w="80" w:type="dxa"/>
             </w:tcMar>
@@ -1377,10 +1390,10 @@
             <w:r>
               <w:rPr>
                 <w:rFonts w:ascii="Calibri" w:hAnsi="Calibri"/>
-                <w:color w:val="2C2C2C"/>
+                <w:color w:val="333333"/>
                 <w:sz w:val="16"/>
               </w:rPr>
-              <w:t>8-12</w:t>
+              <w:t>8–12</w:t>
             </w:r>
           </w:p>
         </w:tc>
@@ -1389,14 +1402,14 @@
             <w:tcW w:type="dxa" w:w="1949"/>
             <w:shd w:fill="FFFFFF"/>
             <w:tcBorders>
-              <w:top w:val="single" w:sz="2" w:space="0" w:color="CCCCCC"/>
-              <w:bottom w:val="single" w:sz="2" w:space="0" w:color="CCCCCC"/>
-              <w:left w:val="single" w:sz="2" w:space="0" w:color="CCCCCC"/>
-              <w:right w:val="single" w:sz="2" w:space="0" w:color="CCCCCC"/>
+              <w:top w:val="single" w:sz="2" w:space="0" w:color="D8D8D8"/>
+              <w:bottom w:val="single" w:sz="2" w:space="0" w:color="D8D8D8"/>
+              <w:left w:val="single" w:sz="2" w:space="0" w:color="D8D8D8"/>
+              <w:right w:val="single" w:sz="2" w:space="0" w:color="D8D8D8"/>
             </w:tcBorders>
             <w:tcMar>
-              <w:top w:w="40" w:type="dxa"/>
-              <w:bottom w:w="40" w:type="dxa"/>
+              <w:top w:w="45" w:type="dxa"/>
+              <w:bottom w:w="45" w:type="dxa"/>
               <w:left w:w="80" w:type="dxa"/>
               <w:right w:w="80" w:type="dxa"/>
             </w:tcMar>
@@ -1409,10 +1422,10 @@
             <w:r>
               <w:rPr>
                 <w:rFonts w:ascii="Calibri" w:hAnsi="Calibri"/>
-                <w:color w:val="2C2C2C"/>
+                <w:color w:val="333333"/>
                 <w:sz w:val="16"/>
               </w:rPr>
-              <w:t>10-15</w:t>
+              <w:t>10–15</w:t>
             </w:r>
           </w:p>
         </w:tc>
@@ -1421,14 +1434,14 @@
             <w:tcW w:type="dxa" w:w="1949"/>
             <w:shd w:fill="FFFFFF"/>
             <w:tcBorders>
-              <w:top w:val="single" w:sz="2" w:space="0" w:color="CCCCCC"/>
-              <w:bottom w:val="single" w:sz="2" w:space="0" w:color="CCCCCC"/>
-              <w:left w:val="single" w:sz="2" w:space="0" w:color="CCCCCC"/>
-              <w:right w:val="single" w:sz="2" w:space="0" w:color="CCCCCC"/>
+              <w:top w:val="single" w:sz="2" w:space="0" w:color="D8D8D8"/>
+              <w:bottom w:val="single" w:sz="2" w:space="0" w:color="D8D8D8"/>
+              <w:left w:val="single" w:sz="2" w:space="0" w:color="D8D8D8"/>
+              <w:right w:val="single" w:sz="2" w:space="0" w:color="D8D8D8"/>
             </w:tcBorders>
             <w:tcMar>
-              <w:top w:w="40" w:type="dxa"/>
-              <w:bottom w:w="40" w:type="dxa"/>
+              <w:top w:w="45" w:type="dxa"/>
+              <w:bottom w:w="45" w:type="dxa"/>
               <w:left w:w="80" w:type="dxa"/>
               <w:right w:w="80" w:type="dxa"/>
             </w:tcMar>
@@ -1441,10 +1454,10 @@
             <w:r>
               <w:rPr>
                 <w:rFonts w:ascii="Calibri" w:hAnsi="Calibri"/>
-                <w:color w:val="2C2C2C"/>
+                <w:color w:val="333333"/>
                 <w:sz w:val="16"/>
               </w:rPr>
-              <w:t>15-22</w:t>
+              <w:t>15–22</w:t>
             </w:r>
           </w:p>
         </w:tc>
@@ -1453,16 +1466,16 @@
         <w:tc>
           <w:tcPr>
             <w:tcW w:type="dxa" w:w="1949"/>
-            <w:shd w:fill="E8F4F0"/>
+            <w:shd w:fill="E6F2F2"/>
             <w:tcBorders>
-              <w:top w:val="single" w:sz="2" w:space="0" w:color="CCCCCC"/>
-              <w:bottom w:val="single" w:sz="2" w:space="0" w:color="CCCCCC"/>
-              <w:left w:val="single" w:sz="2" w:space="0" w:color="CCCCCC"/>
-              <w:right w:val="single" w:sz="2" w:space="0" w:color="CCCCCC"/>
+              <w:top w:val="single" w:sz="2" w:space="0" w:color="D8D8D8"/>
+              <w:bottom w:val="single" w:sz="2" w:space="0" w:color="D8D8D8"/>
+              <w:left w:val="single" w:sz="2" w:space="0" w:color="D8D8D8"/>
+              <w:right w:val="single" w:sz="2" w:space="0" w:color="D8D8D8"/>
             </w:tcBorders>
             <w:tcMar>
-              <w:top w:w="40" w:type="dxa"/>
-              <w:bottom w:w="40" w:type="dxa"/>
+              <w:top w:w="45" w:type="dxa"/>
+              <w:bottom w:w="45" w:type="dxa"/>
               <w:left w:w="80" w:type="dxa"/>
               <w:right w:w="80" w:type="dxa"/>
             </w:tcMar>
@@ -1476,7 +1489,7 @@
               <w:rPr>
                 <w:rFonts w:ascii="Calibri" w:hAnsi="Calibri"/>
                 <w:b/>
-                <w:color w:val="007B7F"/>
+                <w:color w:val="007C8A"/>
                 <w:sz w:val="16"/>
               </w:rPr>
               <w:t>Total apheresis procedures</w:t>
@@ -1486,16 +1499,16 @@
         <w:tc>
           <w:tcPr>
             <w:tcW w:type="dxa" w:w="1949"/>
-            <w:shd w:fill="E8F4F0"/>
+            <w:shd w:fill="E6F2F2"/>
             <w:tcBorders>
-              <w:top w:val="single" w:sz="2" w:space="0" w:color="CCCCCC"/>
-              <w:bottom w:val="single" w:sz="2" w:space="0" w:color="CCCCCC"/>
-              <w:left w:val="single" w:sz="2" w:space="0" w:color="CCCCCC"/>
-              <w:right w:val="single" w:sz="2" w:space="0" w:color="CCCCCC"/>
+              <w:top w:val="single" w:sz="2" w:space="0" w:color="D8D8D8"/>
+              <w:bottom w:val="single" w:sz="2" w:space="0" w:color="D8D8D8"/>
+              <w:left w:val="single" w:sz="2" w:space="0" w:color="D8D8D8"/>
+              <w:right w:val="single" w:sz="2" w:space="0" w:color="D8D8D8"/>
             </w:tcBorders>
             <w:tcMar>
-              <w:top w:w="40" w:type="dxa"/>
-              <w:bottom w:w="40" w:type="dxa"/>
+              <w:top w:w="45" w:type="dxa"/>
+              <w:bottom w:w="45" w:type="dxa"/>
               <w:left w:w="80" w:type="dxa"/>
               <w:right w:w="80" w:type="dxa"/>
             </w:tcMar>
@@ -1509,26 +1522,26 @@
               <w:rPr>
                 <w:rFonts w:ascii="Calibri" w:hAnsi="Calibri"/>
                 <w:b/>
-                <w:color w:val="007B7F"/>
+                <w:color w:val="007C8A"/>
                 <w:sz w:val="16"/>
               </w:rPr>
-              <w:t>20-32</w:t>
+              <w:t>20–32</w:t>
             </w:r>
           </w:p>
         </w:tc>
         <w:tc>
           <w:tcPr>
             <w:tcW w:type="dxa" w:w="1949"/>
-            <w:shd w:fill="E8F4F0"/>
+            <w:shd w:fill="E6F2F2"/>
             <w:tcBorders>
-              <w:top w:val="single" w:sz="2" w:space="0" w:color="CCCCCC"/>
-              <w:bottom w:val="single" w:sz="2" w:space="0" w:color="CCCCCC"/>
-              <w:left w:val="single" w:sz="2" w:space="0" w:color="CCCCCC"/>
-              <w:right w:val="single" w:sz="2" w:space="0" w:color="CCCCCC"/>
+              <w:top w:val="single" w:sz="2" w:space="0" w:color="D8D8D8"/>
+              <w:bottom w:val="single" w:sz="2" w:space="0" w:color="D8D8D8"/>
+              <w:left w:val="single" w:sz="2" w:space="0" w:color="D8D8D8"/>
+              <w:right w:val="single" w:sz="2" w:space="0" w:color="D8D8D8"/>
             </w:tcBorders>
             <w:tcMar>
-              <w:top w:w="40" w:type="dxa"/>
-              <w:bottom w:w="40" w:type="dxa"/>
+              <w:top w:w="45" w:type="dxa"/>
+              <w:bottom w:w="45" w:type="dxa"/>
               <w:left w:w="80" w:type="dxa"/>
               <w:right w:w="80" w:type="dxa"/>
             </w:tcMar>
@@ -1542,26 +1555,26 @@
               <w:rPr>
                 <w:rFonts w:ascii="Calibri" w:hAnsi="Calibri"/>
                 <w:b/>
-                <w:color w:val="007B7F"/>
+                <w:color w:val="007C8A"/>
                 <w:sz w:val="16"/>
               </w:rPr>
-              <w:t>40-58</w:t>
+              <w:t>40–58</w:t>
             </w:r>
           </w:p>
         </w:tc>
         <w:tc>
           <w:tcPr>
             <w:tcW w:type="dxa" w:w="1949"/>
-            <w:shd w:fill="E8F4F0"/>
+            <w:shd w:fill="E6F2F2"/>
             <w:tcBorders>
-              <w:top w:val="single" w:sz="2" w:space="0" w:color="CCCCCC"/>
-              <w:bottom w:val="single" w:sz="2" w:space="0" w:color="CCCCCC"/>
-              <w:left w:val="single" w:sz="2" w:space="0" w:color="CCCCCC"/>
-              <w:right w:val="single" w:sz="2" w:space="0" w:color="CCCCCC"/>
+              <w:top w:val="single" w:sz="2" w:space="0" w:color="D8D8D8"/>
+              <w:bottom w:val="single" w:sz="2" w:space="0" w:color="D8D8D8"/>
+              <w:left w:val="single" w:sz="2" w:space="0" w:color="D8D8D8"/>
+              <w:right w:val="single" w:sz="2" w:space="0" w:color="D8D8D8"/>
             </w:tcBorders>
             <w:tcMar>
-              <w:top w:w="40" w:type="dxa"/>
-              <w:bottom w:w="40" w:type="dxa"/>
+              <w:top w:w="45" w:type="dxa"/>
+              <w:bottom w:w="45" w:type="dxa"/>
               <w:left w:w="80" w:type="dxa"/>
               <w:right w:w="80" w:type="dxa"/>
             </w:tcMar>
@@ -1575,26 +1588,26 @@
               <w:rPr>
                 <w:rFonts w:ascii="Calibri" w:hAnsi="Calibri"/>
                 <w:b/>
-                <w:color w:val="007B7F"/>
+                <w:color w:val="007C8A"/>
                 <w:sz w:val="16"/>
               </w:rPr>
-              <w:t>56-80</w:t>
+              <w:t>56–80</w:t>
             </w:r>
           </w:p>
         </w:tc>
         <w:tc>
           <w:tcPr>
             <w:tcW w:type="dxa" w:w="1949"/>
-            <w:shd w:fill="E8F4F0"/>
+            <w:shd w:fill="E6F2F2"/>
             <w:tcBorders>
-              <w:top w:val="single" w:sz="2" w:space="0" w:color="CCCCCC"/>
-              <w:bottom w:val="single" w:sz="2" w:space="0" w:color="CCCCCC"/>
-              <w:left w:val="single" w:sz="2" w:space="0" w:color="CCCCCC"/>
-              <w:right w:val="single" w:sz="2" w:space="0" w:color="CCCCCC"/>
+              <w:top w:val="single" w:sz="2" w:space="0" w:color="D8D8D8"/>
+              <w:bottom w:val="single" w:sz="2" w:space="0" w:color="D8D8D8"/>
+              <w:left w:val="single" w:sz="2" w:space="0" w:color="D8D8D8"/>
+              <w:right w:val="single" w:sz="2" w:space="0" w:color="D8D8D8"/>
             </w:tcBorders>
             <w:tcMar>
-              <w:top w:w="40" w:type="dxa"/>
-              <w:bottom w:w="40" w:type="dxa"/>
+              <w:top w:w="45" w:type="dxa"/>
+              <w:bottom w:w="45" w:type="dxa"/>
               <w:left w:w="80" w:type="dxa"/>
               <w:right w:w="80" w:type="dxa"/>
             </w:tcMar>
@@ -1608,10 +1621,10 @@
               <w:rPr>
                 <w:rFonts w:ascii="Calibri" w:hAnsi="Calibri"/>
                 <w:b/>
-                <w:color w:val="007B7F"/>
+                <w:color w:val="007C8A"/>
                 <w:sz w:val="16"/>
               </w:rPr>
-              <w:t>85-122</w:t>
+              <w:t>85–122</w:t>
             </w:r>
           </w:p>
         </w:tc>
@@ -1622,7 +1635,7 @@
         <w:rPr>
           <w:rFonts w:ascii="Calibri" w:hAnsi="Calibri"/>
           <w:b w:val="0"/>
-          <w:color w:val="2C2C2C"/>
+          <w:color w:val="333333"/>
           <w:sz w:val="18"/>
         </w:rPr>
       </w:r>
@@ -1632,7 +1645,7 @@
         <w:rPr>
           <w:rFonts w:ascii="Calibri" w:hAnsi="Calibri"/>
           <w:b/>
-          <w:color w:val="007B7F"/>
+          <w:color w:val="1B5E8A"/>
           <w:sz w:val="18"/>
         </w:rPr>
         <w:t>Supporting processing volume:</w:t>
@@ -1656,16 +1669,16 @@
         <w:tc>
           <w:tcPr>
             <w:tcW w:type="dxa" w:w="1949"/>
-            <w:shd w:fill="1B2A4A"/>
+            <w:shd w:fill="0C2340"/>
             <w:tcBorders>
-              <w:top w:val="single" w:sz="2" w:space="0" w:color="1B2A4A"/>
-              <w:bottom w:val="single" w:sz="2" w:space="0" w:color="1B2A4A"/>
-              <w:left w:val="single" w:sz="2" w:space="0" w:color="1B2A4A"/>
-              <w:right w:val="single" w:sz="2" w:space="0" w:color="1B2A4A"/>
+              <w:top w:val="single" w:sz="2" w:space="0" w:color="0C2340"/>
+              <w:bottom w:val="single" w:sz="2" w:space="0" w:color="0C2340"/>
+              <w:left w:val="single" w:sz="2" w:space="0" w:color="0C2340"/>
+              <w:right w:val="single" w:sz="2" w:space="0" w:color="0C2340"/>
             </w:tcBorders>
             <w:tcMar>
-              <w:top w:w="40" w:type="dxa"/>
-              <w:bottom w:w="40" w:type="dxa"/>
+              <w:top w:w="45" w:type="dxa"/>
+              <w:bottom w:w="45" w:type="dxa"/>
               <w:left w:w="80" w:type="dxa"/>
               <w:right w:w="80" w:type="dxa"/>
             </w:tcMar>
@@ -1689,16 +1702,16 @@
         <w:tc>
           <w:tcPr>
             <w:tcW w:type="dxa" w:w="1949"/>
-            <w:shd w:fill="1B2A4A"/>
+            <w:shd w:fill="0C2340"/>
             <w:tcBorders>
-              <w:top w:val="single" w:sz="2" w:space="0" w:color="1B2A4A"/>
-              <w:bottom w:val="single" w:sz="2" w:space="0" w:color="1B2A4A"/>
-              <w:left w:val="single" w:sz="2" w:space="0" w:color="1B2A4A"/>
-              <w:right w:val="single" w:sz="2" w:space="0" w:color="1B2A4A"/>
+              <w:top w:val="single" w:sz="2" w:space="0" w:color="0C2340"/>
+              <w:bottom w:val="single" w:sz="2" w:space="0" w:color="0C2340"/>
+              <w:left w:val="single" w:sz="2" w:space="0" w:color="0C2340"/>
+              <w:right w:val="single" w:sz="2" w:space="0" w:color="0C2340"/>
             </w:tcBorders>
             <w:tcMar>
-              <w:top w:w="40" w:type="dxa"/>
-              <w:bottom w:w="40" w:type="dxa"/>
+              <w:top w:w="45" w:type="dxa"/>
+              <w:bottom w:w="45" w:type="dxa"/>
               <w:left w:w="80" w:type="dxa"/>
               <w:right w:w="80" w:type="dxa"/>
             </w:tcMar>
@@ -1722,16 +1735,16 @@
         <w:tc>
           <w:tcPr>
             <w:tcW w:type="dxa" w:w="1949"/>
-            <w:shd w:fill="1B2A4A"/>
+            <w:shd w:fill="0C2340"/>
             <w:tcBorders>
-              <w:top w:val="single" w:sz="2" w:space="0" w:color="1B2A4A"/>
-              <w:bottom w:val="single" w:sz="2" w:space="0" w:color="1B2A4A"/>
-              <w:left w:val="single" w:sz="2" w:space="0" w:color="1B2A4A"/>
-              <w:right w:val="single" w:sz="2" w:space="0" w:color="1B2A4A"/>
+              <w:top w:val="single" w:sz="2" w:space="0" w:color="0C2340"/>
+              <w:bottom w:val="single" w:sz="2" w:space="0" w:color="0C2340"/>
+              <w:left w:val="single" w:sz="2" w:space="0" w:color="0C2340"/>
+              <w:right w:val="single" w:sz="2" w:space="0" w:color="0C2340"/>
             </w:tcBorders>
             <w:tcMar>
-              <w:top w:w="40" w:type="dxa"/>
-              <w:bottom w:w="40" w:type="dxa"/>
+              <w:top w:w="45" w:type="dxa"/>
+              <w:bottom w:w="45" w:type="dxa"/>
               <w:left w:w="80" w:type="dxa"/>
               <w:right w:w="80" w:type="dxa"/>
             </w:tcMar>
@@ -1755,16 +1768,16 @@
         <w:tc>
           <w:tcPr>
             <w:tcW w:type="dxa" w:w="1949"/>
-            <w:shd w:fill="1B2A4A"/>
+            <w:shd w:fill="0C2340"/>
             <w:tcBorders>
-              <w:top w:val="single" w:sz="2" w:space="0" w:color="1B2A4A"/>
-              <w:bottom w:val="single" w:sz="2" w:space="0" w:color="1B2A4A"/>
-              <w:left w:val="single" w:sz="2" w:space="0" w:color="1B2A4A"/>
-              <w:right w:val="single" w:sz="2" w:space="0" w:color="1B2A4A"/>
+              <w:top w:val="single" w:sz="2" w:space="0" w:color="0C2340"/>
+              <w:bottom w:val="single" w:sz="2" w:space="0" w:color="0C2340"/>
+              <w:left w:val="single" w:sz="2" w:space="0" w:color="0C2340"/>
+              <w:right w:val="single" w:sz="2" w:space="0" w:color="0C2340"/>
             </w:tcBorders>
             <w:tcMar>
-              <w:top w:w="40" w:type="dxa"/>
-              <w:bottom w:w="40" w:type="dxa"/>
+              <w:top w:w="45" w:type="dxa"/>
+              <w:bottom w:w="45" w:type="dxa"/>
               <w:left w:w="80" w:type="dxa"/>
               <w:right w:w="80" w:type="dxa"/>
             </w:tcMar>
@@ -1788,16 +1801,16 @@
         <w:tc>
           <w:tcPr>
             <w:tcW w:type="dxa" w:w="1949"/>
-            <w:shd w:fill="1B2A4A"/>
+            <w:shd w:fill="0C2340"/>
             <w:tcBorders>
-              <w:top w:val="single" w:sz="2" w:space="0" w:color="1B2A4A"/>
-              <w:bottom w:val="single" w:sz="2" w:space="0" w:color="1B2A4A"/>
-              <w:left w:val="single" w:sz="2" w:space="0" w:color="1B2A4A"/>
-              <w:right w:val="single" w:sz="2" w:space="0" w:color="1B2A4A"/>
+              <w:top w:val="single" w:sz="2" w:space="0" w:color="0C2340"/>
+              <w:bottom w:val="single" w:sz="2" w:space="0" w:color="0C2340"/>
+              <w:left w:val="single" w:sz="2" w:space="0" w:color="0C2340"/>
+              <w:right w:val="single" w:sz="2" w:space="0" w:color="0C2340"/>
             </w:tcBorders>
             <w:tcMar>
-              <w:top w:w="40" w:type="dxa"/>
-              <w:bottom w:w="40" w:type="dxa"/>
+              <w:top w:w="45" w:type="dxa"/>
+              <w:bottom w:w="45" w:type="dxa"/>
               <w:left w:w="80" w:type="dxa"/>
               <w:right w:w="80" w:type="dxa"/>
             </w:tcMar>
@@ -1825,14 +1838,14 @@
             <w:tcW w:type="dxa" w:w="1949"/>
             <w:shd w:fill="FFFFFF"/>
             <w:tcBorders>
-              <w:top w:val="single" w:sz="2" w:space="0" w:color="CCCCCC"/>
-              <w:bottom w:val="single" w:sz="2" w:space="0" w:color="CCCCCC"/>
-              <w:left w:val="single" w:sz="2" w:space="0" w:color="CCCCCC"/>
-              <w:right w:val="single" w:sz="2" w:space="0" w:color="CCCCCC"/>
+              <w:top w:val="single" w:sz="2" w:space="0" w:color="D8D8D8"/>
+              <w:bottom w:val="single" w:sz="2" w:space="0" w:color="D8D8D8"/>
+              <w:left w:val="single" w:sz="2" w:space="0" w:color="D8D8D8"/>
+              <w:right w:val="single" w:sz="2" w:space="0" w:color="D8D8D8"/>
             </w:tcBorders>
             <w:tcMar>
-              <w:top w:w="40" w:type="dxa"/>
-              <w:bottom w:w="40" w:type="dxa"/>
+              <w:top w:w="45" w:type="dxa"/>
+              <w:bottom w:w="45" w:type="dxa"/>
               <w:left w:w="80" w:type="dxa"/>
               <w:right w:w="80" w:type="dxa"/>
             </w:tcMar>
@@ -1846,7 +1859,7 @@
               <w:rPr>
                 <w:rFonts w:ascii="Calibri" w:hAnsi="Calibri"/>
                 <w:b/>
-                <w:color w:val="2C2C2C"/>
+                <w:color w:val="0C2340"/>
                 <w:sz w:val="16"/>
               </w:rPr>
               <w:t>Cryopreservation events</w:t>
@@ -1858,14 +1871,14 @@
             <w:tcW w:type="dxa" w:w="1949"/>
             <w:shd w:fill="FFFFFF"/>
             <w:tcBorders>
-              <w:top w:val="single" w:sz="2" w:space="0" w:color="CCCCCC"/>
-              <w:bottom w:val="single" w:sz="2" w:space="0" w:color="CCCCCC"/>
-              <w:left w:val="single" w:sz="2" w:space="0" w:color="CCCCCC"/>
-              <w:right w:val="single" w:sz="2" w:space="0" w:color="CCCCCC"/>
+              <w:top w:val="single" w:sz="2" w:space="0" w:color="D8D8D8"/>
+              <w:bottom w:val="single" w:sz="2" w:space="0" w:color="D8D8D8"/>
+              <w:left w:val="single" w:sz="2" w:space="0" w:color="D8D8D8"/>
+              <w:right w:val="single" w:sz="2" w:space="0" w:color="D8D8D8"/>
             </w:tcBorders>
             <w:tcMar>
-              <w:top w:w="40" w:type="dxa"/>
-              <w:bottom w:w="40" w:type="dxa"/>
+              <w:top w:w="45" w:type="dxa"/>
+              <w:bottom w:w="45" w:type="dxa"/>
               <w:left w:w="80" w:type="dxa"/>
               <w:right w:w="80" w:type="dxa"/>
             </w:tcMar>
@@ -1878,10 +1891,10 @@
             <w:r>
               <w:rPr>
                 <w:rFonts w:ascii="Calibri" w:hAnsi="Calibri"/>
-                <w:color w:val="2C2C2C"/>
+                <w:color w:val="333333"/>
                 <w:sz w:val="16"/>
               </w:rPr>
-              <w:t>16-24</w:t>
+              <w:t>16–24</w:t>
             </w:r>
           </w:p>
         </w:tc>
@@ -1890,14 +1903,14 @@
             <w:tcW w:type="dxa" w:w="1949"/>
             <w:shd w:fill="FFFFFF"/>
             <w:tcBorders>
-              <w:top w:val="single" w:sz="2" w:space="0" w:color="CCCCCC"/>
-              <w:bottom w:val="single" w:sz="2" w:space="0" w:color="CCCCCC"/>
-              <w:left w:val="single" w:sz="2" w:space="0" w:color="CCCCCC"/>
-              <w:right w:val="single" w:sz="2" w:space="0" w:color="CCCCCC"/>
+              <w:top w:val="single" w:sz="2" w:space="0" w:color="D8D8D8"/>
+              <w:bottom w:val="single" w:sz="2" w:space="0" w:color="D8D8D8"/>
+              <w:left w:val="single" w:sz="2" w:space="0" w:color="D8D8D8"/>
+              <w:right w:val="single" w:sz="2" w:space="0" w:color="D8D8D8"/>
             </w:tcBorders>
             <w:tcMar>
-              <w:top w:w="40" w:type="dxa"/>
-              <w:bottom w:w="40" w:type="dxa"/>
+              <w:top w:w="45" w:type="dxa"/>
+              <w:bottom w:w="45" w:type="dxa"/>
               <w:left w:w="80" w:type="dxa"/>
               <w:right w:w="80" w:type="dxa"/>
             </w:tcMar>
@@ -1910,10 +1923,10 @@
             <w:r>
               <w:rPr>
                 <w:rFonts w:ascii="Calibri" w:hAnsi="Calibri"/>
-                <w:color w:val="2C2C2C"/>
+                <w:color w:val="333333"/>
                 <w:sz w:val="16"/>
               </w:rPr>
-              <w:t>30-44</w:t>
+              <w:t>30–44</w:t>
             </w:r>
           </w:p>
         </w:tc>
@@ -1922,14 +1935,14 @@
             <w:tcW w:type="dxa" w:w="1949"/>
             <w:shd w:fill="FFFFFF"/>
             <w:tcBorders>
-              <w:top w:val="single" w:sz="2" w:space="0" w:color="CCCCCC"/>
-              <w:bottom w:val="single" w:sz="2" w:space="0" w:color="CCCCCC"/>
-              <w:left w:val="single" w:sz="2" w:space="0" w:color="CCCCCC"/>
-              <w:right w:val="single" w:sz="2" w:space="0" w:color="CCCCCC"/>
+              <w:top w:val="single" w:sz="2" w:space="0" w:color="D8D8D8"/>
+              <w:bottom w:val="single" w:sz="2" w:space="0" w:color="D8D8D8"/>
+              <w:left w:val="single" w:sz="2" w:space="0" w:color="D8D8D8"/>
+              <w:right w:val="single" w:sz="2" w:space="0" w:color="D8D8D8"/>
             </w:tcBorders>
             <w:tcMar>
-              <w:top w:w="40" w:type="dxa"/>
-              <w:bottom w:w="40" w:type="dxa"/>
+              <w:top w:w="45" w:type="dxa"/>
+              <w:bottom w:w="45" w:type="dxa"/>
               <w:left w:w="80" w:type="dxa"/>
               <w:right w:w="80" w:type="dxa"/>
             </w:tcMar>
@@ -1942,10 +1955,10 @@
             <w:r>
               <w:rPr>
                 <w:rFonts w:ascii="Calibri" w:hAnsi="Calibri"/>
-                <w:color w:val="2C2C2C"/>
+                <w:color w:val="333333"/>
                 <w:sz w:val="16"/>
               </w:rPr>
-              <w:t>40-57</w:t>
+              <w:t>40–57</w:t>
             </w:r>
           </w:p>
         </w:tc>
@@ -1954,14 +1967,14 @@
             <w:tcW w:type="dxa" w:w="1949"/>
             <w:shd w:fill="FFFFFF"/>
             <w:tcBorders>
-              <w:top w:val="single" w:sz="2" w:space="0" w:color="CCCCCC"/>
-              <w:bottom w:val="single" w:sz="2" w:space="0" w:color="CCCCCC"/>
-              <w:left w:val="single" w:sz="2" w:space="0" w:color="CCCCCC"/>
-              <w:right w:val="single" w:sz="2" w:space="0" w:color="CCCCCC"/>
+              <w:top w:val="single" w:sz="2" w:space="0" w:color="D8D8D8"/>
+              <w:bottom w:val="single" w:sz="2" w:space="0" w:color="D8D8D8"/>
+              <w:left w:val="single" w:sz="2" w:space="0" w:color="D8D8D8"/>
+              <w:right w:val="single" w:sz="2" w:space="0" w:color="D8D8D8"/>
             </w:tcBorders>
             <w:tcMar>
-              <w:top w:w="40" w:type="dxa"/>
-              <w:bottom w:w="40" w:type="dxa"/>
+              <w:top w:w="45" w:type="dxa"/>
+              <w:bottom w:w="45" w:type="dxa"/>
               <w:left w:w="80" w:type="dxa"/>
               <w:right w:w="80" w:type="dxa"/>
             </w:tcMar>
@@ -1974,10 +1987,10 @@
             <w:r>
               <w:rPr>
                 <w:rFonts w:ascii="Calibri" w:hAnsi="Calibri"/>
-                <w:color w:val="2C2C2C"/>
+                <w:color w:val="333333"/>
                 <w:sz w:val="16"/>
               </w:rPr>
-              <w:t>55-77</w:t>
+              <w:t>55–77</w:t>
             </w:r>
           </w:p>
         </w:tc>
@@ -1986,16 +1999,16 @@
         <w:tc>
           <w:tcPr>
             <w:tcW w:type="dxa" w:w="1949"/>
-            <w:shd w:fill="F5F7F8"/>
+            <w:shd w:fill="F4F7F8"/>
             <w:tcBorders>
-              <w:top w:val="single" w:sz="2" w:space="0" w:color="CCCCCC"/>
-              <w:bottom w:val="single" w:sz="2" w:space="0" w:color="CCCCCC"/>
-              <w:left w:val="single" w:sz="2" w:space="0" w:color="CCCCCC"/>
-              <w:right w:val="single" w:sz="2" w:space="0" w:color="CCCCCC"/>
+              <w:top w:val="single" w:sz="2" w:space="0" w:color="D8D8D8"/>
+              <w:bottom w:val="single" w:sz="2" w:space="0" w:color="D8D8D8"/>
+              <w:left w:val="single" w:sz="2" w:space="0" w:color="D8D8D8"/>
+              <w:right w:val="single" w:sz="2" w:space="0" w:color="D8D8D8"/>
             </w:tcBorders>
             <w:tcMar>
-              <w:top w:w="40" w:type="dxa"/>
-              <w:bottom w:w="40" w:type="dxa"/>
+              <w:top w:w="45" w:type="dxa"/>
+              <w:bottom w:w="45" w:type="dxa"/>
               <w:left w:w="80" w:type="dxa"/>
               <w:right w:w="80" w:type="dxa"/>
             </w:tcMar>
@@ -2009,7 +2022,7 @@
               <w:rPr>
                 <w:rFonts w:ascii="Calibri" w:hAnsi="Calibri"/>
                 <w:b/>
-                <w:color w:val="2C2C2C"/>
+                <w:color w:val="0C2340"/>
                 <w:sz w:val="16"/>
               </w:rPr>
               <w:t>Product release testing</w:t>
@@ -2019,16 +2032,16 @@
         <w:tc>
           <w:tcPr>
             <w:tcW w:type="dxa" w:w="1949"/>
-            <w:shd w:fill="F5F7F8"/>
+            <w:shd w:fill="F4F7F8"/>
             <w:tcBorders>
-              <w:top w:val="single" w:sz="2" w:space="0" w:color="CCCCCC"/>
-              <w:bottom w:val="single" w:sz="2" w:space="0" w:color="CCCCCC"/>
-              <w:left w:val="single" w:sz="2" w:space="0" w:color="CCCCCC"/>
-              <w:right w:val="single" w:sz="2" w:space="0" w:color="CCCCCC"/>
+              <w:top w:val="single" w:sz="2" w:space="0" w:color="D8D8D8"/>
+              <w:bottom w:val="single" w:sz="2" w:space="0" w:color="D8D8D8"/>
+              <w:left w:val="single" w:sz="2" w:space="0" w:color="D8D8D8"/>
+              <w:right w:val="single" w:sz="2" w:space="0" w:color="D8D8D8"/>
             </w:tcBorders>
             <w:tcMar>
-              <w:top w:w="40" w:type="dxa"/>
-              <w:bottom w:w="40" w:type="dxa"/>
+              <w:top w:w="45" w:type="dxa"/>
+              <w:bottom w:w="45" w:type="dxa"/>
               <w:left w:w="80" w:type="dxa"/>
               <w:right w:w="80" w:type="dxa"/>
             </w:tcMar>
@@ -2041,26 +2054,26 @@
             <w:r>
               <w:rPr>
                 <w:rFonts w:ascii="Calibri" w:hAnsi="Calibri"/>
-                <w:color w:val="2C2C2C"/>
+                <w:color w:val="333333"/>
                 <w:sz w:val="16"/>
               </w:rPr>
-              <w:t>20-32</w:t>
+              <w:t>20–32</w:t>
             </w:r>
           </w:p>
         </w:tc>
         <w:tc>
           <w:tcPr>
             <w:tcW w:type="dxa" w:w="1949"/>
-            <w:shd w:fill="F5F7F8"/>
+            <w:shd w:fill="F4F7F8"/>
             <w:tcBorders>
-              <w:top w:val="single" w:sz="2" w:space="0" w:color="CCCCCC"/>
-              <w:bottom w:val="single" w:sz="2" w:space="0" w:color="CCCCCC"/>
-              <w:left w:val="single" w:sz="2" w:space="0" w:color="CCCCCC"/>
-              <w:right w:val="single" w:sz="2" w:space="0" w:color="CCCCCC"/>
+              <w:top w:val="single" w:sz="2" w:space="0" w:color="D8D8D8"/>
+              <w:bottom w:val="single" w:sz="2" w:space="0" w:color="D8D8D8"/>
+              <w:left w:val="single" w:sz="2" w:space="0" w:color="D8D8D8"/>
+              <w:right w:val="single" w:sz="2" w:space="0" w:color="D8D8D8"/>
             </w:tcBorders>
             <w:tcMar>
-              <w:top w:w="40" w:type="dxa"/>
-              <w:bottom w:w="40" w:type="dxa"/>
+              <w:top w:w="45" w:type="dxa"/>
+              <w:bottom w:w="45" w:type="dxa"/>
               <w:left w:w="80" w:type="dxa"/>
               <w:right w:w="80" w:type="dxa"/>
             </w:tcMar>
@@ -2073,26 +2086,26 @@
             <w:r>
               <w:rPr>
                 <w:rFonts w:ascii="Calibri" w:hAnsi="Calibri"/>
-                <w:color w:val="2C2C2C"/>
+                <w:color w:val="333333"/>
                 <w:sz w:val="16"/>
               </w:rPr>
-              <w:t>40-58</w:t>
+              <w:t>40–58</w:t>
             </w:r>
           </w:p>
         </w:tc>
         <w:tc>
           <w:tcPr>
             <w:tcW w:type="dxa" w:w="1949"/>
-            <w:shd w:fill="F5F7F8"/>
+            <w:shd w:fill="F4F7F8"/>
             <w:tcBorders>
-              <w:top w:val="single" w:sz="2" w:space="0" w:color="CCCCCC"/>
-              <w:bottom w:val="single" w:sz="2" w:space="0" w:color="CCCCCC"/>
-              <w:left w:val="single" w:sz="2" w:space="0" w:color="CCCCCC"/>
-              <w:right w:val="single" w:sz="2" w:space="0" w:color="CCCCCC"/>
+              <w:top w:val="single" w:sz="2" w:space="0" w:color="D8D8D8"/>
+              <w:bottom w:val="single" w:sz="2" w:space="0" w:color="D8D8D8"/>
+              <w:left w:val="single" w:sz="2" w:space="0" w:color="D8D8D8"/>
+              <w:right w:val="single" w:sz="2" w:space="0" w:color="D8D8D8"/>
             </w:tcBorders>
             <w:tcMar>
-              <w:top w:w="40" w:type="dxa"/>
-              <w:bottom w:w="40" w:type="dxa"/>
+              <w:top w:w="45" w:type="dxa"/>
+              <w:bottom w:w="45" w:type="dxa"/>
               <w:left w:w="80" w:type="dxa"/>
               <w:right w:w="80" w:type="dxa"/>
             </w:tcMar>
@@ -2105,26 +2118,26 @@
             <w:r>
               <w:rPr>
                 <w:rFonts w:ascii="Calibri" w:hAnsi="Calibri"/>
-                <w:color w:val="2C2C2C"/>
+                <w:color w:val="333333"/>
                 <w:sz w:val="16"/>
               </w:rPr>
-              <w:t>56-80</w:t>
+              <w:t>56–80</w:t>
             </w:r>
           </w:p>
         </w:tc>
         <w:tc>
           <w:tcPr>
             <w:tcW w:type="dxa" w:w="1949"/>
-            <w:shd w:fill="F5F7F8"/>
+            <w:shd w:fill="F4F7F8"/>
             <w:tcBorders>
-              <w:top w:val="single" w:sz="2" w:space="0" w:color="CCCCCC"/>
-              <w:bottom w:val="single" w:sz="2" w:space="0" w:color="CCCCCC"/>
-              <w:left w:val="single" w:sz="2" w:space="0" w:color="CCCCCC"/>
-              <w:right w:val="single" w:sz="2" w:space="0" w:color="CCCCCC"/>
+              <w:top w:val="single" w:sz="2" w:space="0" w:color="D8D8D8"/>
+              <w:bottom w:val="single" w:sz="2" w:space="0" w:color="D8D8D8"/>
+              <w:left w:val="single" w:sz="2" w:space="0" w:color="D8D8D8"/>
+              <w:right w:val="single" w:sz="2" w:space="0" w:color="D8D8D8"/>
             </w:tcBorders>
             <w:tcMar>
-              <w:top w:w="40" w:type="dxa"/>
-              <w:bottom w:w="40" w:type="dxa"/>
+              <w:top w:w="45" w:type="dxa"/>
+              <w:bottom w:w="45" w:type="dxa"/>
               <w:left w:w="80" w:type="dxa"/>
               <w:right w:w="80" w:type="dxa"/>
             </w:tcMar>
@@ -2137,10 +2150,10 @@
             <w:r>
               <w:rPr>
                 <w:rFonts w:ascii="Calibri" w:hAnsi="Calibri"/>
-                <w:color w:val="2C2C2C"/>
+                <w:color w:val="333333"/>
                 <w:sz w:val="16"/>
               </w:rPr>
-              <w:t>85-122</w:t>
+              <w:t>85–122</w:t>
             </w:r>
           </w:p>
         </w:tc>
@@ -2151,14 +2164,14 @@
             <w:tcW w:type="dxa" w:w="1949"/>
             <w:shd w:fill="FFFFFF"/>
             <w:tcBorders>
-              <w:top w:val="single" w:sz="2" w:space="0" w:color="CCCCCC"/>
-              <w:bottom w:val="single" w:sz="2" w:space="0" w:color="CCCCCC"/>
-              <w:left w:val="single" w:sz="2" w:space="0" w:color="CCCCCC"/>
-              <w:right w:val="single" w:sz="2" w:space="0" w:color="CCCCCC"/>
+              <w:top w:val="single" w:sz="2" w:space="0" w:color="D8D8D8"/>
+              <w:bottom w:val="single" w:sz="2" w:space="0" w:color="D8D8D8"/>
+              <w:left w:val="single" w:sz="2" w:space="0" w:color="D8D8D8"/>
+              <w:right w:val="single" w:sz="2" w:space="0" w:color="D8D8D8"/>
             </w:tcBorders>
             <w:tcMar>
-              <w:top w:w="40" w:type="dxa"/>
-              <w:bottom w:w="40" w:type="dxa"/>
+              <w:top w:w="45" w:type="dxa"/>
+              <w:bottom w:w="45" w:type="dxa"/>
               <w:left w:w="80" w:type="dxa"/>
               <w:right w:w="80" w:type="dxa"/>
             </w:tcMar>
@@ -2172,10 +2185,10 @@
               <w:rPr>
                 <w:rFonts w:ascii="Calibri" w:hAnsi="Calibri"/>
                 <w:b/>
-                <w:color w:val="2C2C2C"/>
+                <w:color w:val="0C2340"/>
                 <w:sz w:val="16"/>
               </w:rPr>
-              <w:t>Chain-of-custody/identity</w:t>
+              <w:t>Chain-of-custody / identity</w:t>
             </w:r>
           </w:p>
         </w:tc>
@@ -2184,14 +2197,14 @@
             <w:tcW w:type="dxa" w:w="1949"/>
             <w:shd w:fill="FFFFFF"/>
             <w:tcBorders>
-              <w:top w:val="single" w:sz="2" w:space="0" w:color="CCCCCC"/>
-              <w:bottom w:val="single" w:sz="2" w:space="0" w:color="CCCCCC"/>
-              <w:left w:val="single" w:sz="2" w:space="0" w:color="CCCCCC"/>
-              <w:right w:val="single" w:sz="2" w:space="0" w:color="CCCCCC"/>
+              <w:top w:val="single" w:sz="2" w:space="0" w:color="D8D8D8"/>
+              <w:bottom w:val="single" w:sz="2" w:space="0" w:color="D8D8D8"/>
+              <w:left w:val="single" w:sz="2" w:space="0" w:color="D8D8D8"/>
+              <w:right w:val="single" w:sz="2" w:space="0" w:color="D8D8D8"/>
             </w:tcBorders>
             <w:tcMar>
-              <w:top w:w="40" w:type="dxa"/>
-              <w:bottom w:w="40" w:type="dxa"/>
+              <w:top w:w="45" w:type="dxa"/>
+              <w:bottom w:w="45" w:type="dxa"/>
               <w:left w:w="80" w:type="dxa"/>
               <w:right w:w="80" w:type="dxa"/>
             </w:tcMar>
@@ -2204,10 +2217,10 @@
             <w:r>
               <w:rPr>
                 <w:rFonts w:ascii="Calibri" w:hAnsi="Calibri"/>
-                <w:color w:val="2C2C2C"/>
+                <w:color w:val="333333"/>
                 <w:sz w:val="16"/>
               </w:rPr>
-              <w:t>20-32</w:t>
+              <w:t>20–32</w:t>
             </w:r>
           </w:p>
         </w:tc>
@@ -2216,14 +2229,14 @@
             <w:tcW w:type="dxa" w:w="1949"/>
             <w:shd w:fill="FFFFFF"/>
             <w:tcBorders>
-              <w:top w:val="single" w:sz="2" w:space="0" w:color="CCCCCC"/>
-              <w:bottom w:val="single" w:sz="2" w:space="0" w:color="CCCCCC"/>
-              <w:left w:val="single" w:sz="2" w:space="0" w:color="CCCCCC"/>
-              <w:right w:val="single" w:sz="2" w:space="0" w:color="CCCCCC"/>
+              <w:top w:val="single" w:sz="2" w:space="0" w:color="D8D8D8"/>
+              <w:bottom w:val="single" w:sz="2" w:space="0" w:color="D8D8D8"/>
+              <w:left w:val="single" w:sz="2" w:space="0" w:color="D8D8D8"/>
+              <w:right w:val="single" w:sz="2" w:space="0" w:color="D8D8D8"/>
             </w:tcBorders>
             <w:tcMar>
-              <w:top w:w="40" w:type="dxa"/>
-              <w:bottom w:w="40" w:type="dxa"/>
+              <w:top w:w="45" w:type="dxa"/>
+              <w:bottom w:w="45" w:type="dxa"/>
               <w:left w:w="80" w:type="dxa"/>
               <w:right w:w="80" w:type="dxa"/>
             </w:tcMar>
@@ -2236,10 +2249,10 @@
             <w:r>
               <w:rPr>
                 <w:rFonts w:ascii="Calibri" w:hAnsi="Calibri"/>
-                <w:color w:val="2C2C2C"/>
+                <w:color w:val="333333"/>
                 <w:sz w:val="16"/>
               </w:rPr>
-              <w:t>40-58</w:t>
+              <w:t>40–58</w:t>
             </w:r>
           </w:p>
         </w:tc>
@@ -2248,14 +2261,14 @@
             <w:tcW w:type="dxa" w:w="1949"/>
             <w:shd w:fill="FFFFFF"/>
             <w:tcBorders>
-              <w:top w:val="single" w:sz="2" w:space="0" w:color="CCCCCC"/>
-              <w:bottom w:val="single" w:sz="2" w:space="0" w:color="CCCCCC"/>
-              <w:left w:val="single" w:sz="2" w:space="0" w:color="CCCCCC"/>
-              <w:right w:val="single" w:sz="2" w:space="0" w:color="CCCCCC"/>
+              <w:top w:val="single" w:sz="2" w:space="0" w:color="D8D8D8"/>
+              <w:bottom w:val="single" w:sz="2" w:space="0" w:color="D8D8D8"/>
+              <w:left w:val="single" w:sz="2" w:space="0" w:color="D8D8D8"/>
+              <w:right w:val="single" w:sz="2" w:space="0" w:color="D8D8D8"/>
             </w:tcBorders>
             <w:tcMar>
-              <w:top w:w="40" w:type="dxa"/>
-              <w:bottom w:w="40" w:type="dxa"/>
+              <w:top w:w="45" w:type="dxa"/>
+              <w:bottom w:w="45" w:type="dxa"/>
               <w:left w:w="80" w:type="dxa"/>
               <w:right w:w="80" w:type="dxa"/>
             </w:tcMar>
@@ -2268,10 +2281,10 @@
             <w:r>
               <w:rPr>
                 <w:rFonts w:ascii="Calibri" w:hAnsi="Calibri"/>
-                <w:color w:val="2C2C2C"/>
+                <w:color w:val="333333"/>
                 <w:sz w:val="16"/>
               </w:rPr>
-              <w:t>56-80</w:t>
+              <w:t>56–80</w:t>
             </w:r>
           </w:p>
         </w:tc>
@@ -2280,14 +2293,14 @@
             <w:tcW w:type="dxa" w:w="1949"/>
             <w:shd w:fill="FFFFFF"/>
             <w:tcBorders>
-              <w:top w:val="single" w:sz="2" w:space="0" w:color="CCCCCC"/>
-              <w:bottom w:val="single" w:sz="2" w:space="0" w:color="CCCCCC"/>
-              <w:left w:val="single" w:sz="2" w:space="0" w:color="CCCCCC"/>
-              <w:right w:val="single" w:sz="2" w:space="0" w:color="CCCCCC"/>
+              <w:top w:val="single" w:sz="2" w:space="0" w:color="D8D8D8"/>
+              <w:bottom w:val="single" w:sz="2" w:space="0" w:color="D8D8D8"/>
+              <w:left w:val="single" w:sz="2" w:space="0" w:color="D8D8D8"/>
+              <w:right w:val="single" w:sz="2" w:space="0" w:color="D8D8D8"/>
             </w:tcBorders>
             <w:tcMar>
-              <w:top w:w="40" w:type="dxa"/>
-              <w:bottom w:w="40" w:type="dxa"/>
+              <w:top w:w="45" w:type="dxa"/>
+              <w:bottom w:w="45" w:type="dxa"/>
               <w:left w:w="80" w:type="dxa"/>
               <w:right w:w="80" w:type="dxa"/>
             </w:tcMar>
@@ -2300,10 +2313,10 @@
             <w:r>
               <w:rPr>
                 <w:rFonts w:ascii="Calibri" w:hAnsi="Calibri"/>
-                <w:color w:val="2C2C2C"/>
+                <w:color w:val="333333"/>
                 <w:sz w:val="16"/>
               </w:rPr>
-              <w:t>85-122</w:t>
+              <w:t>85–122</w:t>
             </w:r>
           </w:p>
         </w:tc>
@@ -2314,7 +2327,7 @@
         <w:rPr>
           <w:rFonts w:ascii="Calibri" w:hAnsi="Calibri"/>
           <w:b/>
-          <w:color w:val="007B7F"/>
+          <w:color w:val="C4A35A"/>
           <w:sz w:val="18"/>
         </w:rPr>
         <w:t xml:space="preserve">04  </w:t>
@@ -2323,7 +2336,7 @@
         <w:rPr>
           <w:rFonts w:ascii="Calibri" w:hAnsi="Calibri"/>
           <w:b/>
-          <w:color w:val="1B2A4A"/>
+          <w:color w:val="0C2340"/>
           <w:sz w:val="26"/>
         </w:rPr>
         <w:t>CONTRACT SCOPE — ITEMS TO REVIEW</w:t>
@@ -2332,7 +2345,7 @@
     <w:p>
       <w:pPr>
         <w:pBdr>
-          <w:bottom w:val="single" w:sz="6" w:space="1" w:color="007B7F"/>
+          <w:bottom w:val="single" w:sz="6" w:space="1" w:color="C4A35A"/>
         </w:pBdr>
       </w:pPr>
     </w:p>
@@ -2341,10 +2354,10 @@
         <w:rPr>
           <w:rFonts w:ascii="Calibri" w:hAnsi="Calibri"/>
           <w:b w:val="0"/>
-          <w:color w:val="2C2C2C"/>
+          <w:color w:val="333333"/>
           <w:sz w:val="18"/>
         </w:rPr>
-        <w:t>OncoCel requests ARC confirm coverage for the following services as the program scales:</w:t>
+        <w:t>OncoCel, on behalf of TCT Oncology, requests ARC confirm coverage for the following services:</w:t>
       </w:r>
     </w:p>
     <w:tbl>
@@ -2363,16 +2376,16 @@
         <w:tc>
           <w:tcPr>
             <w:tcW w:type="dxa" w:w="3249"/>
-            <w:shd w:fill="007B7F"/>
+            <w:shd w:fill="007C8A"/>
             <w:tcBorders>
-              <w:top w:val="single" w:sz="2" w:space="0" w:color="007B7F"/>
-              <w:bottom w:val="single" w:sz="2" w:space="0" w:color="007B7F"/>
-              <w:left w:val="single" w:sz="2" w:space="0" w:color="007B7F"/>
-              <w:right w:val="single" w:sz="2" w:space="0" w:color="007B7F"/>
+              <w:top w:val="single" w:sz="2" w:space="0" w:color="007C8A"/>
+              <w:bottom w:val="single" w:sz="2" w:space="0" w:color="007C8A"/>
+              <w:left w:val="single" w:sz="2" w:space="0" w:color="007C8A"/>
+              <w:right w:val="single" w:sz="2" w:space="0" w:color="007C8A"/>
             </w:tcBorders>
             <w:tcMar>
-              <w:top w:w="40" w:type="dxa"/>
-              <w:bottom w:w="40" w:type="dxa"/>
+              <w:top w:w="45" w:type="dxa"/>
+              <w:bottom w:w="45" w:type="dxa"/>
               <w:left w:w="80" w:type="dxa"/>
               <w:right w:w="80" w:type="dxa"/>
             </w:tcMar>
@@ -2396,16 +2409,16 @@
         <w:tc>
           <w:tcPr>
             <w:tcW w:type="dxa" w:w="3249"/>
-            <w:shd w:fill="007B7F"/>
+            <w:shd w:fill="007C8A"/>
             <w:tcBorders>
-              <w:top w:val="single" w:sz="2" w:space="0" w:color="007B7F"/>
-              <w:bottom w:val="single" w:sz="2" w:space="0" w:color="007B7F"/>
-              <w:left w:val="single" w:sz="2" w:space="0" w:color="007B7F"/>
-              <w:right w:val="single" w:sz="2" w:space="0" w:color="007B7F"/>
+              <w:top w:val="single" w:sz="2" w:space="0" w:color="007C8A"/>
+              <w:bottom w:val="single" w:sz="2" w:space="0" w:color="007C8A"/>
+              <w:left w:val="single" w:sz="2" w:space="0" w:color="007C8A"/>
+              <w:right w:val="single" w:sz="2" w:space="0" w:color="007C8A"/>
             </w:tcBorders>
             <w:tcMar>
-              <w:top w:w="40" w:type="dxa"/>
-              <w:bottom w:w="40" w:type="dxa"/>
+              <w:top w:w="45" w:type="dxa"/>
+              <w:bottom w:w="45" w:type="dxa"/>
               <w:left w:w="80" w:type="dxa"/>
               <w:right w:w="80" w:type="dxa"/>
             </w:tcMar>
@@ -2429,16 +2442,16 @@
         <w:tc>
           <w:tcPr>
             <w:tcW w:type="dxa" w:w="3249"/>
-            <w:shd w:fill="007B7F"/>
+            <w:shd w:fill="007C8A"/>
             <w:tcBorders>
-              <w:top w:val="single" w:sz="2" w:space="0" w:color="007B7F"/>
-              <w:bottom w:val="single" w:sz="2" w:space="0" w:color="007B7F"/>
-              <w:left w:val="single" w:sz="2" w:space="0" w:color="007B7F"/>
-              <w:right w:val="single" w:sz="2" w:space="0" w:color="007B7F"/>
+              <w:top w:val="single" w:sz="2" w:space="0" w:color="007C8A"/>
+              <w:bottom w:val="single" w:sz="2" w:space="0" w:color="007C8A"/>
+              <w:left w:val="single" w:sz="2" w:space="0" w:color="007C8A"/>
+              <w:right w:val="single" w:sz="2" w:space="0" w:color="007C8A"/>
             </w:tcBorders>
             <w:tcMar>
-              <w:top w:w="40" w:type="dxa"/>
-              <w:bottom w:w="40" w:type="dxa"/>
+              <w:top w:w="45" w:type="dxa"/>
+              <w:bottom w:w="45" w:type="dxa"/>
               <w:left w:w="80" w:type="dxa"/>
               <w:right w:w="80" w:type="dxa"/>
             </w:tcMar>
@@ -2466,14 +2479,14 @@
             <w:tcW w:type="dxa" w:w="3249"/>
             <w:shd w:fill="FFFFFF"/>
             <w:tcBorders>
-              <w:top w:val="single" w:sz="2" w:space="0" w:color="CCCCCC"/>
-              <w:bottom w:val="single" w:sz="2" w:space="0" w:color="CCCCCC"/>
-              <w:left w:val="single" w:sz="2" w:space="0" w:color="CCCCCC"/>
-              <w:right w:val="single" w:sz="2" w:space="0" w:color="CCCCCC"/>
+              <w:top w:val="single" w:sz="2" w:space="0" w:color="D8D8D8"/>
+              <w:bottom w:val="single" w:sz="2" w:space="0" w:color="D8D8D8"/>
+              <w:left w:val="single" w:sz="2" w:space="0" w:color="D8D8D8"/>
+              <w:right w:val="single" w:sz="2" w:space="0" w:color="D8D8D8"/>
             </w:tcBorders>
             <w:tcMar>
-              <w:top w:w="40" w:type="dxa"/>
-              <w:bottom w:w="40" w:type="dxa"/>
+              <w:top w:w="45" w:type="dxa"/>
+              <w:bottom w:w="45" w:type="dxa"/>
               <w:left w:w="80" w:type="dxa"/>
               <w:right w:w="80" w:type="dxa"/>
             </w:tcMar>
@@ -2487,7 +2500,7 @@
               <w:rPr>
                 <w:rFonts w:ascii="Calibri" w:hAnsi="Calibri"/>
                 <w:b/>
-                <w:color w:val="2C2C2C"/>
+                <w:color w:val="0C2340"/>
                 <w:sz w:val="16"/>
               </w:rPr>
               <w:t>Autologous HSC collection &amp; processing</w:t>
@@ -2499,14 +2512,14 @@
             <w:tcW w:type="dxa" w:w="3249"/>
             <w:shd w:fill="FFFFFF"/>
             <w:tcBorders>
-              <w:top w:val="single" w:sz="2" w:space="0" w:color="CCCCCC"/>
-              <w:bottom w:val="single" w:sz="2" w:space="0" w:color="CCCCCC"/>
-              <w:left w:val="single" w:sz="2" w:space="0" w:color="CCCCCC"/>
-              <w:right w:val="single" w:sz="2" w:space="0" w:color="CCCCCC"/>
+              <w:top w:val="single" w:sz="2" w:space="0" w:color="D8D8D8"/>
+              <w:bottom w:val="single" w:sz="2" w:space="0" w:color="D8D8D8"/>
+              <w:left w:val="single" w:sz="2" w:space="0" w:color="D8D8D8"/>
+              <w:right w:val="single" w:sz="2" w:space="0" w:color="D8D8D8"/>
             </w:tcBorders>
             <w:tcMar>
-              <w:top w:w="40" w:type="dxa"/>
-              <w:bottom w:w="40" w:type="dxa"/>
+              <w:top w:w="45" w:type="dxa"/>
+              <w:bottom w:w="45" w:type="dxa"/>
               <w:left w:w="80" w:type="dxa"/>
               <w:right w:w="80" w:type="dxa"/>
             </w:tcMar>
@@ -2519,7 +2532,7 @@
             <w:r>
               <w:rPr>
                 <w:rFonts w:ascii="Calibri" w:hAnsi="Calibri"/>
-                <w:color w:val="2C2C2C"/>
+                <w:color w:val="333333"/>
                 <w:sz w:val="16"/>
               </w:rPr>
               <w:t>Confirm</w:t>
@@ -2531,14 +2544,14 @@
             <w:tcW w:type="dxa" w:w="3249"/>
             <w:shd w:fill="FFFFFF"/>
             <w:tcBorders>
-              <w:top w:val="single" w:sz="2" w:space="0" w:color="CCCCCC"/>
-              <w:bottom w:val="single" w:sz="2" w:space="0" w:color="CCCCCC"/>
-              <w:left w:val="single" w:sz="2" w:space="0" w:color="CCCCCC"/>
-              <w:right w:val="single" w:sz="2" w:space="0" w:color="CCCCCC"/>
+              <w:top w:val="single" w:sz="2" w:space="0" w:color="D8D8D8"/>
+              <w:bottom w:val="single" w:sz="2" w:space="0" w:color="D8D8D8"/>
+              <w:left w:val="single" w:sz="2" w:space="0" w:color="D8D8D8"/>
+              <w:right w:val="single" w:sz="2" w:space="0" w:color="D8D8D8"/>
             </w:tcBorders>
             <w:tcMar>
-              <w:top w:w="40" w:type="dxa"/>
-              <w:bottom w:w="40" w:type="dxa"/>
+              <w:top w:w="45" w:type="dxa"/>
+              <w:bottom w:w="45" w:type="dxa"/>
               <w:left w:w="80" w:type="dxa"/>
               <w:right w:w="80" w:type="dxa"/>
             </w:tcMar>
@@ -2551,7 +2564,7 @@
             <w:r>
               <w:rPr>
                 <w:rFonts w:ascii="Calibri" w:hAnsi="Calibri"/>
-                <w:color w:val="2C2C2C"/>
+                <w:color w:val="333333"/>
                 <w:sz w:val="16"/>
               </w:rPr>
               <w:t>Verify explicit coverage in current agreement</w:t>
@@ -2563,16 +2576,16 @@
         <w:tc>
           <w:tcPr>
             <w:tcW w:type="dxa" w:w="3249"/>
-            <w:shd w:fill="F5F7F8"/>
+            <w:shd w:fill="F4F7F8"/>
             <w:tcBorders>
-              <w:top w:val="single" w:sz="2" w:space="0" w:color="CCCCCC"/>
-              <w:bottom w:val="single" w:sz="2" w:space="0" w:color="CCCCCC"/>
-              <w:left w:val="single" w:sz="2" w:space="0" w:color="CCCCCC"/>
-              <w:right w:val="single" w:sz="2" w:space="0" w:color="CCCCCC"/>
+              <w:top w:val="single" w:sz="2" w:space="0" w:color="D8D8D8"/>
+              <w:bottom w:val="single" w:sz="2" w:space="0" w:color="D8D8D8"/>
+              <w:left w:val="single" w:sz="2" w:space="0" w:color="D8D8D8"/>
+              <w:right w:val="single" w:sz="2" w:space="0" w:color="D8D8D8"/>
             </w:tcBorders>
             <w:tcMar>
-              <w:top w:w="40" w:type="dxa"/>
-              <w:bottom w:w="40" w:type="dxa"/>
+              <w:top w:w="45" w:type="dxa"/>
+              <w:bottom w:w="45" w:type="dxa"/>
               <w:left w:w="80" w:type="dxa"/>
               <w:right w:w="80" w:type="dxa"/>
             </w:tcMar>
@@ -2586,7 +2599,7 @@
               <w:rPr>
                 <w:rFonts w:ascii="Calibri" w:hAnsi="Calibri"/>
                 <w:b/>
-                <w:color w:val="2C2C2C"/>
+                <w:color w:val="0C2340"/>
                 <w:sz w:val="16"/>
               </w:rPr>
               <w:t>HSC cryopreservation &amp; long-term storage</w:t>
@@ -2596,16 +2609,16 @@
         <w:tc>
           <w:tcPr>
             <w:tcW w:type="dxa" w:w="3249"/>
-            <w:shd w:fill="F5F7F8"/>
+            <w:shd w:fill="F4F7F8"/>
             <w:tcBorders>
-              <w:top w:val="single" w:sz="2" w:space="0" w:color="CCCCCC"/>
-              <w:bottom w:val="single" w:sz="2" w:space="0" w:color="CCCCCC"/>
-              <w:left w:val="single" w:sz="2" w:space="0" w:color="CCCCCC"/>
-              <w:right w:val="single" w:sz="2" w:space="0" w:color="CCCCCC"/>
+              <w:top w:val="single" w:sz="2" w:space="0" w:color="D8D8D8"/>
+              <w:bottom w:val="single" w:sz="2" w:space="0" w:color="D8D8D8"/>
+              <w:left w:val="single" w:sz="2" w:space="0" w:color="D8D8D8"/>
+              <w:right w:val="single" w:sz="2" w:space="0" w:color="D8D8D8"/>
             </w:tcBorders>
             <w:tcMar>
-              <w:top w:w="40" w:type="dxa"/>
-              <w:bottom w:w="40" w:type="dxa"/>
+              <w:top w:w="45" w:type="dxa"/>
+              <w:bottom w:w="45" w:type="dxa"/>
               <w:left w:w="80" w:type="dxa"/>
               <w:right w:w="80" w:type="dxa"/>
             </w:tcMar>
@@ -2618,7 +2631,7 @@
             <w:r>
               <w:rPr>
                 <w:rFonts w:ascii="Calibri" w:hAnsi="Calibri"/>
-                <w:color w:val="2C2C2C"/>
+                <w:color w:val="333333"/>
                 <w:sz w:val="16"/>
               </w:rPr>
               <w:t>Confirm</w:t>
@@ -2628,16 +2641,16 @@
         <w:tc>
           <w:tcPr>
             <w:tcW w:type="dxa" w:w="3249"/>
-            <w:shd w:fill="F5F7F8"/>
+            <w:shd w:fill="F4F7F8"/>
             <w:tcBorders>
-              <w:top w:val="single" w:sz="2" w:space="0" w:color="CCCCCC"/>
-              <w:bottom w:val="single" w:sz="2" w:space="0" w:color="CCCCCC"/>
-              <w:left w:val="single" w:sz="2" w:space="0" w:color="CCCCCC"/>
-              <w:right w:val="single" w:sz="2" w:space="0" w:color="CCCCCC"/>
+              <w:top w:val="single" w:sz="2" w:space="0" w:color="D8D8D8"/>
+              <w:bottom w:val="single" w:sz="2" w:space="0" w:color="D8D8D8"/>
+              <w:left w:val="single" w:sz="2" w:space="0" w:color="D8D8D8"/>
+              <w:right w:val="single" w:sz="2" w:space="0" w:color="D8D8D8"/>
             </w:tcBorders>
             <w:tcMar>
-              <w:top w:w="40" w:type="dxa"/>
-              <w:bottom w:w="40" w:type="dxa"/>
+              <w:top w:w="45" w:type="dxa"/>
+              <w:bottom w:w="45" w:type="dxa"/>
               <w:left w:w="80" w:type="dxa"/>
               <w:right w:w="80" w:type="dxa"/>
             </w:tcMar>
@@ -2650,7 +2663,7 @@
             <w:r>
               <w:rPr>
                 <w:rFonts w:ascii="Calibri" w:hAnsi="Calibri"/>
-                <w:color w:val="2C2C2C"/>
+                <w:color w:val="333333"/>
                 <w:sz w:val="16"/>
               </w:rPr>
               <w:t>Verify capacity and pricing at projected volume</w:t>
@@ -2664,14 +2677,14 @@
             <w:tcW w:type="dxa" w:w="3249"/>
             <w:shd w:fill="FFFFFF"/>
             <w:tcBorders>
-              <w:top w:val="single" w:sz="2" w:space="0" w:color="CCCCCC"/>
-              <w:bottom w:val="single" w:sz="2" w:space="0" w:color="CCCCCC"/>
-              <w:left w:val="single" w:sz="2" w:space="0" w:color="CCCCCC"/>
-              <w:right w:val="single" w:sz="2" w:space="0" w:color="CCCCCC"/>
+              <w:top w:val="single" w:sz="2" w:space="0" w:color="D8D8D8"/>
+              <w:bottom w:val="single" w:sz="2" w:space="0" w:color="D8D8D8"/>
+              <w:left w:val="single" w:sz="2" w:space="0" w:color="D8D8D8"/>
+              <w:right w:val="single" w:sz="2" w:space="0" w:color="D8D8D8"/>
             </w:tcBorders>
             <w:tcMar>
-              <w:top w:w="40" w:type="dxa"/>
-              <w:bottom w:w="40" w:type="dxa"/>
+              <w:top w:w="45" w:type="dxa"/>
+              <w:bottom w:w="45" w:type="dxa"/>
               <w:left w:w="80" w:type="dxa"/>
               <w:right w:w="80" w:type="dxa"/>
             </w:tcMar>
@@ -2685,7 +2698,7 @@
               <w:rPr>
                 <w:rFonts w:ascii="Calibri" w:hAnsi="Calibri"/>
                 <w:b/>
-                <w:color w:val="2C2C2C"/>
+                <w:color w:val="0C2340"/>
                 <w:sz w:val="16"/>
               </w:rPr>
               <w:t>CAR-T leukapheresis &amp; shipment logistics</w:t>
@@ -2697,14 +2710,14 @@
             <w:tcW w:type="dxa" w:w="3249"/>
             <w:shd w:fill="FFFFFF"/>
             <w:tcBorders>
-              <w:top w:val="single" w:sz="2" w:space="0" w:color="CCCCCC"/>
-              <w:bottom w:val="single" w:sz="2" w:space="0" w:color="CCCCCC"/>
-              <w:left w:val="single" w:sz="2" w:space="0" w:color="CCCCCC"/>
-              <w:right w:val="single" w:sz="2" w:space="0" w:color="CCCCCC"/>
+              <w:top w:val="single" w:sz="2" w:space="0" w:color="D8D8D8"/>
+              <w:bottom w:val="single" w:sz="2" w:space="0" w:color="D8D8D8"/>
+              <w:left w:val="single" w:sz="2" w:space="0" w:color="D8D8D8"/>
+              <w:right w:val="single" w:sz="2" w:space="0" w:color="D8D8D8"/>
             </w:tcBorders>
             <w:tcMar>
-              <w:top w:w="40" w:type="dxa"/>
-              <w:bottom w:w="40" w:type="dxa"/>
+              <w:top w:w="45" w:type="dxa"/>
+              <w:bottom w:w="45" w:type="dxa"/>
               <w:left w:w="80" w:type="dxa"/>
               <w:right w:w="80" w:type="dxa"/>
             </w:tcMar>
@@ -2717,7 +2730,7 @@
             <w:r>
               <w:rPr>
                 <w:rFonts w:ascii="Calibri" w:hAnsi="Calibri"/>
-                <w:color w:val="2C2C2C"/>
+                <w:color w:val="333333"/>
                 <w:sz w:val="16"/>
               </w:rPr>
               <w:t>Likely gap</w:t>
@@ -2729,14 +2742,14 @@
             <w:tcW w:type="dxa" w:w="3249"/>
             <w:shd w:fill="FFFFFF"/>
             <w:tcBorders>
-              <w:top w:val="single" w:sz="2" w:space="0" w:color="CCCCCC"/>
-              <w:bottom w:val="single" w:sz="2" w:space="0" w:color="CCCCCC"/>
-              <w:left w:val="single" w:sz="2" w:space="0" w:color="CCCCCC"/>
-              <w:right w:val="single" w:sz="2" w:space="0" w:color="CCCCCC"/>
+              <w:top w:val="single" w:sz="2" w:space="0" w:color="D8D8D8"/>
+              <w:bottom w:val="single" w:sz="2" w:space="0" w:color="D8D8D8"/>
+              <w:left w:val="single" w:sz="2" w:space="0" w:color="D8D8D8"/>
+              <w:right w:val="single" w:sz="2" w:space="0" w:color="D8D8D8"/>
             </w:tcBorders>
             <w:tcMar>
-              <w:top w:w="40" w:type="dxa"/>
-              <w:bottom w:w="40" w:type="dxa"/>
+              <w:top w:w="45" w:type="dxa"/>
+              <w:bottom w:w="45" w:type="dxa"/>
               <w:left w:w="80" w:type="dxa"/>
               <w:right w:w="80" w:type="dxa"/>
             </w:tcMar>
@@ -2749,7 +2762,7 @@
             <w:r>
               <w:rPr>
                 <w:rFonts w:ascii="Calibri" w:hAnsi="Calibri"/>
-                <w:color w:val="2C2C2C"/>
+                <w:color w:val="333333"/>
                 <w:sz w:val="16"/>
               </w:rPr>
               <w:t>Amend contract — new service category required</w:t>
@@ -2761,16 +2774,16 @@
         <w:tc>
           <w:tcPr>
             <w:tcW w:type="dxa" w:w="3249"/>
-            <w:shd w:fill="F5F7F8"/>
+            <w:shd w:fill="F4F7F8"/>
             <w:tcBorders>
-              <w:top w:val="single" w:sz="2" w:space="0" w:color="CCCCCC"/>
-              <w:bottom w:val="single" w:sz="2" w:space="0" w:color="CCCCCC"/>
-              <w:left w:val="single" w:sz="2" w:space="0" w:color="CCCCCC"/>
-              <w:right w:val="single" w:sz="2" w:space="0" w:color="CCCCCC"/>
+              <w:top w:val="single" w:sz="2" w:space="0" w:color="D8D8D8"/>
+              <w:bottom w:val="single" w:sz="2" w:space="0" w:color="D8D8D8"/>
+              <w:left w:val="single" w:sz="2" w:space="0" w:color="D8D8D8"/>
+              <w:right w:val="single" w:sz="2" w:space="0" w:color="D8D8D8"/>
             </w:tcBorders>
             <w:tcMar>
-              <w:top w:w="40" w:type="dxa"/>
-              <w:bottom w:w="40" w:type="dxa"/>
+              <w:top w:w="45" w:type="dxa"/>
+              <w:bottom w:w="45" w:type="dxa"/>
               <w:left w:w="80" w:type="dxa"/>
               <w:right w:w="80" w:type="dxa"/>
             </w:tcMar>
@@ -2784,7 +2797,7 @@
               <w:rPr>
                 <w:rFonts w:ascii="Calibri" w:hAnsi="Calibri"/>
                 <w:b/>
-                <w:color w:val="2C2C2C"/>
+                <w:color w:val="0C2340"/>
                 <w:sz w:val="16"/>
               </w:rPr>
               <w:t>Allogeneic donor collections</w:t>
@@ -2794,16 +2807,16 @@
         <w:tc>
           <w:tcPr>
             <w:tcW w:type="dxa" w:w="3249"/>
-            <w:shd w:fill="F5F7F8"/>
+            <w:shd w:fill="F4F7F8"/>
             <w:tcBorders>
-              <w:top w:val="single" w:sz="2" w:space="0" w:color="CCCCCC"/>
-              <w:bottom w:val="single" w:sz="2" w:space="0" w:color="CCCCCC"/>
-              <w:left w:val="single" w:sz="2" w:space="0" w:color="CCCCCC"/>
-              <w:right w:val="single" w:sz="2" w:space="0" w:color="CCCCCC"/>
+              <w:top w:val="single" w:sz="2" w:space="0" w:color="D8D8D8"/>
+              <w:bottom w:val="single" w:sz="2" w:space="0" w:color="D8D8D8"/>
+              <w:left w:val="single" w:sz="2" w:space="0" w:color="D8D8D8"/>
+              <w:right w:val="single" w:sz="2" w:space="0" w:color="D8D8D8"/>
             </w:tcBorders>
             <w:tcMar>
-              <w:top w:w="40" w:type="dxa"/>
-              <w:bottom w:w="40" w:type="dxa"/>
+              <w:top w:w="45" w:type="dxa"/>
+              <w:bottom w:w="45" w:type="dxa"/>
               <w:left w:w="80" w:type="dxa"/>
               <w:right w:w="80" w:type="dxa"/>
             </w:tcMar>
@@ -2816,7 +2829,7 @@
             <w:r>
               <w:rPr>
                 <w:rFonts w:ascii="Calibri" w:hAnsi="Calibri"/>
-                <w:color w:val="2C2C2C"/>
+                <w:color w:val="333333"/>
                 <w:sz w:val="16"/>
               </w:rPr>
               <w:t>Plan ahead</w:t>
@@ -2826,16 +2839,16 @@
         <w:tc>
           <w:tcPr>
             <w:tcW w:type="dxa" w:w="3249"/>
-            <w:shd w:fill="F5F7F8"/>
+            <w:shd w:fill="F4F7F8"/>
             <w:tcBorders>
-              <w:top w:val="single" w:sz="2" w:space="0" w:color="CCCCCC"/>
-              <w:bottom w:val="single" w:sz="2" w:space="0" w:color="CCCCCC"/>
-              <w:left w:val="single" w:sz="2" w:space="0" w:color="CCCCCC"/>
-              <w:right w:val="single" w:sz="2" w:space="0" w:color="CCCCCC"/>
+              <w:top w:val="single" w:sz="2" w:space="0" w:color="D8D8D8"/>
+              <w:bottom w:val="single" w:sz="2" w:space="0" w:color="D8D8D8"/>
+              <w:left w:val="single" w:sz="2" w:space="0" w:color="D8D8D8"/>
+              <w:right w:val="single" w:sz="2" w:space="0" w:color="D8D8D8"/>
             </w:tcBorders>
             <w:tcMar>
-              <w:top w:w="40" w:type="dxa"/>
-              <w:bottom w:w="40" w:type="dxa"/>
+              <w:top w:w="45" w:type="dxa"/>
+              <w:bottom w:w="45" w:type="dxa"/>
               <w:left w:w="80" w:type="dxa"/>
               <w:right w:w="80" w:type="dxa"/>
             </w:tcMar>
@@ -2848,7 +2861,7 @@
             <w:r>
               <w:rPr>
                 <w:rFonts w:ascii="Calibri" w:hAnsi="Calibri"/>
-                <w:color w:val="2C2C2C"/>
+                <w:color w:val="333333"/>
                 <w:sz w:val="16"/>
               </w:rPr>
               <w:t>Amendment needed by Year 2 (2028)</w:t>
@@ -2862,14 +2875,14 @@
             <w:tcW w:type="dxa" w:w="3249"/>
             <w:shd w:fill="FFFFFF"/>
             <w:tcBorders>
-              <w:top w:val="single" w:sz="2" w:space="0" w:color="CCCCCC"/>
-              <w:bottom w:val="single" w:sz="2" w:space="0" w:color="CCCCCC"/>
-              <w:left w:val="single" w:sz="2" w:space="0" w:color="CCCCCC"/>
-              <w:right w:val="single" w:sz="2" w:space="0" w:color="CCCCCC"/>
+              <w:top w:val="single" w:sz="2" w:space="0" w:color="D8D8D8"/>
+              <w:bottom w:val="single" w:sz="2" w:space="0" w:color="D8D8D8"/>
+              <w:left w:val="single" w:sz="2" w:space="0" w:color="D8D8D8"/>
+              <w:right w:val="single" w:sz="2" w:space="0" w:color="D8D8D8"/>
             </w:tcBorders>
             <w:tcMar>
-              <w:top w:w="40" w:type="dxa"/>
-              <w:bottom w:w="40" w:type="dxa"/>
+              <w:top w:w="45" w:type="dxa"/>
+              <w:bottom w:w="45" w:type="dxa"/>
               <w:left w:w="80" w:type="dxa"/>
               <w:right w:w="80" w:type="dxa"/>
             </w:tcMar>
@@ -2883,7 +2896,7 @@
               <w:rPr>
                 <w:rFonts w:ascii="Calibri" w:hAnsi="Calibri"/>
                 <w:b/>
-                <w:color w:val="2C2C2C"/>
+                <w:color w:val="0C2340"/>
                 <w:sz w:val="16"/>
               </w:rPr>
               <w:t>Capacity guarantees &amp; turnaround SLA</w:t>
@@ -2895,14 +2908,14 @@
             <w:tcW w:type="dxa" w:w="3249"/>
             <w:shd w:fill="FFFFFF"/>
             <w:tcBorders>
-              <w:top w:val="single" w:sz="2" w:space="0" w:color="CCCCCC"/>
-              <w:bottom w:val="single" w:sz="2" w:space="0" w:color="CCCCCC"/>
-              <w:left w:val="single" w:sz="2" w:space="0" w:color="CCCCCC"/>
-              <w:right w:val="single" w:sz="2" w:space="0" w:color="CCCCCC"/>
+              <w:top w:val="single" w:sz="2" w:space="0" w:color="D8D8D8"/>
+              <w:bottom w:val="single" w:sz="2" w:space="0" w:color="D8D8D8"/>
+              <w:left w:val="single" w:sz="2" w:space="0" w:color="D8D8D8"/>
+              <w:right w:val="single" w:sz="2" w:space="0" w:color="D8D8D8"/>
             </w:tcBorders>
             <w:tcMar>
-              <w:top w:w="40" w:type="dxa"/>
-              <w:bottom w:w="40" w:type="dxa"/>
+              <w:top w:w="45" w:type="dxa"/>
+              <w:bottom w:w="45" w:type="dxa"/>
               <w:left w:w="80" w:type="dxa"/>
               <w:right w:w="80" w:type="dxa"/>
             </w:tcMar>
@@ -2915,7 +2928,7 @@
             <w:r>
               <w:rPr>
                 <w:rFonts w:ascii="Calibri" w:hAnsi="Calibri"/>
-                <w:color w:val="2C2C2C"/>
+                <w:color w:val="333333"/>
                 <w:sz w:val="16"/>
               </w:rPr>
               <w:t>Critical</w:t>
@@ -2927,14 +2940,14 @@
             <w:tcW w:type="dxa" w:w="3249"/>
             <w:shd w:fill="FFFFFF"/>
             <w:tcBorders>
-              <w:top w:val="single" w:sz="2" w:space="0" w:color="CCCCCC"/>
-              <w:bottom w:val="single" w:sz="2" w:space="0" w:color="CCCCCC"/>
-              <w:left w:val="single" w:sz="2" w:space="0" w:color="CCCCCC"/>
-              <w:right w:val="single" w:sz="2" w:space="0" w:color="CCCCCC"/>
+              <w:top w:val="single" w:sz="2" w:space="0" w:color="D8D8D8"/>
+              <w:bottom w:val="single" w:sz="2" w:space="0" w:color="D8D8D8"/>
+              <w:left w:val="single" w:sz="2" w:space="0" w:color="D8D8D8"/>
+              <w:right w:val="single" w:sz="2" w:space="0" w:color="D8D8D8"/>
             </w:tcBorders>
             <w:tcMar>
-              <w:top w:w="40" w:type="dxa"/>
-              <w:bottom w:w="40" w:type="dxa"/>
+              <w:top w:w="45" w:type="dxa"/>
+              <w:bottom w:w="45" w:type="dxa"/>
               <w:left w:w="80" w:type="dxa"/>
               <w:right w:w="80" w:type="dxa"/>
             </w:tcMar>
@@ -2947,7 +2960,7 @@
             <w:r>
               <w:rPr>
                 <w:rFonts w:ascii="Calibri" w:hAnsi="Calibri"/>
-                <w:color w:val="2C2C2C"/>
+                <w:color w:val="333333"/>
                 <w:sz w:val="16"/>
               </w:rPr>
               <w:t>Must guarantee slots for emergent collections</w:t>
@@ -2959,16 +2972,16 @@
         <w:tc>
           <w:tcPr>
             <w:tcW w:type="dxa" w:w="3249"/>
-            <w:shd w:fill="F5F7F8"/>
+            <w:shd w:fill="F4F7F8"/>
             <w:tcBorders>
-              <w:top w:val="single" w:sz="2" w:space="0" w:color="CCCCCC"/>
-              <w:bottom w:val="single" w:sz="2" w:space="0" w:color="CCCCCC"/>
-              <w:left w:val="single" w:sz="2" w:space="0" w:color="CCCCCC"/>
-              <w:right w:val="single" w:sz="2" w:space="0" w:color="CCCCCC"/>
+              <w:top w:val="single" w:sz="2" w:space="0" w:color="D8D8D8"/>
+              <w:bottom w:val="single" w:sz="2" w:space="0" w:color="D8D8D8"/>
+              <w:left w:val="single" w:sz="2" w:space="0" w:color="D8D8D8"/>
+              <w:right w:val="single" w:sz="2" w:space="0" w:color="D8D8D8"/>
             </w:tcBorders>
             <w:tcMar>
-              <w:top w:w="40" w:type="dxa"/>
-              <w:bottom w:w="40" w:type="dxa"/>
+              <w:top w:w="45" w:type="dxa"/>
+              <w:bottom w:w="45" w:type="dxa"/>
               <w:left w:w="80" w:type="dxa"/>
               <w:right w:w="80" w:type="dxa"/>
             </w:tcMar>
@@ -2982,7 +2995,7 @@
               <w:rPr>
                 <w:rFonts w:ascii="Calibri" w:hAnsi="Calibri"/>
                 <w:b/>
-                <w:color w:val="2C2C2C"/>
+                <w:color w:val="0C2340"/>
                 <w:sz w:val="16"/>
               </w:rPr>
               <w:t>Volume-based pricing</w:t>
@@ -2992,16 +3005,16 @@
         <w:tc>
           <w:tcPr>
             <w:tcW w:type="dxa" w:w="3249"/>
-            <w:shd w:fill="F5F7F8"/>
+            <w:shd w:fill="F4F7F8"/>
             <w:tcBorders>
-              <w:top w:val="single" w:sz="2" w:space="0" w:color="CCCCCC"/>
-              <w:bottom w:val="single" w:sz="2" w:space="0" w:color="CCCCCC"/>
-              <w:left w:val="single" w:sz="2" w:space="0" w:color="CCCCCC"/>
-              <w:right w:val="single" w:sz="2" w:space="0" w:color="CCCCCC"/>
+              <w:top w:val="single" w:sz="2" w:space="0" w:color="D8D8D8"/>
+              <w:bottom w:val="single" w:sz="2" w:space="0" w:color="D8D8D8"/>
+              <w:left w:val="single" w:sz="2" w:space="0" w:color="D8D8D8"/>
+              <w:right w:val="single" w:sz="2" w:space="0" w:color="D8D8D8"/>
             </w:tcBorders>
             <w:tcMar>
-              <w:top w:w="40" w:type="dxa"/>
-              <w:bottom w:w="40" w:type="dxa"/>
+              <w:top w:w="45" w:type="dxa"/>
+              <w:bottom w:w="45" w:type="dxa"/>
               <w:left w:w="80" w:type="dxa"/>
               <w:right w:w="80" w:type="dxa"/>
             </w:tcMar>
@@ -3014,7 +3027,7 @@
             <w:r>
               <w:rPr>
                 <w:rFonts w:ascii="Calibri" w:hAnsi="Calibri"/>
-                <w:color w:val="2C2C2C"/>
+                <w:color w:val="333333"/>
                 <w:sz w:val="16"/>
               </w:rPr>
               <w:t>Discuss</w:t>
@@ -3024,16 +3037,16 @@
         <w:tc>
           <w:tcPr>
             <w:tcW w:type="dxa" w:w="3249"/>
-            <w:shd w:fill="F5F7F8"/>
+            <w:shd w:fill="F4F7F8"/>
             <w:tcBorders>
-              <w:top w:val="single" w:sz="2" w:space="0" w:color="CCCCCC"/>
-              <w:bottom w:val="single" w:sz="2" w:space="0" w:color="CCCCCC"/>
-              <w:left w:val="single" w:sz="2" w:space="0" w:color="CCCCCC"/>
-              <w:right w:val="single" w:sz="2" w:space="0" w:color="CCCCCC"/>
+              <w:top w:val="single" w:sz="2" w:space="0" w:color="D8D8D8"/>
+              <w:bottom w:val="single" w:sz="2" w:space="0" w:color="D8D8D8"/>
+              <w:left w:val="single" w:sz="2" w:space="0" w:color="D8D8D8"/>
+              <w:right w:val="single" w:sz="2" w:space="0" w:color="D8D8D8"/>
             </w:tcBorders>
             <w:tcMar>
-              <w:top w:w="40" w:type="dxa"/>
-              <w:bottom w:w="40" w:type="dxa"/>
+              <w:top w:w="45" w:type="dxa"/>
+              <w:bottom w:w="45" w:type="dxa"/>
               <w:left w:w="80" w:type="dxa"/>
               <w:right w:w="80" w:type="dxa"/>
             </w:tcMar>
@@ -3061,7 +3074,7 @@
         <w:rPr>
           <w:rFonts w:ascii="Calibri" w:hAnsi="Calibri"/>
           <w:b/>
-          <w:color w:val="007B7F"/>
+          <w:color w:val="C4A35A"/>
           <w:sz w:val="18"/>
         </w:rPr>
         <w:t xml:space="preserve">05  </w:t>
@@ -3070,7 +3083,7 @@
         <w:rPr>
           <w:rFonts w:ascii="Calibri" w:hAnsi="Calibri"/>
           <w:b/>
-          <w:color w:val="1B2A4A"/>
+          <w:color w:val="0C2340"/>
           <w:sz w:val="26"/>
         </w:rPr>
         <w:t>WHY VOLUME IS GROWING</w:t>
@@ -3079,7 +3092,7 @@
     <w:p>
       <w:pPr>
         <w:pBdr>
-          <w:bottom w:val="single" w:sz="6" w:space="1" w:color="007B7F"/>
+          <w:bottom w:val="single" w:sz="6" w:space="1" w:color="C4A35A"/>
         </w:pBdr>
       </w:pPr>
     </w:p>
@@ -3088,7 +3101,7 @@
         <w:rPr>
           <w:rFonts w:ascii="Calibri" w:hAnsi="Calibri"/>
           <w:b w:val="0"/>
-          <w:color w:val="2C2C2C"/>
+          <w:color w:val="333333"/>
           <w:sz w:val="18"/>
         </w:rPr>
         <w:t>Puerto Rico currently has no on-island CAR-T program and limited transplant capacity. Most eligible patients travel to the US mainland or go untreated:</w:t>
@@ -3110,16 +3123,16 @@
         <w:tc>
           <w:tcPr>
             <w:tcW w:type="dxa" w:w="3249"/>
-            <w:shd w:fill="1B2A4A"/>
+            <w:shd w:fill="0C2340"/>
             <w:tcBorders>
-              <w:top w:val="single" w:sz="2" w:space="0" w:color="1B2A4A"/>
-              <w:bottom w:val="single" w:sz="2" w:space="0" w:color="1B2A4A"/>
-              <w:left w:val="single" w:sz="2" w:space="0" w:color="1B2A4A"/>
-              <w:right w:val="single" w:sz="2" w:space="0" w:color="1B2A4A"/>
+              <w:top w:val="single" w:sz="2" w:space="0" w:color="0C2340"/>
+              <w:bottom w:val="single" w:sz="2" w:space="0" w:color="0C2340"/>
+              <w:left w:val="single" w:sz="2" w:space="0" w:color="0C2340"/>
+              <w:right w:val="single" w:sz="2" w:space="0" w:color="0C2340"/>
             </w:tcBorders>
             <w:tcMar>
-              <w:top w:w="40" w:type="dxa"/>
-              <w:bottom w:w="40" w:type="dxa"/>
+              <w:top w:w="45" w:type="dxa"/>
+              <w:bottom w:w="45" w:type="dxa"/>
               <w:left w:w="80" w:type="dxa"/>
               <w:right w:w="80" w:type="dxa"/>
             </w:tcMar>
@@ -3143,16 +3156,16 @@
         <w:tc>
           <w:tcPr>
             <w:tcW w:type="dxa" w:w="3249"/>
-            <w:shd w:fill="1B2A4A"/>
+            <w:shd w:fill="0C2340"/>
             <w:tcBorders>
-              <w:top w:val="single" w:sz="2" w:space="0" w:color="1B2A4A"/>
-              <w:bottom w:val="single" w:sz="2" w:space="0" w:color="1B2A4A"/>
-              <w:left w:val="single" w:sz="2" w:space="0" w:color="1B2A4A"/>
-              <w:right w:val="single" w:sz="2" w:space="0" w:color="1B2A4A"/>
+              <w:top w:val="single" w:sz="2" w:space="0" w:color="0C2340"/>
+              <w:bottom w:val="single" w:sz="2" w:space="0" w:color="0C2340"/>
+              <w:left w:val="single" w:sz="2" w:space="0" w:color="0C2340"/>
+              <w:right w:val="single" w:sz="2" w:space="0" w:color="0C2340"/>
             </w:tcBorders>
             <w:tcMar>
-              <w:top w:w="40" w:type="dxa"/>
-              <w:bottom w:w="40" w:type="dxa"/>
+              <w:top w:w="45" w:type="dxa"/>
+              <w:bottom w:w="45" w:type="dxa"/>
               <w:left w:w="80" w:type="dxa"/>
               <w:right w:w="80" w:type="dxa"/>
             </w:tcMar>
@@ -3176,16 +3189,16 @@
         <w:tc>
           <w:tcPr>
             <w:tcW w:type="dxa" w:w="3249"/>
-            <w:shd w:fill="1B2A4A"/>
+            <w:shd w:fill="0C2340"/>
             <w:tcBorders>
-              <w:top w:val="single" w:sz="2" w:space="0" w:color="1B2A4A"/>
-              <w:bottom w:val="single" w:sz="2" w:space="0" w:color="1B2A4A"/>
-              <w:left w:val="single" w:sz="2" w:space="0" w:color="1B2A4A"/>
-              <w:right w:val="single" w:sz="2" w:space="0" w:color="1B2A4A"/>
+              <w:top w:val="single" w:sz="2" w:space="0" w:color="0C2340"/>
+              <w:bottom w:val="single" w:sz="2" w:space="0" w:color="0C2340"/>
+              <w:left w:val="single" w:sz="2" w:space="0" w:color="0C2340"/>
+              <w:right w:val="single" w:sz="2" w:space="0" w:color="0C2340"/>
             </w:tcBorders>
             <w:tcMar>
-              <w:top w:w="40" w:type="dxa"/>
-              <w:bottom w:w="40" w:type="dxa"/>
+              <w:top w:w="45" w:type="dxa"/>
+              <w:bottom w:w="45" w:type="dxa"/>
               <w:left w:w="80" w:type="dxa"/>
               <w:right w:w="80" w:type="dxa"/>
             </w:tcMar>
@@ -3202,7 +3215,7 @@
                 <w:color w:val="FFFFFF"/>
                 <w:sz w:val="16"/>
               </w:rPr>
-              <w:t>With OncoCel (Year 5)</w:t>
+              <w:t>With TCT/OncoCel (Year 5)</w:t>
             </w:r>
           </w:p>
         </w:tc>
@@ -3211,16 +3224,16 @@
         <w:tc>
           <w:tcPr>
             <w:tcW w:type="dxa" w:w="3249"/>
-            <w:shd w:fill="E8F4F0"/>
+            <w:shd w:fill="E6F2F2"/>
             <w:tcBorders>
-              <w:top w:val="single" w:sz="2" w:space="0" w:color="CCCCCC"/>
-              <w:bottom w:val="single" w:sz="2" w:space="0" w:color="CCCCCC"/>
-              <w:left w:val="single" w:sz="2" w:space="0" w:color="CCCCCC"/>
-              <w:right w:val="single" w:sz="2" w:space="0" w:color="CCCCCC"/>
+              <w:top w:val="single" w:sz="2" w:space="0" w:color="D8D8D8"/>
+              <w:bottom w:val="single" w:sz="2" w:space="0" w:color="D8D8D8"/>
+              <w:left w:val="single" w:sz="2" w:space="0" w:color="D8D8D8"/>
+              <w:right w:val="single" w:sz="2" w:space="0" w:color="D8D8D8"/>
             </w:tcBorders>
             <w:tcMar>
-              <w:top w:w="40" w:type="dxa"/>
-              <w:bottom w:w="40" w:type="dxa"/>
+              <w:top w:w="45" w:type="dxa"/>
+              <w:bottom w:w="45" w:type="dxa"/>
               <w:left w:w="80" w:type="dxa"/>
               <w:right w:w="80" w:type="dxa"/>
             </w:tcMar>
@@ -3234,26 +3247,26 @@
               <w:rPr>
                 <w:rFonts w:ascii="Calibri" w:hAnsi="Calibri"/>
                 <w:b/>
-                <w:color w:val="007B7F"/>
+                <w:color w:val="007C8A"/>
                 <w:sz w:val="16"/>
               </w:rPr>
-              <w:t>Auto SCT performed on-island/year</w:t>
+              <w:t>Auto SCT on-island / year</w:t>
             </w:r>
           </w:p>
         </w:tc>
         <w:tc>
           <w:tcPr>
             <w:tcW w:type="dxa" w:w="3249"/>
-            <w:shd w:fill="E8F4F0"/>
+            <w:shd w:fill="E6F2F2"/>
             <w:tcBorders>
-              <w:top w:val="single" w:sz="2" w:space="0" w:color="CCCCCC"/>
-              <w:bottom w:val="single" w:sz="2" w:space="0" w:color="CCCCCC"/>
-              <w:left w:val="single" w:sz="2" w:space="0" w:color="CCCCCC"/>
-              <w:right w:val="single" w:sz="2" w:space="0" w:color="CCCCCC"/>
+              <w:top w:val="single" w:sz="2" w:space="0" w:color="D8D8D8"/>
+              <w:bottom w:val="single" w:sz="2" w:space="0" w:color="D8D8D8"/>
+              <w:left w:val="single" w:sz="2" w:space="0" w:color="D8D8D8"/>
+              <w:right w:val="single" w:sz="2" w:space="0" w:color="D8D8D8"/>
             </w:tcBorders>
             <w:tcMar>
-              <w:top w:w="40" w:type="dxa"/>
-              <w:bottom w:w="40" w:type="dxa"/>
+              <w:top w:w="45" w:type="dxa"/>
+              <w:bottom w:w="45" w:type="dxa"/>
               <w:left w:w="80" w:type="dxa"/>
               <w:right w:w="80" w:type="dxa"/>
             </w:tcMar>
@@ -3267,26 +3280,26 @@
               <w:rPr>
                 <w:rFonts w:ascii="Calibri" w:hAnsi="Calibri"/>
                 <w:b/>
-                <w:color w:val="007B7F"/>
+                <w:color w:val="007C8A"/>
                 <w:sz w:val="16"/>
               </w:rPr>
-              <w:t>20-35</w:t>
+              <w:t>20–35</w:t>
             </w:r>
           </w:p>
         </w:tc>
         <w:tc>
           <w:tcPr>
             <w:tcW w:type="dxa" w:w="3249"/>
-            <w:shd w:fill="E8F4F0"/>
+            <w:shd w:fill="E6F2F2"/>
             <w:tcBorders>
-              <w:top w:val="single" w:sz="2" w:space="0" w:color="CCCCCC"/>
-              <w:bottom w:val="single" w:sz="2" w:space="0" w:color="CCCCCC"/>
-              <w:left w:val="single" w:sz="2" w:space="0" w:color="CCCCCC"/>
-              <w:right w:val="single" w:sz="2" w:space="0" w:color="CCCCCC"/>
+              <w:top w:val="single" w:sz="2" w:space="0" w:color="D8D8D8"/>
+              <w:bottom w:val="single" w:sz="2" w:space="0" w:color="D8D8D8"/>
+              <w:left w:val="single" w:sz="2" w:space="0" w:color="D8D8D8"/>
+              <w:right w:val="single" w:sz="2" w:space="0" w:color="D8D8D8"/>
             </w:tcBorders>
             <w:tcMar>
-              <w:top w:w="40" w:type="dxa"/>
-              <w:bottom w:w="40" w:type="dxa"/>
+              <w:top w:w="45" w:type="dxa"/>
+              <w:bottom w:w="45" w:type="dxa"/>
               <w:left w:w="80" w:type="dxa"/>
               <w:right w:w="80" w:type="dxa"/>
             </w:tcMar>
@@ -3300,10 +3313,10 @@
               <w:rPr>
                 <w:rFonts w:ascii="Calibri" w:hAnsi="Calibri"/>
                 <w:b/>
-                <w:color w:val="007B7F"/>
+                <w:color w:val="007C8A"/>
                 <w:sz w:val="16"/>
               </w:rPr>
-              <w:t>62-83</w:t>
+              <w:t>62–83</w:t>
             </w:r>
           </w:p>
         </w:tc>
@@ -3312,16 +3325,16 @@
         <w:tc>
           <w:tcPr>
             <w:tcW w:type="dxa" w:w="3249"/>
-            <w:shd w:fill="E8F4F0"/>
+            <w:shd w:fill="E6F2F2"/>
             <w:tcBorders>
-              <w:top w:val="single" w:sz="2" w:space="0" w:color="CCCCCC"/>
-              <w:bottom w:val="single" w:sz="2" w:space="0" w:color="CCCCCC"/>
-              <w:left w:val="single" w:sz="2" w:space="0" w:color="CCCCCC"/>
-              <w:right w:val="single" w:sz="2" w:space="0" w:color="CCCCCC"/>
+              <w:top w:val="single" w:sz="2" w:space="0" w:color="D8D8D8"/>
+              <w:bottom w:val="single" w:sz="2" w:space="0" w:color="D8D8D8"/>
+              <w:left w:val="single" w:sz="2" w:space="0" w:color="D8D8D8"/>
+              <w:right w:val="single" w:sz="2" w:space="0" w:color="D8D8D8"/>
             </w:tcBorders>
             <w:tcMar>
-              <w:top w:w="40" w:type="dxa"/>
-              <w:bottom w:w="40" w:type="dxa"/>
+              <w:top w:w="45" w:type="dxa"/>
+              <w:bottom w:w="45" w:type="dxa"/>
               <w:left w:w="80" w:type="dxa"/>
               <w:right w:w="80" w:type="dxa"/>
             </w:tcMar>
@@ -3335,26 +3348,26 @@
               <w:rPr>
                 <w:rFonts w:ascii="Calibri" w:hAnsi="Calibri"/>
                 <w:b/>
-                <w:color w:val="007B7F"/>
+                <w:color w:val="007C8A"/>
                 <w:sz w:val="16"/>
               </w:rPr>
-              <w:t>Allo-HSCT performed on-island/year</w:t>
+              <w:t>Allo-HSCT on-island / year</w:t>
             </w:r>
           </w:p>
         </w:tc>
         <w:tc>
           <w:tcPr>
             <w:tcW w:type="dxa" w:w="3249"/>
-            <w:shd w:fill="E8F4F0"/>
+            <w:shd w:fill="E6F2F2"/>
             <w:tcBorders>
-              <w:top w:val="single" w:sz="2" w:space="0" w:color="CCCCCC"/>
-              <w:bottom w:val="single" w:sz="2" w:space="0" w:color="CCCCCC"/>
-              <w:left w:val="single" w:sz="2" w:space="0" w:color="CCCCCC"/>
-              <w:right w:val="single" w:sz="2" w:space="0" w:color="CCCCCC"/>
+              <w:top w:val="single" w:sz="2" w:space="0" w:color="D8D8D8"/>
+              <w:bottom w:val="single" w:sz="2" w:space="0" w:color="D8D8D8"/>
+              <w:left w:val="single" w:sz="2" w:space="0" w:color="D8D8D8"/>
+              <w:right w:val="single" w:sz="2" w:space="0" w:color="D8D8D8"/>
             </w:tcBorders>
             <w:tcMar>
-              <w:top w:w="40" w:type="dxa"/>
-              <w:bottom w:w="40" w:type="dxa"/>
+              <w:top w:w="45" w:type="dxa"/>
+              <w:bottom w:w="45" w:type="dxa"/>
               <w:left w:w="80" w:type="dxa"/>
               <w:right w:w="80" w:type="dxa"/>
             </w:tcMar>
@@ -3368,26 +3381,26 @@
               <w:rPr>
                 <w:rFonts w:ascii="Calibri" w:hAnsi="Calibri"/>
                 <w:b/>
-                <w:color w:val="007B7F"/>
+                <w:color w:val="007C8A"/>
                 <w:sz w:val="16"/>
               </w:rPr>
-              <w:t>8-15</w:t>
+              <w:t>8–15</w:t>
             </w:r>
           </w:p>
         </w:tc>
         <w:tc>
           <w:tcPr>
             <w:tcW w:type="dxa" w:w="3249"/>
-            <w:shd w:fill="E8F4F0"/>
+            <w:shd w:fill="E6F2F2"/>
             <w:tcBorders>
-              <w:top w:val="single" w:sz="2" w:space="0" w:color="CCCCCC"/>
-              <w:bottom w:val="single" w:sz="2" w:space="0" w:color="CCCCCC"/>
-              <w:left w:val="single" w:sz="2" w:space="0" w:color="CCCCCC"/>
-              <w:right w:val="single" w:sz="2" w:space="0" w:color="CCCCCC"/>
+              <w:top w:val="single" w:sz="2" w:space="0" w:color="D8D8D8"/>
+              <w:bottom w:val="single" w:sz="2" w:space="0" w:color="D8D8D8"/>
+              <w:left w:val="single" w:sz="2" w:space="0" w:color="D8D8D8"/>
+              <w:right w:val="single" w:sz="2" w:space="0" w:color="D8D8D8"/>
             </w:tcBorders>
             <w:tcMar>
-              <w:top w:w="40" w:type="dxa"/>
-              <w:bottom w:w="40" w:type="dxa"/>
+              <w:top w:w="45" w:type="dxa"/>
+              <w:bottom w:w="45" w:type="dxa"/>
               <w:left w:w="80" w:type="dxa"/>
               <w:right w:w="80" w:type="dxa"/>
             </w:tcMar>
@@ -3401,10 +3414,10 @@
               <w:rPr>
                 <w:rFonts w:ascii="Calibri" w:hAnsi="Calibri"/>
                 <w:b/>
-                <w:color w:val="007B7F"/>
+                <w:color w:val="007C8A"/>
                 <w:sz w:val="16"/>
               </w:rPr>
-              <w:t>25-38</w:t>
+              <w:t>25–38</w:t>
             </w:r>
           </w:p>
         </w:tc>
@@ -3413,16 +3426,16 @@
         <w:tc>
           <w:tcPr>
             <w:tcW w:type="dxa" w:w="3249"/>
-            <w:shd w:fill="E8F4F0"/>
+            <w:shd w:fill="E6F2F2"/>
             <w:tcBorders>
-              <w:top w:val="single" w:sz="2" w:space="0" w:color="CCCCCC"/>
-              <w:bottom w:val="single" w:sz="2" w:space="0" w:color="CCCCCC"/>
-              <w:left w:val="single" w:sz="2" w:space="0" w:color="CCCCCC"/>
-              <w:right w:val="single" w:sz="2" w:space="0" w:color="CCCCCC"/>
+              <w:top w:val="single" w:sz="2" w:space="0" w:color="D8D8D8"/>
+              <w:bottom w:val="single" w:sz="2" w:space="0" w:color="D8D8D8"/>
+              <w:left w:val="single" w:sz="2" w:space="0" w:color="D8D8D8"/>
+              <w:right w:val="single" w:sz="2" w:space="0" w:color="D8D8D8"/>
             </w:tcBorders>
             <w:tcMar>
-              <w:top w:w="40" w:type="dxa"/>
-              <w:bottom w:w="40" w:type="dxa"/>
+              <w:top w:w="45" w:type="dxa"/>
+              <w:bottom w:w="45" w:type="dxa"/>
               <w:left w:w="80" w:type="dxa"/>
               <w:right w:w="80" w:type="dxa"/>
             </w:tcMar>
@@ -3436,26 +3449,26 @@
               <w:rPr>
                 <w:rFonts w:ascii="Calibri" w:hAnsi="Calibri"/>
                 <w:b/>
-                <w:color w:val="007B7F"/>
+                <w:color w:val="007C8A"/>
                 <w:sz w:val="16"/>
               </w:rPr>
-              <w:t>CAR-T performed on-island/year</w:t>
+              <w:t>CAR-T on-island / year</w:t>
             </w:r>
           </w:p>
         </w:tc>
         <w:tc>
           <w:tcPr>
             <w:tcW w:type="dxa" w:w="3249"/>
-            <w:shd w:fill="E8F4F0"/>
+            <w:shd w:fill="E6F2F2"/>
             <w:tcBorders>
-              <w:top w:val="single" w:sz="2" w:space="0" w:color="CCCCCC"/>
-              <w:bottom w:val="single" w:sz="2" w:space="0" w:color="CCCCCC"/>
-              <w:left w:val="single" w:sz="2" w:space="0" w:color="CCCCCC"/>
-              <w:right w:val="single" w:sz="2" w:space="0" w:color="CCCCCC"/>
+              <w:top w:val="single" w:sz="2" w:space="0" w:color="D8D8D8"/>
+              <w:bottom w:val="single" w:sz="2" w:space="0" w:color="D8D8D8"/>
+              <w:left w:val="single" w:sz="2" w:space="0" w:color="D8D8D8"/>
+              <w:right w:val="single" w:sz="2" w:space="0" w:color="D8D8D8"/>
             </w:tcBorders>
             <w:tcMar>
-              <w:top w:w="40" w:type="dxa"/>
-              <w:bottom w:w="40" w:type="dxa"/>
+              <w:top w:w="45" w:type="dxa"/>
+              <w:bottom w:w="45" w:type="dxa"/>
               <w:left w:w="80" w:type="dxa"/>
               <w:right w:w="80" w:type="dxa"/>
             </w:tcMar>
@@ -3469,7 +3482,7 @@
               <w:rPr>
                 <w:rFonts w:ascii="Calibri" w:hAnsi="Calibri"/>
                 <w:b/>
-                <w:color w:val="007B7F"/>
+                <w:color w:val="007C8A"/>
                 <w:sz w:val="16"/>
               </w:rPr>
               <w:t>0</w:t>
@@ -3479,16 +3492,16 @@
         <w:tc>
           <w:tcPr>
             <w:tcW w:type="dxa" w:w="3249"/>
-            <w:shd w:fill="E8F4F0"/>
+            <w:shd w:fill="E6F2F2"/>
             <w:tcBorders>
-              <w:top w:val="single" w:sz="2" w:space="0" w:color="CCCCCC"/>
-              <w:bottom w:val="single" w:sz="2" w:space="0" w:color="CCCCCC"/>
-              <w:left w:val="single" w:sz="2" w:space="0" w:color="CCCCCC"/>
-              <w:right w:val="single" w:sz="2" w:space="0" w:color="CCCCCC"/>
+              <w:top w:val="single" w:sz="2" w:space="0" w:color="D8D8D8"/>
+              <w:bottom w:val="single" w:sz="2" w:space="0" w:color="D8D8D8"/>
+              <w:left w:val="single" w:sz="2" w:space="0" w:color="D8D8D8"/>
+              <w:right w:val="single" w:sz="2" w:space="0" w:color="D8D8D8"/>
             </w:tcBorders>
             <w:tcMar>
-              <w:top w:w="40" w:type="dxa"/>
-              <w:bottom w:w="40" w:type="dxa"/>
+              <w:top w:w="45" w:type="dxa"/>
+              <w:bottom w:w="45" w:type="dxa"/>
               <w:left w:w="80" w:type="dxa"/>
               <w:right w:w="80" w:type="dxa"/>
             </w:tcMar>
@@ -3502,10 +3515,10 @@
               <w:rPr>
                 <w:rFonts w:ascii="Calibri" w:hAnsi="Calibri"/>
                 <w:b/>
-                <w:color w:val="007B7F"/>
+                <w:color w:val="007C8A"/>
                 <w:sz w:val="16"/>
               </w:rPr>
-              <w:t>30-45</w:t>
+              <w:t>30–45</w:t>
             </w:r>
           </w:p>
         </w:tc>
@@ -3514,16 +3527,16 @@
         <w:tc>
           <w:tcPr>
             <w:tcW w:type="dxa" w:w="3249"/>
-            <w:shd w:fill="E8F4F0"/>
+            <w:shd w:fill="E6F2F2"/>
             <w:tcBorders>
-              <w:top w:val="single" w:sz="2" w:space="0" w:color="CCCCCC"/>
-              <w:bottom w:val="single" w:sz="2" w:space="0" w:color="CCCCCC"/>
-              <w:left w:val="single" w:sz="2" w:space="0" w:color="CCCCCC"/>
-              <w:right w:val="single" w:sz="2" w:space="0" w:color="CCCCCC"/>
+              <w:top w:val="single" w:sz="2" w:space="0" w:color="D8D8D8"/>
+              <w:bottom w:val="single" w:sz="2" w:space="0" w:color="D8D8D8"/>
+              <w:left w:val="single" w:sz="2" w:space="0" w:color="D8D8D8"/>
+              <w:right w:val="single" w:sz="2" w:space="0" w:color="D8D8D8"/>
             </w:tcBorders>
             <w:tcMar>
-              <w:top w:w="40" w:type="dxa"/>
-              <w:bottom w:w="40" w:type="dxa"/>
+              <w:top w:w="45" w:type="dxa"/>
+              <w:bottom w:w="45" w:type="dxa"/>
               <w:left w:w="80" w:type="dxa"/>
               <w:right w:w="80" w:type="dxa"/>
             </w:tcMar>
@@ -3537,26 +3550,26 @@
               <w:rPr>
                 <w:rFonts w:ascii="Calibri" w:hAnsi="Calibri"/>
                 <w:b/>
-                <w:color w:val="007B7F"/>
+                <w:color w:val="007C8A"/>
                 <w:sz w:val="16"/>
               </w:rPr>
-              <w:t>Total on-island cellular therapy cases</w:t>
+              <w:t>Total on-island cellular therapy</w:t>
             </w:r>
           </w:p>
         </w:tc>
         <w:tc>
           <w:tcPr>
             <w:tcW w:type="dxa" w:w="3249"/>
-            <w:shd w:fill="E8F4F0"/>
+            <w:shd w:fill="E6F2F2"/>
             <w:tcBorders>
-              <w:top w:val="single" w:sz="2" w:space="0" w:color="CCCCCC"/>
-              <w:bottom w:val="single" w:sz="2" w:space="0" w:color="CCCCCC"/>
-              <w:left w:val="single" w:sz="2" w:space="0" w:color="CCCCCC"/>
-              <w:right w:val="single" w:sz="2" w:space="0" w:color="CCCCCC"/>
+              <w:top w:val="single" w:sz="2" w:space="0" w:color="D8D8D8"/>
+              <w:bottom w:val="single" w:sz="2" w:space="0" w:color="D8D8D8"/>
+              <w:left w:val="single" w:sz="2" w:space="0" w:color="D8D8D8"/>
+              <w:right w:val="single" w:sz="2" w:space="0" w:color="D8D8D8"/>
             </w:tcBorders>
             <w:tcMar>
-              <w:top w:w="40" w:type="dxa"/>
-              <w:bottom w:w="40" w:type="dxa"/>
+              <w:top w:w="45" w:type="dxa"/>
+              <w:bottom w:w="45" w:type="dxa"/>
               <w:left w:w="80" w:type="dxa"/>
               <w:right w:w="80" w:type="dxa"/>
             </w:tcMar>
@@ -3570,26 +3583,26 @@
               <w:rPr>
                 <w:rFonts w:ascii="Calibri" w:hAnsi="Calibri"/>
                 <w:b/>
-                <w:color w:val="007B7F"/>
+                <w:color w:val="007C8A"/>
                 <w:sz w:val="16"/>
               </w:rPr>
-              <w:t>28-50</w:t>
+              <w:t>28–50</w:t>
             </w:r>
           </w:p>
         </w:tc>
         <w:tc>
           <w:tcPr>
             <w:tcW w:type="dxa" w:w="3249"/>
-            <w:shd w:fill="E8F4F0"/>
+            <w:shd w:fill="E6F2F2"/>
             <w:tcBorders>
-              <w:top w:val="single" w:sz="2" w:space="0" w:color="CCCCCC"/>
-              <w:bottom w:val="single" w:sz="2" w:space="0" w:color="CCCCCC"/>
-              <w:left w:val="single" w:sz="2" w:space="0" w:color="CCCCCC"/>
-              <w:right w:val="single" w:sz="2" w:space="0" w:color="CCCCCC"/>
+              <w:top w:val="single" w:sz="2" w:space="0" w:color="D8D8D8"/>
+              <w:bottom w:val="single" w:sz="2" w:space="0" w:color="D8D8D8"/>
+              <w:left w:val="single" w:sz="2" w:space="0" w:color="D8D8D8"/>
+              <w:right w:val="single" w:sz="2" w:space="0" w:color="D8D8D8"/>
             </w:tcBorders>
             <w:tcMar>
-              <w:top w:w="40" w:type="dxa"/>
-              <w:bottom w:w="40" w:type="dxa"/>
+              <w:top w:w="45" w:type="dxa"/>
+              <w:bottom w:w="45" w:type="dxa"/>
               <w:left w:w="80" w:type="dxa"/>
               <w:right w:w="80" w:type="dxa"/>
             </w:tcMar>
@@ -3603,10 +3616,10 @@
               <w:rPr>
                 <w:rFonts w:ascii="Calibri" w:hAnsi="Calibri"/>
                 <w:b/>
-                <w:color w:val="007B7F"/>
+                <w:color w:val="007C8A"/>
                 <w:sz w:val="16"/>
               </w:rPr>
-              <w:t>117-166</w:t>
+              <w:t>117–166</w:t>
             </w:r>
           </w:p>
         </w:tc>
@@ -3617,14 +3630,14 @@
             <w:tcW w:type="dxa" w:w="3249"/>
             <w:shd w:fill="FFFFFF"/>
             <w:tcBorders>
-              <w:top w:val="single" w:sz="2" w:space="0" w:color="CCCCCC"/>
-              <w:bottom w:val="single" w:sz="2" w:space="0" w:color="CCCCCC"/>
-              <w:left w:val="single" w:sz="2" w:space="0" w:color="CCCCCC"/>
-              <w:right w:val="single" w:sz="2" w:space="0" w:color="CCCCCC"/>
+              <w:top w:val="single" w:sz="2" w:space="0" w:color="D8D8D8"/>
+              <w:bottom w:val="single" w:sz="2" w:space="0" w:color="D8D8D8"/>
+              <w:left w:val="single" w:sz="2" w:space="0" w:color="D8D8D8"/>
+              <w:right w:val="single" w:sz="2" w:space="0" w:color="D8D8D8"/>
             </w:tcBorders>
             <w:tcMar>
-              <w:top w:w="40" w:type="dxa"/>
-              <w:bottom w:w="40" w:type="dxa"/>
+              <w:top w:w="45" w:type="dxa"/>
+              <w:bottom w:w="45" w:type="dxa"/>
               <w:left w:w="80" w:type="dxa"/>
               <w:right w:w="80" w:type="dxa"/>
             </w:tcMar>
@@ -3638,10 +3651,10 @@
               <w:rPr>
                 <w:rFonts w:ascii="Calibri" w:hAnsi="Calibri"/>
                 <w:b/>
-                <w:color w:val="2C2C2C"/>
+                <w:color w:val="0C2340"/>
                 <w:sz w:val="16"/>
               </w:rPr>
-              <w:t>Patients traveling to mainland/year</w:t>
+              <w:t>Patients traveling to mainland</w:t>
             </w:r>
           </w:p>
         </w:tc>
@@ -3650,14 +3663,14 @@
             <w:tcW w:type="dxa" w:w="3249"/>
             <w:shd w:fill="FFFFFF"/>
             <w:tcBorders>
-              <w:top w:val="single" w:sz="2" w:space="0" w:color="CCCCCC"/>
-              <w:bottom w:val="single" w:sz="2" w:space="0" w:color="CCCCCC"/>
-              <w:left w:val="single" w:sz="2" w:space="0" w:color="CCCCCC"/>
-              <w:right w:val="single" w:sz="2" w:space="0" w:color="CCCCCC"/>
+              <w:top w:val="single" w:sz="2" w:space="0" w:color="D8D8D8"/>
+              <w:bottom w:val="single" w:sz="2" w:space="0" w:color="D8D8D8"/>
+              <w:left w:val="single" w:sz="2" w:space="0" w:color="D8D8D8"/>
+              <w:right w:val="single" w:sz="2" w:space="0" w:color="D8D8D8"/>
             </w:tcBorders>
             <w:tcMar>
-              <w:top w:w="40" w:type="dxa"/>
-              <w:bottom w:w="40" w:type="dxa"/>
+              <w:top w:w="45" w:type="dxa"/>
+              <w:bottom w:w="45" w:type="dxa"/>
               <w:left w:w="80" w:type="dxa"/>
               <w:right w:w="80" w:type="dxa"/>
             </w:tcMar>
@@ -3670,10 +3683,10 @@
             <w:r>
               <w:rPr>
                 <w:rFonts w:ascii="Calibri" w:hAnsi="Calibri"/>
-                <w:color w:val="2C2C2C"/>
+                <w:color w:val="333333"/>
                 <w:sz w:val="16"/>
               </w:rPr>
-              <w:t>60-100</w:t>
+              <w:t>60–100 / yr</w:t>
             </w:r>
           </w:p>
         </w:tc>
@@ -3682,14 +3695,14 @@
             <w:tcW w:type="dxa" w:w="3249"/>
             <w:shd w:fill="FFFFFF"/>
             <w:tcBorders>
-              <w:top w:val="single" w:sz="2" w:space="0" w:color="CCCCCC"/>
-              <w:bottom w:val="single" w:sz="2" w:space="0" w:color="CCCCCC"/>
-              <w:left w:val="single" w:sz="2" w:space="0" w:color="CCCCCC"/>
-              <w:right w:val="single" w:sz="2" w:space="0" w:color="CCCCCC"/>
+              <w:top w:val="single" w:sz="2" w:space="0" w:color="D8D8D8"/>
+              <w:bottom w:val="single" w:sz="2" w:space="0" w:color="D8D8D8"/>
+              <w:left w:val="single" w:sz="2" w:space="0" w:color="D8D8D8"/>
+              <w:right w:val="single" w:sz="2" w:space="0" w:color="D8D8D8"/>
             </w:tcBorders>
             <w:tcMar>
-              <w:top w:w="40" w:type="dxa"/>
-              <w:bottom w:w="40" w:type="dxa"/>
+              <w:top w:w="45" w:type="dxa"/>
+              <w:bottom w:w="45" w:type="dxa"/>
               <w:left w:w="80" w:type="dxa"/>
               <w:right w:w="80" w:type="dxa"/>
             </w:tcMar>
@@ -3702,10 +3715,10 @@
             <w:r>
               <w:rPr>
                 <w:rFonts w:ascii="Calibri" w:hAnsi="Calibri"/>
-                <w:color w:val="2C2C2C"/>
+                <w:color w:val="333333"/>
                 <w:sz w:val="16"/>
               </w:rPr>
-              <w:t>18-31</w:t>
+              <w:t>18–31 / yr</w:t>
             </w:r>
           </w:p>
         </w:tc>
@@ -3714,16 +3727,16 @@
         <w:tc>
           <w:tcPr>
             <w:tcW w:type="dxa" w:w="3249"/>
-            <w:shd w:fill="E8F4F0"/>
+            <w:shd w:fill="E6F2F2"/>
             <w:tcBorders>
-              <w:top w:val="single" w:sz="2" w:space="0" w:color="CCCCCC"/>
-              <w:bottom w:val="single" w:sz="2" w:space="0" w:color="CCCCCC"/>
-              <w:left w:val="single" w:sz="2" w:space="0" w:color="CCCCCC"/>
-              <w:right w:val="single" w:sz="2" w:space="0" w:color="CCCCCC"/>
+              <w:top w:val="single" w:sz="2" w:space="0" w:color="D8D8D8"/>
+              <w:bottom w:val="single" w:sz="2" w:space="0" w:color="D8D8D8"/>
+              <w:left w:val="single" w:sz="2" w:space="0" w:color="D8D8D8"/>
+              <w:right w:val="single" w:sz="2" w:space="0" w:color="D8D8D8"/>
             </w:tcBorders>
             <w:tcMar>
-              <w:top w:w="40" w:type="dxa"/>
-              <w:bottom w:w="40" w:type="dxa"/>
+              <w:top w:w="45" w:type="dxa"/>
+              <w:bottom w:w="45" w:type="dxa"/>
               <w:left w:w="80" w:type="dxa"/>
               <w:right w:w="80" w:type="dxa"/>
             </w:tcMar>
@@ -3737,26 +3750,26 @@
               <w:rPr>
                 <w:rFonts w:ascii="Calibri" w:hAnsi="Calibri"/>
                 <w:b/>
-                <w:color w:val="007B7F"/>
+                <w:color w:val="007C8A"/>
                 <w:sz w:val="16"/>
               </w:rPr>
-              <w:t>ARC apheresis procedures/year (OncoCel)</w:t>
+              <w:t>ARC apheresis procedures (new)</w:t>
             </w:r>
           </w:p>
         </w:tc>
         <w:tc>
           <w:tcPr>
             <w:tcW w:type="dxa" w:w="3249"/>
-            <w:shd w:fill="E8F4F0"/>
+            <w:shd w:fill="E6F2F2"/>
             <w:tcBorders>
-              <w:top w:val="single" w:sz="2" w:space="0" w:color="CCCCCC"/>
-              <w:bottom w:val="single" w:sz="2" w:space="0" w:color="CCCCCC"/>
-              <w:left w:val="single" w:sz="2" w:space="0" w:color="CCCCCC"/>
-              <w:right w:val="single" w:sz="2" w:space="0" w:color="CCCCCC"/>
+              <w:top w:val="single" w:sz="2" w:space="0" w:color="D8D8D8"/>
+              <w:bottom w:val="single" w:sz="2" w:space="0" w:color="D8D8D8"/>
+              <w:left w:val="single" w:sz="2" w:space="0" w:color="D8D8D8"/>
+              <w:right w:val="single" w:sz="2" w:space="0" w:color="D8D8D8"/>
             </w:tcBorders>
             <w:tcMar>
-              <w:top w:w="40" w:type="dxa"/>
-              <w:bottom w:w="40" w:type="dxa"/>
+              <w:top w:w="45" w:type="dxa"/>
+              <w:bottom w:w="45" w:type="dxa"/>
               <w:left w:w="80" w:type="dxa"/>
               <w:right w:w="80" w:type="dxa"/>
             </w:tcMar>
@@ -3770,7 +3783,7 @@
               <w:rPr>
                 <w:rFonts w:ascii="Calibri" w:hAnsi="Calibri"/>
                 <w:b/>
-                <w:color w:val="007B7F"/>
+                <w:color w:val="007C8A"/>
                 <w:sz w:val="16"/>
               </w:rPr>
               <w:t>0</w:t>
@@ -3780,16 +3793,16 @@
         <w:tc>
           <w:tcPr>
             <w:tcW w:type="dxa" w:w="3249"/>
-            <w:shd w:fill="E8F4F0"/>
+            <w:shd w:fill="E6F2F2"/>
             <w:tcBorders>
-              <w:top w:val="single" w:sz="2" w:space="0" w:color="CCCCCC"/>
-              <w:bottom w:val="single" w:sz="2" w:space="0" w:color="CCCCCC"/>
-              <w:left w:val="single" w:sz="2" w:space="0" w:color="CCCCCC"/>
-              <w:right w:val="single" w:sz="2" w:space="0" w:color="CCCCCC"/>
+              <w:top w:val="single" w:sz="2" w:space="0" w:color="D8D8D8"/>
+              <w:bottom w:val="single" w:sz="2" w:space="0" w:color="D8D8D8"/>
+              <w:left w:val="single" w:sz="2" w:space="0" w:color="D8D8D8"/>
+              <w:right w:val="single" w:sz="2" w:space="0" w:color="D8D8D8"/>
             </w:tcBorders>
             <w:tcMar>
-              <w:top w:w="40" w:type="dxa"/>
-              <w:bottom w:w="40" w:type="dxa"/>
+              <w:top w:w="45" w:type="dxa"/>
+              <w:bottom w:w="45" w:type="dxa"/>
               <w:left w:w="80" w:type="dxa"/>
               <w:right w:w="80" w:type="dxa"/>
             </w:tcMar>
@@ -3803,10 +3816,10 @@
               <w:rPr>
                 <w:rFonts w:ascii="Calibri" w:hAnsi="Calibri"/>
                 <w:b/>
-                <w:color w:val="007B7F"/>
+                <w:color w:val="007C8A"/>
                 <w:sz w:val="16"/>
               </w:rPr>
-              <w:t>85-122</w:t>
+              <w:t>85–122 / yr</w:t>
             </w:r>
           </w:p>
         </w:tc>
@@ -3817,7 +3830,7 @@
         <w:rPr>
           <w:rFonts w:ascii="Calibri" w:hAnsi="Calibri"/>
           <w:b w:val="0"/>
-          <w:color w:val="2C2C2C"/>
+          <w:color w:val="333333"/>
           <w:sz w:val="18"/>
         </w:rPr>
       </w:r>
@@ -3826,14 +3839,14 @@
       <w:pPr>
         <w:ind w:left="216"/>
         <w:pBdr>
-          <w:left w:val="single" w:sz="16" w:space="8" w:color="007B7F"/>
+          <w:left w:val="single" w:sz="18" w:space="8" w:color="C4A35A"/>
         </w:pBdr>
       </w:pPr>
       <w:r>
         <w:rPr>
           <w:rFonts w:ascii="Calibri" w:hAnsi="Calibri"/>
           <w:b/>
-          <w:color w:val="1B2A4A"/>
+          <w:color w:val="0C2340"/>
           <w:sz w:val="17"/>
         </w:rPr>
         <w:t>ARC is positioned as the sole on-island partner for this growth. No other FACT-accredited provider in Puerto Rico can support the apheresis and cell processing requirements of TCT Oncology's cellular therapy network.</w:t>
@@ -3844,7 +3857,7 @@
         <w:rPr>
           <w:rFonts w:ascii="Calibri" w:hAnsi="Calibri"/>
           <w:b/>
-          <w:color w:val="007B7F"/>
+          <w:color w:val="C4A35A"/>
           <w:sz w:val="18"/>
         </w:rPr>
         <w:t xml:space="preserve">06  </w:t>
@@ -3853,7 +3866,7 @@
         <w:rPr>
           <w:rFonts w:ascii="Calibri" w:hAnsi="Calibri"/>
           <w:b/>
-          <w:color w:val="1B2A4A"/>
+          <w:color w:val="0C2340"/>
           <w:sz w:val="26"/>
         </w:rPr>
         <w:t>TIMELINE &amp; NEXT STEPS</w:t>
@@ -3862,7 +3875,7 @@
     <w:p>
       <w:pPr>
         <w:pBdr>
-          <w:bottom w:val="single" w:sz="6" w:space="1" w:color="007B7F"/>
+          <w:bottom w:val="single" w:sz="6" w:space="1" w:color="C4A35A"/>
         </w:pBdr>
       </w:pPr>
     </w:p>
@@ -3882,16 +3895,16 @@
         <w:tc>
           <w:tcPr>
             <w:tcW w:type="dxa" w:w="3249"/>
-            <w:shd w:fill="007B7F"/>
+            <w:shd w:fill="007C8A"/>
             <w:tcBorders>
-              <w:top w:val="single" w:sz="2" w:space="0" w:color="007B7F"/>
-              <w:bottom w:val="single" w:sz="2" w:space="0" w:color="007B7F"/>
-              <w:left w:val="single" w:sz="2" w:space="0" w:color="007B7F"/>
-              <w:right w:val="single" w:sz="2" w:space="0" w:color="007B7F"/>
+              <w:top w:val="single" w:sz="2" w:space="0" w:color="007C8A"/>
+              <w:bottom w:val="single" w:sz="2" w:space="0" w:color="007C8A"/>
+              <w:left w:val="single" w:sz="2" w:space="0" w:color="007C8A"/>
+              <w:right w:val="single" w:sz="2" w:space="0" w:color="007C8A"/>
             </w:tcBorders>
             <w:tcMar>
-              <w:top w:w="40" w:type="dxa"/>
-              <w:bottom w:w="40" w:type="dxa"/>
+              <w:top w:w="45" w:type="dxa"/>
+              <w:bottom w:w="45" w:type="dxa"/>
               <w:left w:w="80" w:type="dxa"/>
               <w:right w:w="80" w:type="dxa"/>
             </w:tcMar>
@@ -3915,16 +3928,16 @@
         <w:tc>
           <w:tcPr>
             <w:tcW w:type="dxa" w:w="3249"/>
-            <w:shd w:fill="007B7F"/>
+            <w:shd w:fill="007C8A"/>
             <w:tcBorders>
-              <w:top w:val="single" w:sz="2" w:space="0" w:color="007B7F"/>
-              <w:bottom w:val="single" w:sz="2" w:space="0" w:color="007B7F"/>
-              <w:left w:val="single" w:sz="2" w:space="0" w:color="007B7F"/>
-              <w:right w:val="single" w:sz="2" w:space="0" w:color="007B7F"/>
+              <w:top w:val="single" w:sz="2" w:space="0" w:color="007C8A"/>
+              <w:bottom w:val="single" w:sz="2" w:space="0" w:color="007C8A"/>
+              <w:left w:val="single" w:sz="2" w:space="0" w:color="007C8A"/>
+              <w:right w:val="single" w:sz="2" w:space="0" w:color="007C8A"/>
             </w:tcBorders>
             <w:tcMar>
-              <w:top w:w="40" w:type="dxa"/>
-              <w:bottom w:w="40" w:type="dxa"/>
+              <w:top w:w="45" w:type="dxa"/>
+              <w:bottom w:w="45" w:type="dxa"/>
               <w:left w:w="80" w:type="dxa"/>
               <w:right w:w="80" w:type="dxa"/>
             </w:tcMar>
@@ -3948,16 +3961,16 @@
         <w:tc>
           <w:tcPr>
             <w:tcW w:type="dxa" w:w="3249"/>
-            <w:shd w:fill="007B7F"/>
+            <w:shd w:fill="007C8A"/>
             <w:tcBorders>
-              <w:top w:val="single" w:sz="2" w:space="0" w:color="007B7F"/>
-              <w:bottom w:val="single" w:sz="2" w:space="0" w:color="007B7F"/>
-              <w:left w:val="single" w:sz="2" w:space="0" w:color="007B7F"/>
-              <w:right w:val="single" w:sz="2" w:space="0" w:color="007B7F"/>
+              <w:top w:val="single" w:sz="2" w:space="0" w:color="007C8A"/>
+              <w:bottom w:val="single" w:sz="2" w:space="0" w:color="007C8A"/>
+              <w:left w:val="single" w:sz="2" w:space="0" w:color="007C8A"/>
+              <w:right w:val="single" w:sz="2" w:space="0" w:color="007C8A"/>
             </w:tcBorders>
             <w:tcMar>
-              <w:top w:w="40" w:type="dxa"/>
-              <w:bottom w:w="40" w:type="dxa"/>
+              <w:top w:w="45" w:type="dxa"/>
+              <w:bottom w:w="45" w:type="dxa"/>
               <w:left w:w="80" w:type="dxa"/>
               <w:right w:w="80" w:type="dxa"/>
             </w:tcMar>
@@ -3985,14 +3998,14 @@
             <w:tcW w:type="dxa" w:w="3249"/>
             <w:shd w:fill="FFFFFF"/>
             <w:tcBorders>
-              <w:top w:val="single" w:sz="2" w:space="0" w:color="CCCCCC"/>
-              <w:bottom w:val="single" w:sz="2" w:space="0" w:color="CCCCCC"/>
-              <w:left w:val="single" w:sz="2" w:space="0" w:color="CCCCCC"/>
-              <w:right w:val="single" w:sz="2" w:space="0" w:color="CCCCCC"/>
+              <w:top w:val="single" w:sz="2" w:space="0" w:color="D8D8D8"/>
+              <w:bottom w:val="single" w:sz="2" w:space="0" w:color="D8D8D8"/>
+              <w:left w:val="single" w:sz="2" w:space="0" w:color="D8D8D8"/>
+              <w:right w:val="single" w:sz="2" w:space="0" w:color="D8D8D8"/>
             </w:tcBorders>
             <w:tcMar>
-              <w:top w:w="40" w:type="dxa"/>
-              <w:bottom w:w="40" w:type="dxa"/>
+              <w:top w:w="45" w:type="dxa"/>
+              <w:bottom w:w="45" w:type="dxa"/>
               <w:left w:w="80" w:type="dxa"/>
               <w:right w:w="80" w:type="dxa"/>
             </w:tcMar>
@@ -4006,7 +4019,7 @@
               <w:rPr>
                 <w:rFonts w:ascii="Calibri" w:hAnsi="Calibri"/>
                 <w:b/>
-                <w:color w:val="2C2C2C"/>
+                <w:color w:val="0C2340"/>
                 <w:sz w:val="16"/>
               </w:rPr>
               <w:t>August 2026</w:t>
@@ -4018,14 +4031,14 @@
             <w:tcW w:type="dxa" w:w="3249"/>
             <w:shd w:fill="FFFFFF"/>
             <w:tcBorders>
-              <w:top w:val="single" w:sz="2" w:space="0" w:color="CCCCCC"/>
-              <w:bottom w:val="single" w:sz="2" w:space="0" w:color="CCCCCC"/>
-              <w:left w:val="single" w:sz="2" w:space="0" w:color="CCCCCC"/>
-              <w:right w:val="single" w:sz="2" w:space="0" w:color="CCCCCC"/>
+              <w:top w:val="single" w:sz="2" w:space="0" w:color="D8D8D8"/>
+              <w:bottom w:val="single" w:sz="2" w:space="0" w:color="D8D8D8"/>
+              <w:left w:val="single" w:sz="2" w:space="0" w:color="D8D8D8"/>
+              <w:right w:val="single" w:sz="2" w:space="0" w:color="D8D8D8"/>
             </w:tcBorders>
             <w:tcMar>
-              <w:top w:w="40" w:type="dxa"/>
-              <w:bottom w:w="40" w:type="dxa"/>
+              <w:top w:w="45" w:type="dxa"/>
+              <w:bottom w:w="45" w:type="dxa"/>
               <w:left w:w="80" w:type="dxa"/>
               <w:right w:w="80" w:type="dxa"/>
             </w:tcMar>
@@ -4038,7 +4051,7 @@
             <w:r>
               <w:rPr>
                 <w:rFonts w:ascii="Calibri" w:hAnsi="Calibri"/>
-                <w:color w:val="2C2C2C"/>
+                <w:color w:val="333333"/>
                 <w:sz w:val="16"/>
               </w:rPr>
               <w:t>TCT Oncology launches BMTCI at CCCUPR</w:t>
@@ -4050,14 +4063,14 @@
             <w:tcW w:type="dxa" w:w="3249"/>
             <w:shd w:fill="FFFFFF"/>
             <w:tcBorders>
-              <w:top w:val="single" w:sz="2" w:space="0" w:color="CCCCCC"/>
-              <w:bottom w:val="single" w:sz="2" w:space="0" w:color="CCCCCC"/>
-              <w:left w:val="single" w:sz="2" w:space="0" w:color="CCCCCC"/>
-              <w:right w:val="single" w:sz="2" w:space="0" w:color="CCCCCC"/>
+              <w:top w:val="single" w:sz="2" w:space="0" w:color="D8D8D8"/>
+              <w:bottom w:val="single" w:sz="2" w:space="0" w:color="D8D8D8"/>
+              <w:left w:val="single" w:sz="2" w:space="0" w:color="D8D8D8"/>
+              <w:right w:val="single" w:sz="2" w:space="0" w:color="D8D8D8"/>
             </w:tcBorders>
             <w:tcMar>
-              <w:top w:w="40" w:type="dxa"/>
-              <w:bottom w:w="40" w:type="dxa"/>
+              <w:top w:w="45" w:type="dxa"/>
+              <w:bottom w:w="45" w:type="dxa"/>
               <w:left w:w="80" w:type="dxa"/>
               <w:right w:w="80" w:type="dxa"/>
             </w:tcMar>
@@ -4070,10 +4083,10 @@
             <w:r>
               <w:rPr>
                 <w:rFonts w:ascii="Calibri" w:hAnsi="Calibri"/>
-                <w:color w:val="2C2C2C"/>
+                <w:color w:val="333333"/>
                 <w:sz w:val="16"/>
               </w:rPr>
-              <w:t>First collection requests anticipated Q4 2026</w:t>
+              <w:t>First collections anticipated Q4 2026</w:t>
             </w:r>
           </w:p>
         </w:tc>
@@ -4082,16 +4095,16 @@
         <w:tc>
           <w:tcPr>
             <w:tcW w:type="dxa" w:w="3249"/>
-            <w:shd w:fill="F5F7F8"/>
+            <w:shd w:fill="F4F7F8"/>
             <w:tcBorders>
-              <w:top w:val="single" w:sz="2" w:space="0" w:color="CCCCCC"/>
-              <w:bottom w:val="single" w:sz="2" w:space="0" w:color="CCCCCC"/>
-              <w:left w:val="single" w:sz="2" w:space="0" w:color="CCCCCC"/>
-              <w:right w:val="single" w:sz="2" w:space="0" w:color="CCCCCC"/>
+              <w:top w:val="single" w:sz="2" w:space="0" w:color="D8D8D8"/>
+              <w:bottom w:val="single" w:sz="2" w:space="0" w:color="D8D8D8"/>
+              <w:left w:val="single" w:sz="2" w:space="0" w:color="D8D8D8"/>
+              <w:right w:val="single" w:sz="2" w:space="0" w:color="D8D8D8"/>
             </w:tcBorders>
             <w:tcMar>
-              <w:top w:w="40" w:type="dxa"/>
-              <w:bottom w:w="40" w:type="dxa"/>
+              <w:top w:w="45" w:type="dxa"/>
+              <w:bottom w:w="45" w:type="dxa"/>
               <w:left w:w="80" w:type="dxa"/>
               <w:right w:w="80" w:type="dxa"/>
             </w:tcMar>
@@ -4105,7 +4118,7 @@
               <w:rPr>
                 <w:rFonts w:ascii="Calibri" w:hAnsi="Calibri"/>
                 <w:b/>
-                <w:color w:val="2C2C2C"/>
+                <w:color w:val="0C2340"/>
                 <w:sz w:val="16"/>
               </w:rPr>
               <w:t>Q4 2026</w:t>
@@ -4115,16 +4128,16 @@
         <w:tc>
           <w:tcPr>
             <w:tcW w:type="dxa" w:w="3249"/>
-            <w:shd w:fill="F5F7F8"/>
+            <w:shd w:fill="F4F7F8"/>
             <w:tcBorders>
-              <w:top w:val="single" w:sz="2" w:space="0" w:color="CCCCCC"/>
-              <w:bottom w:val="single" w:sz="2" w:space="0" w:color="CCCCCC"/>
-              <w:left w:val="single" w:sz="2" w:space="0" w:color="CCCCCC"/>
-              <w:right w:val="single" w:sz="2" w:space="0" w:color="CCCCCC"/>
+              <w:top w:val="single" w:sz="2" w:space="0" w:color="D8D8D8"/>
+              <w:bottom w:val="single" w:sz="2" w:space="0" w:color="D8D8D8"/>
+              <w:left w:val="single" w:sz="2" w:space="0" w:color="D8D8D8"/>
+              <w:right w:val="single" w:sz="2" w:space="0" w:color="D8D8D8"/>
             </w:tcBorders>
             <w:tcMar>
-              <w:top w:w="40" w:type="dxa"/>
-              <w:bottom w:w="40" w:type="dxa"/>
+              <w:top w:w="45" w:type="dxa"/>
+              <w:bottom w:w="45" w:type="dxa"/>
               <w:left w:w="80" w:type="dxa"/>
               <w:right w:w="80" w:type="dxa"/>
             </w:tcMar>
@@ -4137,7 +4150,7 @@
             <w:r>
               <w:rPr>
                 <w:rFonts w:ascii="Calibri" w:hAnsi="Calibri"/>
-                <w:color w:val="2C2C2C"/>
+                <w:color w:val="333333"/>
                 <w:sz w:val="16"/>
               </w:rPr>
               <w:t>First autologous HSC collections (CCCUPR)</w:t>
@@ -4147,16 +4160,16 @@
         <w:tc>
           <w:tcPr>
             <w:tcW w:type="dxa" w:w="3249"/>
-            <w:shd w:fill="F5F7F8"/>
+            <w:shd w:fill="F4F7F8"/>
             <w:tcBorders>
-              <w:top w:val="single" w:sz="2" w:space="0" w:color="CCCCCC"/>
-              <w:bottom w:val="single" w:sz="2" w:space="0" w:color="CCCCCC"/>
-              <w:left w:val="single" w:sz="2" w:space="0" w:color="CCCCCC"/>
-              <w:right w:val="single" w:sz="2" w:space="0" w:color="CCCCCC"/>
+              <w:top w:val="single" w:sz="2" w:space="0" w:color="D8D8D8"/>
+              <w:bottom w:val="single" w:sz="2" w:space="0" w:color="D8D8D8"/>
+              <w:left w:val="single" w:sz="2" w:space="0" w:color="D8D8D8"/>
+              <w:right w:val="single" w:sz="2" w:space="0" w:color="D8D8D8"/>
             </w:tcBorders>
             <w:tcMar>
-              <w:top w:w="40" w:type="dxa"/>
-              <w:bottom w:w="40" w:type="dxa"/>
+              <w:top w:w="45" w:type="dxa"/>
+              <w:bottom w:w="45" w:type="dxa"/>
               <w:left w:w="80" w:type="dxa"/>
               <w:right w:w="80" w:type="dxa"/>
             </w:tcMar>
@@ -4169,10 +4182,10 @@
             <w:r>
               <w:rPr>
                 <w:rFonts w:ascii="Calibri" w:hAnsi="Calibri"/>
-                <w:color w:val="2C2C2C"/>
+                <w:color w:val="333333"/>
                 <w:sz w:val="16"/>
               </w:rPr>
-              <w:t>12-18 collections in Year 1</w:t>
+              <w:t>12–18 collections in Year 1</w:t>
             </w:r>
           </w:p>
         </w:tc>
@@ -4183,14 +4196,14 @@
             <w:tcW w:type="dxa" w:w="3249"/>
             <w:shd w:fill="FFFFFF"/>
             <w:tcBorders>
-              <w:top w:val="single" w:sz="2" w:space="0" w:color="CCCCCC"/>
-              <w:bottom w:val="single" w:sz="2" w:space="0" w:color="CCCCCC"/>
-              <w:left w:val="single" w:sz="2" w:space="0" w:color="CCCCCC"/>
-              <w:right w:val="single" w:sz="2" w:space="0" w:color="CCCCCC"/>
+              <w:top w:val="single" w:sz="2" w:space="0" w:color="D8D8D8"/>
+              <w:bottom w:val="single" w:sz="2" w:space="0" w:color="D8D8D8"/>
+              <w:left w:val="single" w:sz="2" w:space="0" w:color="D8D8D8"/>
+              <w:right w:val="single" w:sz="2" w:space="0" w:color="D8D8D8"/>
             </w:tcBorders>
             <w:tcMar>
-              <w:top w:w="40" w:type="dxa"/>
-              <w:bottom w:w="40" w:type="dxa"/>
+              <w:top w:w="45" w:type="dxa"/>
+              <w:bottom w:w="45" w:type="dxa"/>
               <w:left w:w="80" w:type="dxa"/>
               <w:right w:w="80" w:type="dxa"/>
             </w:tcMar>
@@ -4204,7 +4217,7 @@
               <w:rPr>
                 <w:rFonts w:ascii="Calibri" w:hAnsi="Calibri"/>
                 <w:b/>
-                <w:color w:val="2C2C2C"/>
+                <w:color w:val="0C2340"/>
                 <w:sz w:val="16"/>
               </w:rPr>
               <w:t>Q1 2027</w:t>
@@ -4216,14 +4229,14 @@
             <w:tcW w:type="dxa" w:w="3249"/>
             <w:shd w:fill="FFFFFF"/>
             <w:tcBorders>
-              <w:top w:val="single" w:sz="2" w:space="0" w:color="CCCCCC"/>
-              <w:bottom w:val="single" w:sz="2" w:space="0" w:color="CCCCCC"/>
-              <w:left w:val="single" w:sz="2" w:space="0" w:color="CCCCCC"/>
-              <w:right w:val="single" w:sz="2" w:space="0" w:color="CCCCCC"/>
+              <w:top w:val="single" w:sz="2" w:space="0" w:color="D8D8D8"/>
+              <w:bottom w:val="single" w:sz="2" w:space="0" w:color="D8D8D8"/>
+              <w:left w:val="single" w:sz="2" w:space="0" w:color="D8D8D8"/>
+              <w:right w:val="single" w:sz="2" w:space="0" w:color="D8D8D8"/>
             </w:tcBorders>
             <w:tcMar>
-              <w:top w:w="40" w:type="dxa"/>
-              <w:bottom w:w="40" w:type="dxa"/>
+              <w:top w:w="45" w:type="dxa"/>
+              <w:bottom w:w="45" w:type="dxa"/>
               <w:left w:w="80" w:type="dxa"/>
               <w:right w:w="80" w:type="dxa"/>
             </w:tcMar>
@@ -4236,7 +4249,7 @@
             <w:r>
               <w:rPr>
                 <w:rFonts w:ascii="Calibri" w:hAnsi="Calibri"/>
-                <w:color w:val="2C2C2C"/>
+                <w:color w:val="333333"/>
                 <w:sz w:val="16"/>
               </w:rPr>
               <w:t>First CAR-T leukapheresis (CCCUPR)</w:t>
@@ -4248,14 +4261,14 @@
             <w:tcW w:type="dxa" w:w="3249"/>
             <w:shd w:fill="FFFFFF"/>
             <w:tcBorders>
-              <w:top w:val="single" w:sz="2" w:space="0" w:color="CCCCCC"/>
-              <w:bottom w:val="single" w:sz="2" w:space="0" w:color="CCCCCC"/>
-              <w:left w:val="single" w:sz="2" w:space="0" w:color="CCCCCC"/>
-              <w:right w:val="single" w:sz="2" w:space="0" w:color="CCCCCC"/>
+              <w:top w:val="single" w:sz="2" w:space="0" w:color="D8D8D8"/>
+              <w:bottom w:val="single" w:sz="2" w:space="0" w:color="D8D8D8"/>
+              <w:left w:val="single" w:sz="2" w:space="0" w:color="D8D8D8"/>
+              <w:right w:val="single" w:sz="2" w:space="0" w:color="D8D8D8"/>
             </w:tcBorders>
             <w:tcMar>
-              <w:top w:w="40" w:type="dxa"/>
-              <w:bottom w:w="40" w:type="dxa"/>
+              <w:top w:w="45" w:type="dxa"/>
+              <w:bottom w:w="45" w:type="dxa"/>
               <w:left w:w="80" w:type="dxa"/>
               <w:right w:w="80" w:type="dxa"/>
             </w:tcMar>
@@ -4268,10 +4281,10 @@
             <w:r>
               <w:rPr>
                 <w:rFonts w:ascii="Calibri" w:hAnsi="Calibri"/>
-                <w:color w:val="2C2C2C"/>
+                <w:color w:val="333333"/>
                 <w:sz w:val="16"/>
               </w:rPr>
-              <w:t>New service type — contract amendment needed</w:t>
+              <w:t>Contract amendment needed</w:t>
             </w:r>
           </w:p>
         </w:tc>
@@ -4280,16 +4293,16 @@
         <w:tc>
           <w:tcPr>
             <w:tcW w:type="dxa" w:w="3249"/>
-            <w:shd w:fill="F5F7F8"/>
+            <w:shd w:fill="F4F7F8"/>
             <w:tcBorders>
-              <w:top w:val="single" w:sz="2" w:space="0" w:color="CCCCCC"/>
-              <w:bottom w:val="single" w:sz="2" w:space="0" w:color="CCCCCC"/>
-              <w:left w:val="single" w:sz="2" w:space="0" w:color="CCCCCC"/>
-              <w:right w:val="single" w:sz="2" w:space="0" w:color="CCCCCC"/>
+              <w:top w:val="single" w:sz="2" w:space="0" w:color="D8D8D8"/>
+              <w:bottom w:val="single" w:sz="2" w:space="0" w:color="D8D8D8"/>
+              <w:left w:val="single" w:sz="2" w:space="0" w:color="D8D8D8"/>
+              <w:right w:val="single" w:sz="2" w:space="0" w:color="D8D8D8"/>
             </w:tcBorders>
             <w:tcMar>
-              <w:top w:w="40" w:type="dxa"/>
-              <w:bottom w:w="40" w:type="dxa"/>
+              <w:top w:w="45" w:type="dxa"/>
+              <w:bottom w:w="45" w:type="dxa"/>
               <w:left w:w="80" w:type="dxa"/>
               <w:right w:w="80" w:type="dxa"/>
             </w:tcMar>
@@ -4303,7 +4316,7 @@
               <w:rPr>
                 <w:rFonts w:ascii="Calibri" w:hAnsi="Calibri"/>
                 <w:b/>
-                <w:color w:val="2C2C2C"/>
+                <w:color w:val="0C2340"/>
                 <w:sz w:val="16"/>
               </w:rPr>
               <w:t>2028</w:t>
@@ -4313,16 +4326,16 @@
         <w:tc>
           <w:tcPr>
             <w:tcW w:type="dxa" w:w="3249"/>
-            <w:shd w:fill="F5F7F8"/>
+            <w:shd w:fill="F4F7F8"/>
             <w:tcBorders>
-              <w:top w:val="single" w:sz="2" w:space="0" w:color="CCCCCC"/>
-              <w:bottom w:val="single" w:sz="2" w:space="0" w:color="CCCCCC"/>
-              <w:left w:val="single" w:sz="2" w:space="0" w:color="CCCCCC"/>
-              <w:right w:val="single" w:sz="2" w:space="0" w:color="CCCCCC"/>
+              <w:top w:val="single" w:sz="2" w:space="0" w:color="D8D8D8"/>
+              <w:bottom w:val="single" w:sz="2" w:space="0" w:color="D8D8D8"/>
+              <w:left w:val="single" w:sz="2" w:space="0" w:color="D8D8D8"/>
+              <w:right w:val="single" w:sz="2" w:space="0" w:color="D8D8D8"/>
             </w:tcBorders>
             <w:tcMar>
-              <w:top w:w="40" w:type="dxa"/>
-              <w:bottom w:w="40" w:type="dxa"/>
+              <w:top w:w="45" w:type="dxa"/>
+              <w:bottom w:w="45" w:type="dxa"/>
               <w:left w:w="80" w:type="dxa"/>
               <w:right w:w="80" w:type="dxa"/>
             </w:tcMar>
@@ -4335,26 +4348,26 @@
             <w:r>
               <w:rPr>
                 <w:rFonts w:ascii="Calibri" w:hAnsi="Calibri"/>
-                <w:color w:val="2C2C2C"/>
+                <w:color w:val="333333"/>
                 <w:sz w:val="16"/>
               </w:rPr>
-              <w:t>Allo-HSCT donor collections ramp (HAM via TCT)</w:t>
+              <w:t>Allo-HSCT donor collections ramp (HAM)</w:t>
             </w:r>
           </w:p>
         </w:tc>
         <w:tc>
           <w:tcPr>
             <w:tcW w:type="dxa" w:w="3249"/>
-            <w:shd w:fill="F5F7F8"/>
+            <w:shd w:fill="F4F7F8"/>
             <w:tcBorders>
-              <w:top w:val="single" w:sz="2" w:space="0" w:color="CCCCCC"/>
-              <w:bottom w:val="single" w:sz="2" w:space="0" w:color="CCCCCC"/>
-              <w:left w:val="single" w:sz="2" w:space="0" w:color="CCCCCC"/>
-              <w:right w:val="single" w:sz="2" w:space="0" w:color="CCCCCC"/>
+              <w:top w:val="single" w:sz="2" w:space="0" w:color="D8D8D8"/>
+              <w:bottom w:val="single" w:sz="2" w:space="0" w:color="D8D8D8"/>
+              <w:left w:val="single" w:sz="2" w:space="0" w:color="D8D8D8"/>
+              <w:right w:val="single" w:sz="2" w:space="0" w:color="D8D8D8"/>
             </w:tcBorders>
             <w:tcMar>
-              <w:top w:w="40" w:type="dxa"/>
-              <w:bottom w:w="40" w:type="dxa"/>
+              <w:top w:w="45" w:type="dxa"/>
+              <w:bottom w:w="45" w:type="dxa"/>
               <w:left w:w="80" w:type="dxa"/>
               <w:right w:w="80" w:type="dxa"/>
             </w:tcMar>
@@ -4367,10 +4380,10 @@
             <w:r>
               <w:rPr>
                 <w:rFonts w:ascii="Calibri" w:hAnsi="Calibri"/>
-                <w:color w:val="2C2C2C"/>
+                <w:color w:val="333333"/>
                 <w:sz w:val="16"/>
               </w:rPr>
-              <w:t>Donor collection volume increasing</w:t>
+              <w:t>Donor volume increasing</w:t>
             </w:r>
           </w:p>
         </w:tc>
@@ -4381,14 +4394,14 @@
             <w:tcW w:type="dxa" w:w="3249"/>
             <w:shd w:fill="FFFFFF"/>
             <w:tcBorders>
-              <w:top w:val="single" w:sz="2" w:space="0" w:color="CCCCCC"/>
-              <w:bottom w:val="single" w:sz="2" w:space="0" w:color="CCCCCC"/>
-              <w:left w:val="single" w:sz="2" w:space="0" w:color="CCCCCC"/>
-              <w:right w:val="single" w:sz="2" w:space="0" w:color="CCCCCC"/>
+              <w:top w:val="single" w:sz="2" w:space="0" w:color="D8D8D8"/>
+              <w:bottom w:val="single" w:sz="2" w:space="0" w:color="D8D8D8"/>
+              <w:left w:val="single" w:sz="2" w:space="0" w:color="D8D8D8"/>
+              <w:right w:val="single" w:sz="2" w:space="0" w:color="D8D8D8"/>
             </w:tcBorders>
             <w:tcMar>
-              <w:top w:w="40" w:type="dxa"/>
-              <w:bottom w:w="40" w:type="dxa"/>
+              <w:top w:w="45" w:type="dxa"/>
+              <w:bottom w:w="45" w:type="dxa"/>
               <w:left w:w="80" w:type="dxa"/>
               <w:right w:w="80" w:type="dxa"/>
             </w:tcMar>
@@ -4402,10 +4415,10 @@
               <w:rPr>
                 <w:rFonts w:ascii="Calibri" w:hAnsi="Calibri"/>
                 <w:b/>
-                <w:color w:val="2C2C2C"/>
+                <w:color w:val="0C2340"/>
                 <w:sz w:val="16"/>
               </w:rPr>
-              <w:t>2028-2029</w:t>
+              <w:t>2028–2029</w:t>
             </w:r>
           </w:p>
         </w:tc>
@@ -4414,14 +4427,14 @@
             <w:tcW w:type="dxa" w:w="3249"/>
             <w:shd w:fill="FFFFFF"/>
             <w:tcBorders>
-              <w:top w:val="single" w:sz="2" w:space="0" w:color="CCCCCC"/>
-              <w:bottom w:val="single" w:sz="2" w:space="0" w:color="CCCCCC"/>
-              <w:left w:val="single" w:sz="2" w:space="0" w:color="CCCCCC"/>
-              <w:right w:val="single" w:sz="2" w:space="0" w:color="CCCCCC"/>
+              <w:top w:val="single" w:sz="2" w:space="0" w:color="D8D8D8"/>
+              <w:bottom w:val="single" w:sz="2" w:space="0" w:color="D8D8D8"/>
+              <w:left w:val="single" w:sz="2" w:space="0" w:color="D8D8D8"/>
+              <w:right w:val="single" w:sz="2" w:space="0" w:color="D8D8D8"/>
             </w:tcBorders>
             <w:tcMar>
-              <w:top w:w="40" w:type="dxa"/>
-              <w:bottom w:w="40" w:type="dxa"/>
+              <w:top w:w="45" w:type="dxa"/>
+              <w:bottom w:w="45" w:type="dxa"/>
               <w:left w:w="80" w:type="dxa"/>
               <w:right w:w="80" w:type="dxa"/>
             </w:tcMar>
@@ -4434,10 +4447,10 @@
             <w:r>
               <w:rPr>
                 <w:rFonts w:ascii="Calibri" w:hAnsi="Calibri"/>
-                <w:color w:val="2C2C2C"/>
+                <w:color w:val="333333"/>
                 <w:sz w:val="16"/>
               </w:rPr>
-              <w:t>Program reaches 40-58 procedures/year</w:t>
+              <w:t>Program reaches 40–58 procedures / year</w:t>
             </w:r>
           </w:p>
         </w:tc>
@@ -4446,14 +4459,14 @@
             <w:tcW w:type="dxa" w:w="3249"/>
             <w:shd w:fill="FFFFFF"/>
             <w:tcBorders>
-              <w:top w:val="single" w:sz="2" w:space="0" w:color="CCCCCC"/>
-              <w:bottom w:val="single" w:sz="2" w:space="0" w:color="CCCCCC"/>
-              <w:left w:val="single" w:sz="2" w:space="0" w:color="CCCCCC"/>
-              <w:right w:val="single" w:sz="2" w:space="0" w:color="CCCCCC"/>
+              <w:top w:val="single" w:sz="2" w:space="0" w:color="D8D8D8"/>
+              <w:bottom w:val="single" w:sz="2" w:space="0" w:color="D8D8D8"/>
+              <w:left w:val="single" w:sz="2" w:space="0" w:color="D8D8D8"/>
+              <w:right w:val="single" w:sz="2" w:space="0" w:color="D8D8D8"/>
             </w:tcBorders>
             <w:tcMar>
-              <w:top w:w="40" w:type="dxa"/>
-              <w:bottom w:w="40" w:type="dxa"/>
+              <w:top w:w="45" w:type="dxa"/>
+              <w:bottom w:w="45" w:type="dxa"/>
               <w:left w:w="80" w:type="dxa"/>
               <w:right w:w="80" w:type="dxa"/>
             </w:tcMar>
@@ -4466,7 +4479,7 @@
             <w:r>
               <w:rPr>
                 <w:rFonts w:ascii="Calibri" w:hAnsi="Calibri"/>
-                <w:color w:val="2C2C2C"/>
+                <w:color w:val="333333"/>
                 <w:sz w:val="16"/>
               </w:rPr>
               <w:t>Volume-based pricing discussion</w:t>
@@ -4478,16 +4491,16 @@
         <w:tc>
           <w:tcPr>
             <w:tcW w:type="dxa" w:w="3249"/>
-            <w:shd w:fill="F5F7F8"/>
+            <w:shd w:fill="F4F7F8"/>
             <w:tcBorders>
-              <w:top w:val="single" w:sz="2" w:space="0" w:color="CCCCCC"/>
-              <w:bottom w:val="single" w:sz="2" w:space="0" w:color="CCCCCC"/>
-              <w:left w:val="single" w:sz="2" w:space="0" w:color="CCCCCC"/>
-              <w:right w:val="single" w:sz="2" w:space="0" w:color="CCCCCC"/>
+              <w:top w:val="single" w:sz="2" w:space="0" w:color="D8D8D8"/>
+              <w:bottom w:val="single" w:sz="2" w:space="0" w:color="D8D8D8"/>
+              <w:left w:val="single" w:sz="2" w:space="0" w:color="D8D8D8"/>
+              <w:right w:val="single" w:sz="2" w:space="0" w:color="D8D8D8"/>
             </w:tcBorders>
             <w:tcMar>
-              <w:top w:w="40" w:type="dxa"/>
-              <w:bottom w:w="40" w:type="dxa"/>
+              <w:top w:w="45" w:type="dxa"/>
+              <w:bottom w:w="45" w:type="dxa"/>
               <w:left w:w="80" w:type="dxa"/>
               <w:right w:w="80" w:type="dxa"/>
             </w:tcMar>
@@ -4501,7 +4514,7 @@
               <w:rPr>
                 <w:rFonts w:ascii="Calibri" w:hAnsi="Calibri"/>
                 <w:b/>
-                <w:color w:val="2C2C2C"/>
+                <w:color w:val="0C2340"/>
                 <w:sz w:val="16"/>
               </w:rPr>
               <w:t>2031</w:t>
@@ -4511,16 +4524,16 @@
         <w:tc>
           <w:tcPr>
             <w:tcW w:type="dxa" w:w="3249"/>
-            <w:shd w:fill="F5F7F8"/>
+            <w:shd w:fill="F4F7F8"/>
             <w:tcBorders>
-              <w:top w:val="single" w:sz="2" w:space="0" w:color="CCCCCC"/>
-              <w:bottom w:val="single" w:sz="2" w:space="0" w:color="CCCCCC"/>
-              <w:left w:val="single" w:sz="2" w:space="0" w:color="CCCCCC"/>
-              <w:right w:val="single" w:sz="2" w:space="0" w:color="CCCCCC"/>
+              <w:top w:val="single" w:sz="2" w:space="0" w:color="D8D8D8"/>
+              <w:bottom w:val="single" w:sz="2" w:space="0" w:color="D8D8D8"/>
+              <w:left w:val="single" w:sz="2" w:space="0" w:color="D8D8D8"/>
+              <w:right w:val="single" w:sz="2" w:space="0" w:color="D8D8D8"/>
             </w:tcBorders>
             <w:tcMar>
-              <w:top w:w="40" w:type="dxa"/>
-              <w:bottom w:w="40" w:type="dxa"/>
+              <w:top w:w="45" w:type="dxa"/>
+              <w:bottom w:w="45" w:type="dxa"/>
               <w:left w:w="80" w:type="dxa"/>
               <w:right w:w="80" w:type="dxa"/>
             </w:tcMar>
@@ -4533,26 +4546,26 @@
             <w:r>
               <w:rPr>
                 <w:rFonts w:ascii="Calibri" w:hAnsi="Calibri"/>
-                <w:color w:val="2C2C2C"/>
+                <w:color w:val="333333"/>
                 <w:sz w:val="16"/>
               </w:rPr>
-              <w:t>Full program at 85-122 procedures/year</w:t>
+              <w:t>Full program at 85–122 procedures / year</w:t>
             </w:r>
           </w:p>
         </w:tc>
         <w:tc>
           <w:tcPr>
             <w:tcW w:type="dxa" w:w="3249"/>
-            <w:shd w:fill="F5F7F8"/>
+            <w:shd w:fill="F4F7F8"/>
             <w:tcBorders>
-              <w:top w:val="single" w:sz="2" w:space="0" w:color="CCCCCC"/>
-              <w:bottom w:val="single" w:sz="2" w:space="0" w:color="CCCCCC"/>
-              <w:left w:val="single" w:sz="2" w:space="0" w:color="CCCCCC"/>
-              <w:right w:val="single" w:sz="2" w:space="0" w:color="CCCCCC"/>
+              <w:top w:val="single" w:sz="2" w:space="0" w:color="D8D8D8"/>
+              <w:bottom w:val="single" w:sz="2" w:space="0" w:color="D8D8D8"/>
+              <w:left w:val="single" w:sz="2" w:space="0" w:color="D8D8D8"/>
+              <w:right w:val="single" w:sz="2" w:space="0" w:color="D8D8D8"/>
             </w:tcBorders>
             <w:tcMar>
-              <w:top w:w="40" w:type="dxa"/>
-              <w:bottom w:w="40" w:type="dxa"/>
+              <w:top w:w="45" w:type="dxa"/>
+              <w:bottom w:w="45" w:type="dxa"/>
               <w:left w:w="80" w:type="dxa"/>
               <w:right w:w="80" w:type="dxa"/>
             </w:tcMar>
@@ -4565,7 +4578,7 @@
             <w:r>
               <w:rPr>
                 <w:rFonts w:ascii="Calibri" w:hAnsi="Calibri"/>
-                <w:color w:val="2C2C2C"/>
+                <w:color w:val="333333"/>
                 <w:sz w:val="16"/>
               </w:rPr>
               <w:t>Steady-state capacity planning</w:t>
@@ -4579,7 +4592,7 @@
         <w:rPr>
           <w:rFonts w:ascii="Calibri" w:hAnsi="Calibri"/>
           <w:b w:val="0"/>
-          <w:color w:val="2C2C2C"/>
+          <w:color w:val="333333"/>
           <w:sz w:val="18"/>
         </w:rPr>
       </w:r>
@@ -4589,7 +4602,7 @@
         <w:rPr>
           <w:rFonts w:ascii="Calibri" w:hAnsi="Calibri"/>
           <w:b/>
-          <w:color w:val="007B7F"/>
+          <w:color w:val="007C8A"/>
           <w:sz w:val="18"/>
         </w:rPr>
         <w:t>OncoCel, on behalf of TCT Oncology, proposes a meeting with ARC leadership to:</w:t>
@@ -4603,7 +4616,7 @@
       <w:r>
         <w:rPr>
           <w:rFonts w:ascii="Calibri" w:hAnsi="Calibri"/>
-          <w:color w:val="2C2C2C"/>
+          <w:color w:val="333333"/>
           <w:sz w:val="17"/>
         </w:rPr>
         <w:t>Review current contract scope against projected service needs</w:t>
@@ -4617,7 +4630,7 @@
       <w:r>
         <w:rPr>
           <w:rFonts w:ascii="Calibri" w:hAnsi="Calibri"/>
-          <w:color w:val="2C2C2C"/>
+          <w:color w:val="333333"/>
           <w:sz w:val="17"/>
         </w:rPr>
         <w:t>Confirm capacity availability for Year 1 collections (Q4 2026 start)</w:t>
@@ -4631,7 +4644,7 @@
       <w:r>
         <w:rPr>
           <w:rFonts w:ascii="Calibri" w:hAnsi="Calibri"/>
-          <w:color w:val="2C2C2C"/>
+          <w:color w:val="333333"/>
           <w:sz w:val="17"/>
         </w:rPr>
         <w:t>Discuss CAR-T leukapheresis as a new service category and amend agreement</w:t>
@@ -4645,7 +4658,7 @@
       <w:r>
         <w:rPr>
           <w:rFonts w:ascii="Calibri" w:hAnsi="Calibri"/>
-          <w:color w:val="2C2C2C"/>
+          <w:color w:val="333333"/>
           <w:sz w:val="17"/>
         </w:rPr>
         <w:t>Establish turnaround and capacity SLA for emergent collection slots</w:t>
@@ -4659,7 +4672,7 @@
       <w:r>
         <w:rPr>
           <w:rFonts w:ascii="Calibri" w:hAnsi="Calibri"/>
-          <w:color w:val="2C2C2C"/>
+          <w:color w:val="333333"/>
           <w:sz w:val="17"/>
         </w:rPr>
         <w:t>Plan volume-based pricing as the program scales</w:t>
@@ -4668,37 +4681,42 @@
     <w:p>
       <w:pPr>
         <w:pBdr>
-          <w:top w:val="single" w:sz="6" w:space="6" w:color="007B7F"/>
+          <w:top w:val="single" w:sz="8" w:space="6" w:color="C4A35A"/>
         </w:pBdr>
       </w:pPr>
     </w:p>
     <w:p>
+      <w:pPr>
+        <w:jc w:val="left"/>
+      </w:pPr>
       <w:r>
         <w:rPr>
           <w:rFonts w:ascii="Calibri" w:hAnsi="Calibri"/>
           <w:b/>
-          <w:color w:val="1B2A4A"/>
-          <w:sz w:val="24"/>
+          <w:color w:val="0C2340"/>
+          <w:sz w:val="28"/>
         </w:rPr>
-        <w:t>ONCOCEL</w:t>
-      </w:r>
-      <w:r>
-        <w:rPr>
-          <w:rFonts w:ascii="Calibri" w:hAnsi="Calibri"/>
-          <w:color w:val="777777"/>
-          <w:sz w:val="16"/>
-        </w:rPr>
-        <w:t xml:space="preserve">  LLC</w:t>
+        <w:t>OncoCel</w:t>
       </w:r>
     </w:p>
     <w:p>
       <w:r>
         <w:rPr>
           <w:rFonts w:ascii="Calibri" w:hAnsi="Calibri"/>
-          <w:color w:val="777777"/>
+          <w:color w:val="999999"/>
+          <w:sz w:val="14"/>
+        </w:rPr>
+        <w:t>CELLULAR THERAPY &amp; TRANSPLANTATION</w:t>
+      </w:r>
+    </w:p>
+    <w:p>
+      <w:r>
+        <w:rPr>
+          <w:rFonts w:ascii="Calibri" w:hAnsi="Calibri"/>
+          <w:color w:val="666666"/>
           <w:sz w:val="16"/>
         </w:rPr>
-        <w:t>Carlos Mendez, COO — cmendez@tctoncology.com</w:t>
+        <w:t>Carlos Mendez, COO  ·  cmendez@tctoncology.com</w:t>
       </w:r>
     </w:p>
     <w:p>
@@ -4706,7 +4724,7 @@
         <w:rPr>
           <w:rFonts w:ascii="Calibri" w:hAnsi="Calibri"/>
           <w:i/>
-          <w:color w:val="777777"/>
+          <w:color w:val="999999"/>
           <w:sz w:val="15"/>
         </w:rPr>
         <w:t>Supporting TCT Oncology at CCCUPR and Auxilio Mutuo Hospital</w:t>
@@ -4716,15 +4734,15 @@
       <w:r>
         <w:rPr>
           <w:rFonts w:ascii="Calibri" w:hAnsi="Calibri"/>
-          <w:color w:val="777777"/>
+          <w:color w:val="999999"/>
           <w:sz w:val="15"/>
         </w:rPr>
-        <w:t>June 2026  |  Confidential</w:t>
+        <w:t>San Juan, Puerto Rico  ·  June 2026  ·  Confidential</w:t>
       </w:r>
     </w:p>
     <w:sectPr>
       <w:pgSz w:w="12240" w:h="15840"/>
-      <w:pgMar w:top="1020" w:right="1247" w:bottom="850" w:left="1247" w:header="720" w:footer="720" w:gutter="0"/>
+      <w:pgMar w:top="850" w:right="1247" w:bottom="850" w:left="1247" w:header="720" w:footer="720" w:gutter="0"/>
       <w:cols w:space="720"/>
       <w:docGrid w:linePitch="360"/>
     </w:sectPr>
@@ -5097,7 +5115,7 @@
     <w:rsid w:val="00FC693F"/>
     <w:rPr>
       <w:rFonts w:ascii="Calibri" w:hAnsi="Calibri"/>
-      <w:color w:val="2C2C2C"/>
+      <w:color w:val="333333"/>
       <w:sz w:val="18"/>
     </w:rPr>
   </w:style>

</xml_diff>

<commit_message>
Fix voice: OncoCel speaks as sender, TCT is clinical partner
OncoCel launches the BMTCI Program, OncoCel proposes meetings,
OncoCel requests contract review. TCT Oncology is referenced as the
clinical partner operating allo-HSCT at HAM. Document now consistently
uses OncoCel as the first-person voice throughout.

https://claude.ai/code/session_01D1GqSzvzsb5T4NMhTpgnob
</commit_message>
<xml_diff>
--- a/output/OncoCel_ARC_Volume_Notification.docx
+++ b/output/OncoCel_ARC_Volume_Notification.docx
@@ -121,7 +121,7 @@
           <w:color w:val="333333"/>
           <w:sz w:val="18"/>
         </w:rPr>
-        <w:t>TCT Oncology is launching a BMTCI Program (Hematopoietic Stem Cell Transplantation &amp; Cellular Immunotherapy) at the Centro Comprensivo de Cancer de la Universidad de Puerto Rico (CCCUPR), with clinical operations beginning August 2026. OncoCel LLC provides strategic, operational, and research infrastructure support to the program.</w:t>
+        <w:t>OncoCel LLC is launching a BMTCI Program (Hematopoietic Stem Cell Transplantation &amp; Cellular Immunotherapy) at the Centro Comprensivo de Cancer de la Universidad de Puerto Rico (CCCUPR), with clinical operations beginning August 2026. The program will deliver autologous HCT, CAR-T cellular therapy, and — in later phases — allogeneic transplant and gene therapy on-island for the first time.</w:t>
       </w:r>
     </w:p>
     <w:p>
@@ -132,7 +132,7 @@
           <w:color w:val="333333"/>
           <w:sz w:val="18"/>
         </w:rPr>
-        <w:t>TCT Oncology also operates the established allogeneic HSCT program and CIBMTR reporting infrastructure at Auxilio Mutuo Hospital (HAM). Together, TCT Oncology and OncoCel create Puerto Rico's first comprehensive cellular therapy network — with CCCUPR handling autologous HCT and CAR-T, and HAM continuing as the allo-HSCT center.</w:t>
+        <w:t>OncoCel works with TCT Oncology, which operates the established allogeneic HSCT program and CIBMTR reporting infrastructure at Auxilio Mutuo Hospital (HAM). This collaboration creates Puerto Rico's first comprehensive cellular therapy network — with CCCUPR handling autologous HCT and CAR-T, and HAM continuing as the allo-HSCT center through TCT Oncology.</w:t>
       </w:r>
     </w:p>
     <w:p>
@@ -143,7 +143,7 @@
           <w:color w:val="333333"/>
           <w:sz w:val="18"/>
         </w:rPr>
-        <w:t>ARC is the only FACT-accredited apheresis and cell processing provider on the island. As TCT Oncology scales across both sites with OncoCel support, ARC's collection and processing volume will increase significantly.</w:t>
+        <w:t>ARC is the only FACT-accredited apheresis and cell processing provider on the island. As OncoCel scales the BMTCI Program at CCCUPR and referral volume to HAM increases, ARC's collection and processing workload will grow significantly.</w:t>
       </w:r>
     </w:p>
     <w:p>
@@ -160,7 +160,7 @@
           <w:color w:val="0C2340"/>
           <w:sz w:val="17"/>
         </w:rPr>
-        <w:t>Purpose: Provide ARC advance notice of anticipated volume growth across TCT Oncology at CCCUPR and HAM — supported by OncoCel — to enable capacity planning, contract scope review, and service continuity.</w:t>
+        <w:t>Purpose: Provide ARC advance notice of anticipated volume growth driven by OncoCel's BMTCI Program at CCCUPR and the associated referral pipeline to HAM, enabling capacity planning, contract scope review, and service continuity.</w:t>
       </w:r>
     </w:p>
     <w:p>
@@ -751,7 +751,7 @@
           <w:color w:val="333333"/>
           <w:sz w:val="17"/>
         </w:rPr>
-        <w:t>TCT Oncology also operates the allogeneic HSCT program at Auxilio Mutuo Hospital (HAM). Patients identified at CCCUPR who need allo-HSCT will be referred to HAM, generating additional donor collection volume for ARC across both sites.</w:t>
+        <w:t>OncoCel works with TCT Oncology at Auxilio Mutuo Hospital (HAM) for allogeneic HSCT. Patients identified at CCCUPR who need allo-HSCT will be referred to HAM through TCT Oncology, generating additional donor collection volume for ARC.</w:t>
       </w:r>
     </w:p>
     <w:p>
@@ -2357,7 +2357,7 @@
           <w:color w:val="333333"/>
           <w:sz w:val="18"/>
         </w:rPr>
-        <w:t>OncoCel, on behalf of TCT Oncology, requests ARC confirm coverage for the following services:</w:t>
+        <w:t>OncoCel requests ARC confirm coverage for the following services as the program scales:</w:t>
       </w:r>
     </w:p>
     <w:tbl>
@@ -3215,7 +3215,7 @@
                 <w:color w:val="FFFFFF"/>
                 <w:sz w:val="16"/>
               </w:rPr>
-              <w:t>With TCT/OncoCel (Year 5)</w:t>
+              <w:t>With OncoCel Program (Year 5)</w:t>
             </w:r>
           </w:p>
         </w:tc>
@@ -3849,7 +3849,7 @@
           <w:color w:val="0C2340"/>
           <w:sz w:val="17"/>
         </w:rPr>
-        <w:t>ARC is positioned as the sole on-island partner for this growth. No other FACT-accredited provider in Puerto Rico can support the apheresis and cell processing requirements of TCT Oncology's cellular therapy network.</w:t>
+        <w:t>ARC is positioned as the sole on-island partner for this growth. No other FACT-accredited provider in Puerto Rico can support the apheresis and cell processing requirements of OncoCel's cellular therapy program.</w:t>
       </w:r>
     </w:p>
     <w:p>
@@ -4054,7 +4054,7 @@
                 <w:color w:val="333333"/>
                 <w:sz w:val="16"/>
               </w:rPr>
-              <w:t>TCT Oncology launches BMTCI at CCCUPR</w:t>
+              <w:t>OncoCel launches BMTCI at CCCUPR</w:t>
             </w:r>
           </w:p>
         </w:tc>
@@ -4351,7 +4351,7 @@
                 <w:color w:val="333333"/>
                 <w:sz w:val="16"/>
               </w:rPr>
-              <w:t>Allo-HSCT donor collections ramp (HAM)</w:t>
+              <w:t>Allo-HSCT donor collections ramp (HAM via TCT)</w:t>
             </w:r>
           </w:p>
         </w:tc>
@@ -4605,7 +4605,7 @@
           <w:color w:val="007C8A"/>
           <w:sz w:val="18"/>
         </w:rPr>
-        <w:t>OncoCel, on behalf of TCT Oncology, proposes a meeting with ARC leadership to:</w:t>
+        <w:t>OncoCel proposes a meeting with ARC leadership to:</w:t>
       </w:r>
     </w:p>
     <w:p>
@@ -4727,7 +4727,7 @@
           <w:color w:val="999999"/>
           <w:sz w:val="15"/>
         </w:rPr>
-        <w:t>Supporting TCT Oncology at CCCUPR and Auxilio Mutuo Hospital</w:t>
+        <w:t>Bone Marrow Transplant  ·  Cellular Therapy  ·  Research</w:t>
       </w:r>
     </w:p>
     <w:p>

</xml_diff>

<commit_message>
Correct OncoCel/TCT roles: ambulatory vs inpatient
OncoCel = ambulatory center for outpatient BMTCI and research.
TCT Oncology = inpatient services at CCCUPR (new BMTCI program)
and HAM (established allo-HSCT). ARC serves collections across
all three sites in this ambulatory + inpatient network.

https://claude.ai/code/session_01D1GqSzvzsb5T4NMhTpgnob
</commit_message>
<xml_diff>
--- a/output/OncoCel_ARC_Volume_Notification.docx
+++ b/output/OncoCel_ARC_Volume_Notification.docx
@@ -121,7 +121,7 @@
           <w:color w:val="333333"/>
           <w:sz w:val="18"/>
         </w:rPr>
-        <w:t>OncoCel LLC is launching a BMTCI Program (Hematopoietic Stem Cell Transplantation &amp; Cellular Immunotherapy) at the Centro Comprensivo de Cancer de la Universidad de Puerto Rico (CCCUPR), with clinical operations beginning August 2026. The program will deliver autologous HCT, CAR-T cellular therapy, and — in later phases — allogeneic transplant and gene therapy on-island for the first time.</w:t>
+        <w:t>OncoCel LLC is Puerto Rico's first ambulatory bone marrow transplant and cellular therapy center, focused on outpatient BMTCI services and clinical research. Based in San Juan, OncoCel delivers autologous HCT, CAR-T cellular therapy, and — in later phases — gene therapy in an ambulatory setting, with daily monitoring and 24/7 physician availability.</w:t>
       </w:r>
     </w:p>
     <w:p>
@@ -132,7 +132,7 @@
           <w:color w:val="333333"/>
           <w:sz w:val="18"/>
         </w:rPr>
-        <w:t>OncoCel works with TCT Oncology, which operates the established allogeneic HSCT program and CIBMTR reporting infrastructure at Auxilio Mutuo Hospital (HAM). This collaboration creates Puerto Rico's first comprehensive cellular therapy network — with CCCUPR handling autologous HCT and CAR-T, and HAM continuing as the allo-HSCT center through TCT Oncology.</w:t>
+        <w:t>OncoCel collaborates with TCT Oncology, which provides inpatient transplant services at two hospital sites: the Centro Comprensivo de Cancer de la Universidad de Puerto Rico (CCCUPR), where TCT is launching a new inpatient BMTCI program effective August 2026, and Auxilio Mutuo Hospital (HAM), where TCT operates the established allogeneic HSCT program and CIBMTR reporting infrastructure.</w:t>
       </w:r>
     </w:p>
     <w:p>
@@ -143,7 +143,18 @@
           <w:color w:val="333333"/>
           <w:sz w:val="18"/>
         </w:rPr>
-        <w:t>ARC is the only FACT-accredited apheresis and cell processing provider on the island. As OncoCel scales the BMTCI Program at CCCUPR and referral volume to HAM increases, ARC's collection and processing workload will grow significantly.</w:t>
+        <w:t>Together, OncoCel (ambulatory) and TCT Oncology (inpatient at CCCUPR and HAM) create Puerto Rico's first comprehensive cellular therapy network. Both the ambulatory and inpatient programs require ARC apheresis and cell processing services.</w:t>
+      </w:r>
+    </w:p>
+    <w:p>
+      <w:r>
+        <w:rPr>
+          <w:rFonts w:ascii="Calibri" w:hAnsi="Calibri"/>
+          <w:b w:val="0"/>
+          <w:color w:val="333333"/>
+          <w:sz w:val="18"/>
+        </w:rPr>
+        <w:t>ARC is the only FACT-accredited apheresis and cell processing provider on the island. As this network scales, ARC's collection and processing volume will increase significantly across all three sites.</w:t>
       </w:r>
     </w:p>
     <w:p>
@@ -160,7 +171,7 @@
           <w:color w:val="0C2340"/>
           <w:sz w:val="17"/>
         </w:rPr>
-        <w:t>Purpose: Provide ARC advance notice of anticipated volume growth driven by OncoCel's BMTCI Program at CCCUPR and the associated referral pipeline to HAM, enabling capacity planning, contract scope review, and service continuity.</w:t>
+        <w:t>Purpose: Provide ARC advance notice of anticipated volume growth driven by OncoCel's ambulatory program and TCT Oncology's inpatient programs at CCCUPR and HAM, enabling capacity planning, contract scope review, and service continuity.</w:t>
       </w:r>
     </w:p>
     <w:p>
@@ -751,7 +762,7 @@
           <w:color w:val="333333"/>
           <w:sz w:val="17"/>
         </w:rPr>
-        <w:t>OncoCel works with TCT Oncology at Auxilio Mutuo Hospital (HAM) for allogeneic HSCT. Patients identified at CCCUPR who need allo-HSCT will be referred to HAM through TCT Oncology, generating additional donor collection volume for ARC.</w:t>
+        <w:t>OncoCel's ambulatory center handles outpatient autologous HCT and CAR-T. TCT Oncology provides inpatient services at CCCUPR (auto-HCT, CAR-T requiring admission) and at HAM (allogeneic HSCT). Patients needing allo-HSCT are referred to HAM through TCT Oncology. ARC supports collections across all sites.</w:t>
       </w:r>
     </w:p>
     <w:p>
@@ -1003,7 +1014,7 @@
                 <w:color w:val="0C2340"/>
                 <w:sz w:val="16"/>
               </w:rPr>
-              <w:t>Autologous HSC collections (CCCUPR)</w:t>
+              <w:t>Autologous HSC collections (OncoCel + CCCUPR)</w:t>
             </w:r>
           </w:p>
         </w:tc>
@@ -1166,7 +1177,7 @@
                 <w:color w:val="0C2340"/>
                 <w:sz w:val="16"/>
               </w:rPr>
-              <w:t>CAR-T leukapheresis (CCCUPR)</w:t>
+              <w:t>CAR-T leukapheresis (OncoCel + CCCUPR)</w:t>
             </w:r>
           </w:p>
         </w:tc>
@@ -1329,7 +1340,7 @@
                 <w:color w:val="0C2340"/>
                 <w:sz w:val="16"/>
               </w:rPr>
-              <w:t>Allo donor collections (HAM via TCT)</w:t>
+              <w:t>Allo donor collections (HAM — TCT inpatient)</w:t>
             </w:r>
           </w:p>
         </w:tc>
@@ -3849,7 +3860,7 @@
           <w:color w:val="0C2340"/>
           <w:sz w:val="17"/>
         </w:rPr>
-        <w:t>ARC is positioned as the sole on-island partner for this growth. No other FACT-accredited provider in Puerto Rico can support the apheresis and cell processing requirements of OncoCel's cellular therapy program.</w:t>
+        <w:t>ARC is positioned as the sole on-island partner for this growth. No other FACT-accredited provider in Puerto Rico can support the apheresis and cell processing requirements of OncoCel's ambulatory program and TCT Oncology's inpatient programs at CCCUPR and HAM.</w:t>
       </w:r>
     </w:p>
     <w:p>
@@ -4054,7 +4065,7 @@
                 <w:color w:val="333333"/>
                 <w:sz w:val="16"/>
               </w:rPr>
-              <w:t>OncoCel launches BMTCI at CCCUPR</w:t>
+              <w:t>TCT inpatient program launches at CCCUPR; OncoCel ambulatory center active</w:t>
             </w:r>
           </w:p>
         </w:tc>
@@ -4351,7 +4362,7 @@
                 <w:color w:val="333333"/>
                 <w:sz w:val="16"/>
               </w:rPr>
-              <w:t>Allo-HSCT donor collections ramp (HAM via TCT)</w:t>
+              <w:t>Allo-HSCT donor collections ramp (HAM — TCT inpatient)</w:t>
             </w:r>
           </w:p>
         </w:tc>

</xml_diff>

<commit_message>
Scope ARC document to OncoCel ambulatory volumes only
Program table: auto HCT Y1 8-10 / Y2 15-20, research CAR-T Y1 4-6 /
Y2 8-10, zero allo and zero donor search. ARC volumes shown as +new
above baseline. Added island-wide summary table at end showing total
PR volume increase as mainland patients retained on-island.

https://claude.ai/code/session_01D1GqSzvzsb5T4NMhTpgnob
</commit_message>
<xml_diff>
--- a/output/OncoCel_ARC_Volume_Notification.docx
+++ b/output/OncoCel_ARC_Volume_Notification.docx
@@ -191,7 +191,7 @@
           <w:color w:val="0C2340"/>
           <w:sz w:val="26"/>
         </w:rPr>
-        <w:t>PROGRAM PHASES</w:t>
+        <w:t>ONCOCEL AMBULATORY PROGRAM</w:t>
       </w:r>
     </w:p>
     <w:p>
@@ -201,6 +201,17 @@
         </w:pBdr>
       </w:pPr>
     </w:p>
+    <w:p>
+      <w:r>
+        <w:rPr>
+          <w:rFonts w:ascii="Calibri" w:hAnsi="Calibri"/>
+          <w:b w:val="0"/>
+          <w:color w:val="333333"/>
+          <w:sz w:val="18"/>
+        </w:rPr>
+        <w:t>OncoCel's ambulatory center focuses exclusively on outpatient autologous HCT and research CAR-T. OncoCel does not perform allogeneic transplant or donor search — those services are provided by TCT Oncology at its inpatient hospital sites.</w:t>
+      </w:r>
+    </w:p>
     <w:tbl>
       <w:tblPr>
         <w:tblW w:type="auto" w:w="0"/>
@@ -209,15 +220,14 @@
         <w:tblLook w:firstColumn="1" w:firstRow="1" w:lastColumn="0" w:lastRow="0" w:noHBand="0" w:noVBand="1" w:val="04A0"/>
       </w:tblPr>
       <w:tblGrid>
-        <w:gridCol w:w="2436"/>
-        <w:gridCol w:w="2436"/>
-        <w:gridCol w:w="2436"/>
-        <w:gridCol w:w="2436"/>
+        <w:gridCol w:w="3249"/>
+        <w:gridCol w:w="3249"/>
+        <w:gridCol w:w="3249"/>
       </w:tblGrid>
       <w:tr>
         <w:tc>
           <w:tcPr>
-            <w:tcW w:type="dxa" w:w="2436"/>
+            <w:tcW w:type="dxa" w:w="3249"/>
             <w:shd w:fill="007C8A"/>
             <w:tcBorders>
               <w:top w:val="single" w:sz="2" w:space="0" w:color="007C8A"/>
@@ -244,13 +254,13 @@
                 <w:color w:val="FFFFFF"/>
                 <w:sz w:val="16"/>
               </w:rPr>
-              <w:t>Phase</w:t>
+              <w:t>OncoCel Program</w:t>
             </w:r>
           </w:p>
         </w:tc>
         <w:tc>
           <w:tcPr>
-            <w:tcW w:type="dxa" w:w="2436"/>
+            <w:tcW w:type="dxa" w:w="3249"/>
             <w:shd w:fill="007C8A"/>
             <w:tcBorders>
               <w:top w:val="single" w:sz="2" w:space="0" w:color="007C8A"/>
@@ -277,13 +287,13 @@
                 <w:color w:val="FFFFFF"/>
                 <w:sz w:val="16"/>
               </w:rPr>
-              <w:t>Timeline</w:t>
+              <w:t>Year 1</w:t>
             </w:r>
           </w:p>
         </w:tc>
         <w:tc>
           <w:tcPr>
-            <w:tcW w:type="dxa" w:w="2436"/>
+            <w:tcW w:type="dxa" w:w="3249"/>
             <w:shd w:fill="007C8A"/>
             <w:tcBorders>
               <w:top w:val="single" w:sz="2" w:space="0" w:color="007C8A"/>
@@ -310,40 +320,7 @@
                 <w:color w:val="FFFFFF"/>
                 <w:sz w:val="16"/>
               </w:rPr>
-              <w:t>Scope</w:t>
-            </w:r>
-          </w:p>
-        </w:tc>
-        <w:tc>
-          <w:tcPr>
-            <w:tcW w:type="dxa" w:w="2436"/>
-            <w:shd w:fill="007C8A"/>
-            <w:tcBorders>
-              <w:top w:val="single" w:sz="2" w:space="0" w:color="007C8A"/>
-              <w:bottom w:val="single" w:sz="2" w:space="0" w:color="007C8A"/>
-              <w:left w:val="single" w:sz="2" w:space="0" w:color="007C8A"/>
-              <w:right w:val="single" w:sz="2" w:space="0" w:color="007C8A"/>
-            </w:tcBorders>
-            <w:tcMar>
-              <w:top w:w="45" w:type="dxa"/>
-              <w:bottom w:w="45" w:type="dxa"/>
-              <w:left w:w="80" w:type="dxa"/>
-              <w:right w:w="80" w:type="dxa"/>
-            </w:tcMar>
-          </w:tcPr>
-          <w:p>
-            <w:pPr>
-              <w:jc w:val="center"/>
-            </w:pPr>
-            <w:r/>
-            <w:r>
-              <w:rPr>
-                <w:rFonts w:ascii="Calibri" w:hAnsi="Calibri"/>
-                <w:b/>
-                <w:color w:val="FFFFFF"/>
-                <w:sz w:val="16"/>
-              </w:rPr>
-              <w:t>Volume Target</w:t>
+              <w:t>Year 2</w:t>
             </w:r>
           </w:p>
         </w:tc>
@@ -351,7 +328,7 @@
       <w:tr>
         <w:tc>
           <w:tcPr>
-            <w:tcW w:type="dxa" w:w="2436"/>
+            <w:tcW w:type="dxa" w:w="3249"/>
             <w:shd w:fill="FFFFFF"/>
             <w:tcBorders>
               <w:top w:val="single" w:sz="2" w:space="0" w:color="D8D8D8"/>
@@ -378,13 +355,13 @@
                 <w:color w:val="0C2340"/>
                 <w:sz w:val="16"/>
               </w:rPr>
-              <w:t>Phase 1</w:t>
+              <w:t>Autologous HCT (Phase I)</w:t>
             </w:r>
           </w:p>
         </w:tc>
         <w:tc>
           <w:tcPr>
-            <w:tcW w:type="dxa" w:w="2436"/>
+            <w:tcW w:type="dxa" w:w="3249"/>
             <w:shd w:fill="FFFFFF"/>
             <w:tcBorders>
               <w:top w:val="single" w:sz="2" w:space="0" w:color="D8D8D8"/>
@@ -410,13 +387,13 @@
                 <w:color w:val="333333"/>
                 <w:sz w:val="16"/>
               </w:rPr>
-              <w:t>Year 1 (Aug 2026–2027)</w:t>
+              <w:t>8–10</w:t>
             </w:r>
           </w:p>
         </w:tc>
         <w:tc>
           <w:tcPr>
-            <w:tcW w:type="dxa" w:w="2436"/>
+            <w:tcW w:type="dxa" w:w="3249"/>
             <w:shd w:fill="FFFFFF"/>
             <w:tcBorders>
               <w:top w:val="single" w:sz="2" w:space="0" w:color="D8D8D8"/>
@@ -442,39 +419,7 @@
                 <w:color w:val="333333"/>
                 <w:sz w:val="16"/>
               </w:rPr>
-              <w:t>Autologous HCT</w:t>
-            </w:r>
-          </w:p>
-        </w:tc>
-        <w:tc>
-          <w:tcPr>
-            <w:tcW w:type="dxa" w:w="2436"/>
-            <w:shd w:fill="FFFFFF"/>
-            <w:tcBorders>
-              <w:top w:val="single" w:sz="2" w:space="0" w:color="D8D8D8"/>
-              <w:bottom w:val="single" w:sz="2" w:space="0" w:color="D8D8D8"/>
-              <w:left w:val="single" w:sz="2" w:space="0" w:color="D8D8D8"/>
-              <w:right w:val="single" w:sz="2" w:space="0" w:color="D8D8D8"/>
-            </w:tcBorders>
-            <w:tcMar>
-              <w:top w:w="45" w:type="dxa"/>
-              <w:bottom w:w="45" w:type="dxa"/>
-              <w:left w:w="80" w:type="dxa"/>
-              <w:right w:w="80" w:type="dxa"/>
-            </w:tcMar>
-          </w:tcPr>
-          <w:p>
-            <w:pPr>
-              <w:jc w:val="center"/>
-            </w:pPr>
-            <w:r/>
-            <w:r>
-              <w:rPr>
-                <w:rFonts w:ascii="Calibri" w:hAnsi="Calibri"/>
-                <w:color w:val="333333"/>
-                <w:sz w:val="16"/>
-              </w:rPr>
-              <w:t>10–15 auto-HCTs</w:t>
+              <w:t>15–20</w:t>
             </w:r>
           </w:p>
         </w:tc>
@@ -482,7 +427,7 @@
       <w:tr>
         <w:tc>
           <w:tcPr>
-            <w:tcW w:type="dxa" w:w="2436"/>
+            <w:tcW w:type="dxa" w:w="3249"/>
             <w:shd w:fill="F4F7F8"/>
             <w:tcBorders>
               <w:top w:val="single" w:sz="2" w:space="0" w:color="D8D8D8"/>
@@ -509,13 +454,13 @@
                 <w:color w:val="0C2340"/>
                 <w:sz w:val="16"/>
               </w:rPr>
-              <w:t>Phase 2</w:t>
+              <w:t>Research CAR-T</w:t>
             </w:r>
           </w:p>
         </w:tc>
         <w:tc>
           <w:tcPr>
-            <w:tcW w:type="dxa" w:w="2436"/>
+            <w:tcW w:type="dxa" w:w="3249"/>
             <w:shd w:fill="F4F7F8"/>
             <w:tcBorders>
               <w:top w:val="single" w:sz="2" w:space="0" w:color="D8D8D8"/>
@@ -541,13 +486,13 @@
                 <w:color w:val="333333"/>
                 <w:sz w:val="16"/>
               </w:rPr>
-              <w:t>Year 2–3 (2028–2029)</w:t>
+              <w:t>4–6</w:t>
             </w:r>
           </w:p>
         </w:tc>
         <w:tc>
           <w:tcPr>
-            <w:tcW w:type="dxa" w:w="2436"/>
+            <w:tcW w:type="dxa" w:w="3249"/>
             <w:shd w:fill="F4F7F8"/>
             <w:tcBorders>
               <w:top w:val="single" w:sz="2" w:space="0" w:color="D8D8D8"/>
@@ -573,40 +518,7 @@
                 <w:color w:val="333333"/>
                 <w:sz w:val="16"/>
               </w:rPr>
-              <w:t>+ CAR-T + Donor Search</w:t>
-            </w:r>
-          </w:p>
-        </w:tc>
-        <w:tc>
-          <w:tcPr>
-            <w:tcW w:type="dxa" w:w="2436"/>
-            <w:shd w:fill="F4F7F8"/>
-            <w:tcBorders>
-              <w:top w:val="single" w:sz="2" w:space="0" w:color="D8D8D8"/>
-              <w:bottom w:val="single" w:sz="2" w:space="0" w:color="D8D8D8"/>
-              <w:left w:val="single" w:sz="2" w:space="0" w:color="D8D8D8"/>
-              <w:right w:val="single" w:sz="2" w:space="0" w:color="D8D8D8"/>
-            </w:tcBorders>
-            <w:tcMar>
-              <w:top w:w="45" w:type="dxa"/>
-              <w:bottom w:w="45" w:type="dxa"/>
-              <w:left w:w="80" w:type="dxa"/>
-              <w:right w:w="80" w:type="dxa"/>
-            </w:tcMar>
-          </w:tcPr>
-          <w:p>
-            <w:pPr>
-              <w:jc w:val="center"/>
-            </w:pPr>
-            <w:r/>
-            <w:r>
-              <w:rPr>
-                <w:rFonts w:ascii="Calibri" w:hAnsi="Calibri"/>
-                <w:b/>
-                <w:color w:val="1E8849"/>
-                <w:sz w:val="16"/>
-              </w:rPr>
-              <w:t>20–30+ transplants/yr</w:t>
+              <w:t>8–10</w:t>
             </w:r>
           </w:p>
         </w:tc>
@@ -614,7 +526,7 @@
       <w:tr>
         <w:tc>
           <w:tcPr>
-            <w:tcW w:type="dxa" w:w="2436"/>
+            <w:tcW w:type="dxa" w:w="3249"/>
             <w:shd w:fill="FFFFFF"/>
             <w:tcBorders>
               <w:top w:val="single" w:sz="2" w:space="0" w:color="D8D8D8"/>
@@ -641,46 +553,13 @@
                 <w:color w:val="0C2340"/>
                 <w:sz w:val="16"/>
               </w:rPr>
-              <w:t>Phase 3</w:t>
+              <w:t>Allogeneic HSCT</w:t>
             </w:r>
           </w:p>
         </w:tc>
         <w:tc>
           <w:tcPr>
-            <w:tcW w:type="dxa" w:w="2436"/>
-            <w:shd w:fill="FFFFFF"/>
-            <w:tcBorders>
-              <w:top w:val="single" w:sz="2" w:space="0" w:color="D8D8D8"/>
-              <w:bottom w:val="single" w:sz="2" w:space="0" w:color="D8D8D8"/>
-              <w:left w:val="single" w:sz="2" w:space="0" w:color="D8D8D8"/>
-              <w:right w:val="single" w:sz="2" w:space="0" w:color="D8D8D8"/>
-            </w:tcBorders>
-            <w:tcMar>
-              <w:top w:w="45" w:type="dxa"/>
-              <w:bottom w:w="45" w:type="dxa"/>
-              <w:left w:w="80" w:type="dxa"/>
-              <w:right w:w="80" w:type="dxa"/>
-            </w:tcMar>
-          </w:tcPr>
-          <w:p>
-            <w:pPr>
-              <w:jc w:val="center"/>
-            </w:pPr>
-            <w:r/>
-            <w:r>
-              <w:rPr>
-                <w:rFonts w:ascii="Calibri" w:hAnsi="Calibri"/>
-                <w:b/>
-                <w:color w:val="1E8849"/>
-                <w:sz w:val="16"/>
-              </w:rPr>
-              <w:t>Year 3+ (2029+)</w:t>
-            </w:r>
-          </w:p>
-        </w:tc>
-        <w:tc>
-          <w:tcPr>
-            <w:tcW w:type="dxa" w:w="2436"/>
+            <w:tcW w:type="dxa" w:w="3249"/>
             <w:shd w:fill="FFFFFF"/>
             <w:tcBorders>
               <w:top w:val="single" w:sz="2" w:space="0" w:color="D8D8D8"/>
@@ -706,13 +585,13 @@
                 <w:color w:val="333333"/>
                 <w:sz w:val="16"/>
               </w:rPr>
-              <w:t>+ Allogeneic HCT + Gene Therapy</w:t>
+              <w:t>0</w:t>
             </w:r>
           </w:p>
         </w:tc>
         <w:tc>
           <w:tcPr>
-            <w:tcW w:type="dxa" w:w="2436"/>
+            <w:tcW w:type="dxa" w:w="3249"/>
             <w:shd w:fill="FFFFFF"/>
             <w:tcBorders>
               <w:top w:val="single" w:sz="2" w:space="0" w:color="D8D8D8"/>
@@ -738,33 +617,212 @@
                 <w:color w:val="333333"/>
                 <w:sz w:val="16"/>
               </w:rPr>
-              <w:t>Full-spectrum program</w:t>
+              <w:t>0</w:t>
+            </w:r>
+          </w:p>
+        </w:tc>
+      </w:tr>
+      <w:tr>
+        <w:tc>
+          <w:tcPr>
+            <w:tcW w:type="dxa" w:w="3249"/>
+            <w:shd w:fill="F4F7F8"/>
+            <w:tcBorders>
+              <w:top w:val="single" w:sz="2" w:space="0" w:color="D8D8D8"/>
+              <w:bottom w:val="single" w:sz="2" w:space="0" w:color="D8D8D8"/>
+              <w:left w:val="single" w:sz="2" w:space="0" w:color="D8D8D8"/>
+              <w:right w:val="single" w:sz="2" w:space="0" w:color="D8D8D8"/>
+            </w:tcBorders>
+            <w:tcMar>
+              <w:top w:w="45" w:type="dxa"/>
+              <w:bottom w:w="45" w:type="dxa"/>
+              <w:left w:w="80" w:type="dxa"/>
+              <w:right w:w="80" w:type="dxa"/>
+            </w:tcMar>
+          </w:tcPr>
+          <w:p>
+            <w:pPr>
+              <w:jc w:val="left"/>
+            </w:pPr>
+            <w:r/>
+            <w:r>
+              <w:rPr>
+                <w:rFonts w:ascii="Calibri" w:hAnsi="Calibri"/>
+                <w:b/>
+                <w:color w:val="0C2340"/>
+                <w:sz w:val="16"/>
+              </w:rPr>
+              <w:t>Donor search</w:t>
+            </w:r>
+          </w:p>
+        </w:tc>
+        <w:tc>
+          <w:tcPr>
+            <w:tcW w:type="dxa" w:w="3249"/>
+            <w:shd w:fill="F4F7F8"/>
+            <w:tcBorders>
+              <w:top w:val="single" w:sz="2" w:space="0" w:color="D8D8D8"/>
+              <w:bottom w:val="single" w:sz="2" w:space="0" w:color="D8D8D8"/>
+              <w:left w:val="single" w:sz="2" w:space="0" w:color="D8D8D8"/>
+              <w:right w:val="single" w:sz="2" w:space="0" w:color="D8D8D8"/>
+            </w:tcBorders>
+            <w:tcMar>
+              <w:top w:w="45" w:type="dxa"/>
+              <w:bottom w:w="45" w:type="dxa"/>
+              <w:left w:w="80" w:type="dxa"/>
+              <w:right w:w="80" w:type="dxa"/>
+            </w:tcMar>
+          </w:tcPr>
+          <w:p>
+            <w:pPr>
+              <w:jc w:val="center"/>
+            </w:pPr>
+            <w:r/>
+            <w:r>
+              <w:rPr>
+                <w:rFonts w:ascii="Calibri" w:hAnsi="Calibri"/>
+                <w:color w:val="333333"/>
+                <w:sz w:val="16"/>
+              </w:rPr>
+              <w:t>0</w:t>
+            </w:r>
+          </w:p>
+        </w:tc>
+        <w:tc>
+          <w:tcPr>
+            <w:tcW w:type="dxa" w:w="3249"/>
+            <w:shd w:fill="F4F7F8"/>
+            <w:tcBorders>
+              <w:top w:val="single" w:sz="2" w:space="0" w:color="D8D8D8"/>
+              <w:bottom w:val="single" w:sz="2" w:space="0" w:color="D8D8D8"/>
+              <w:left w:val="single" w:sz="2" w:space="0" w:color="D8D8D8"/>
+              <w:right w:val="single" w:sz="2" w:space="0" w:color="D8D8D8"/>
+            </w:tcBorders>
+            <w:tcMar>
+              <w:top w:w="45" w:type="dxa"/>
+              <w:bottom w:w="45" w:type="dxa"/>
+              <w:left w:w="80" w:type="dxa"/>
+              <w:right w:w="80" w:type="dxa"/>
+            </w:tcMar>
+          </w:tcPr>
+          <w:p>
+            <w:pPr>
+              <w:jc w:val="center"/>
+            </w:pPr>
+            <w:r/>
+            <w:r>
+              <w:rPr>
+                <w:rFonts w:ascii="Calibri" w:hAnsi="Calibri"/>
+                <w:color w:val="333333"/>
+                <w:sz w:val="16"/>
+              </w:rPr>
+              <w:t>0</w:t>
+            </w:r>
+          </w:p>
+        </w:tc>
+      </w:tr>
+      <w:tr>
+        <w:tc>
+          <w:tcPr>
+            <w:tcW w:type="dxa" w:w="3249"/>
+            <w:shd w:fill="E6F2F2"/>
+            <w:tcBorders>
+              <w:top w:val="single" w:sz="2" w:space="0" w:color="D8D8D8"/>
+              <w:bottom w:val="single" w:sz="2" w:space="0" w:color="D8D8D8"/>
+              <w:left w:val="single" w:sz="2" w:space="0" w:color="D8D8D8"/>
+              <w:right w:val="single" w:sz="2" w:space="0" w:color="D8D8D8"/>
+            </w:tcBorders>
+            <w:tcMar>
+              <w:top w:w="45" w:type="dxa"/>
+              <w:bottom w:w="45" w:type="dxa"/>
+              <w:left w:w="80" w:type="dxa"/>
+              <w:right w:w="80" w:type="dxa"/>
+            </w:tcMar>
+          </w:tcPr>
+          <w:p>
+            <w:pPr>
+              <w:jc w:val="left"/>
+            </w:pPr>
+            <w:r/>
+            <w:r>
+              <w:rPr>
+                <w:rFonts w:ascii="Calibri" w:hAnsi="Calibri"/>
+                <w:b/>
+                <w:color w:val="007C8A"/>
+                <w:sz w:val="16"/>
+              </w:rPr>
+              <w:t>Total OncoCel patients</w:t>
+            </w:r>
+          </w:p>
+        </w:tc>
+        <w:tc>
+          <w:tcPr>
+            <w:tcW w:type="dxa" w:w="3249"/>
+            <w:shd w:fill="E6F2F2"/>
+            <w:tcBorders>
+              <w:top w:val="single" w:sz="2" w:space="0" w:color="D8D8D8"/>
+              <w:bottom w:val="single" w:sz="2" w:space="0" w:color="D8D8D8"/>
+              <w:left w:val="single" w:sz="2" w:space="0" w:color="D8D8D8"/>
+              <w:right w:val="single" w:sz="2" w:space="0" w:color="D8D8D8"/>
+            </w:tcBorders>
+            <w:tcMar>
+              <w:top w:w="45" w:type="dxa"/>
+              <w:bottom w:w="45" w:type="dxa"/>
+              <w:left w:w="80" w:type="dxa"/>
+              <w:right w:w="80" w:type="dxa"/>
+            </w:tcMar>
+          </w:tcPr>
+          <w:p>
+            <w:pPr>
+              <w:jc w:val="center"/>
+            </w:pPr>
+            <w:r/>
+            <w:r>
+              <w:rPr>
+                <w:rFonts w:ascii="Calibri" w:hAnsi="Calibri"/>
+                <w:b/>
+                <w:color w:val="007C8A"/>
+                <w:sz w:val="16"/>
+              </w:rPr>
+              <w:t>12–16</w:t>
+            </w:r>
+          </w:p>
+        </w:tc>
+        <w:tc>
+          <w:tcPr>
+            <w:tcW w:type="dxa" w:w="3249"/>
+            <w:shd w:fill="E6F2F2"/>
+            <w:tcBorders>
+              <w:top w:val="single" w:sz="2" w:space="0" w:color="D8D8D8"/>
+              <w:bottom w:val="single" w:sz="2" w:space="0" w:color="D8D8D8"/>
+              <w:left w:val="single" w:sz="2" w:space="0" w:color="D8D8D8"/>
+              <w:right w:val="single" w:sz="2" w:space="0" w:color="D8D8D8"/>
+            </w:tcBorders>
+            <w:tcMar>
+              <w:top w:w="45" w:type="dxa"/>
+              <w:bottom w:w="45" w:type="dxa"/>
+              <w:left w:w="80" w:type="dxa"/>
+              <w:right w:w="80" w:type="dxa"/>
+            </w:tcMar>
+          </w:tcPr>
+          <w:p>
+            <w:pPr>
+              <w:jc w:val="center"/>
+            </w:pPr>
+            <w:r/>
+            <w:r>
+              <w:rPr>
+                <w:rFonts w:ascii="Calibri" w:hAnsi="Calibri"/>
+                <w:b/>
+                <w:color w:val="007C8A"/>
+                <w:sz w:val="16"/>
+              </w:rPr>
+              <w:t>23–30</w:t>
             </w:r>
           </w:p>
         </w:tc>
       </w:tr>
     </w:tbl>
-    <w:p>
-      <w:r>
-        <w:rPr>
-          <w:rFonts w:ascii="Calibri" w:hAnsi="Calibri"/>
-          <w:b w:val="0"/>
-          <w:color w:val="333333"/>
-          <w:sz w:val="18"/>
-        </w:rPr>
-      </w:r>
-    </w:p>
-    <w:p>
-      <w:r>
-        <w:rPr>
-          <w:rFonts w:ascii="Calibri" w:hAnsi="Calibri"/>
-          <w:b w:val="0"/>
-          <w:color w:val="333333"/>
-          <w:sz w:val="17"/>
-        </w:rPr>
-        <w:t>OncoCel's ambulatory center handles outpatient autologous HCT and CAR-T. TCT Oncology provides inpatient services at CCCUPR (auto-HCT, CAR-T requiring admission) and at HAM (allogeneic HSCT). Patients needing allo-HSCT are referred to HAM through TCT Oncology. ARC supports collections across all sites.</w:t>
-      </w:r>
-    </w:p>
     <w:p>
       <w:r>
         <w:rPr>
@@ -782,7 +840,7 @@
           <w:color w:val="0C2340"/>
           <w:sz w:val="26"/>
         </w:rPr>
-        <w:t>PROJECTED ARC COLLECTION VOLUMES</w:t>
+        <w:t>ARC VOLUME INCREASE — ONCOCEL AMBULATORY</w:t>
       </w:r>
     </w:p>
     <w:p>
@@ -800,7 +858,7 @@
           <w:color w:val="007C8A"/>
           <w:sz w:val="18"/>
         </w:rPr>
-        <w:t>All volumes below represent new programmatic activity. This is not a redistribution of existing ARC workload.</w:t>
+        <w:t>The following table shows the incremental volume OncoCel will add to ARC's current baseline. These are net-new procedures above existing ARC workload.</w:t>
       </w:r>
     </w:p>
     <w:tbl>
@@ -811,16 +869,14 @@
         <w:tblLook w:firstColumn="1" w:firstRow="1" w:lastColumn="0" w:lastRow="0" w:noHBand="0" w:noVBand="1" w:val="04A0"/>
       </w:tblPr>
       <w:tblGrid>
-        <w:gridCol w:w="1949"/>
-        <w:gridCol w:w="1949"/>
-        <w:gridCol w:w="1949"/>
-        <w:gridCol w:w="1949"/>
-        <w:gridCol w:w="1949"/>
+        <w:gridCol w:w="3249"/>
+        <w:gridCol w:w="3249"/>
+        <w:gridCol w:w="3249"/>
       </w:tblGrid>
       <w:tr>
         <w:tc>
           <w:tcPr>
-            <w:tcW w:type="dxa" w:w="1949"/>
+            <w:tcW w:type="dxa" w:w="3249"/>
             <w:shd w:fill="007C8A"/>
             <w:tcBorders>
               <w:top w:val="single" w:sz="2" w:space="0" w:color="007C8A"/>
@@ -853,7 +909,7 @@
         </w:tc>
         <w:tc>
           <w:tcPr>
-            <w:tcW w:type="dxa" w:w="1949"/>
+            <w:tcW w:type="dxa" w:w="3249"/>
             <w:shd w:fill="007C8A"/>
             <w:tcBorders>
               <w:top w:val="single" w:sz="2" w:space="0" w:color="007C8A"/>
@@ -880,13 +936,13 @@
                 <w:color w:val="FFFFFF"/>
                 <w:sz w:val="16"/>
               </w:rPr>
-              <w:t>Year 1</w:t>
+              <w:t>+Year 1 (new)</w:t>
             </w:r>
           </w:p>
         </w:tc>
         <w:tc>
           <w:tcPr>
-            <w:tcW w:type="dxa" w:w="1949"/>
+            <w:tcW w:type="dxa" w:w="3249"/>
             <w:shd w:fill="007C8A"/>
             <w:tcBorders>
               <w:top w:val="single" w:sz="2" w:space="0" w:color="007C8A"/>
@@ -913,73 +969,7 @@
                 <w:color w:val="FFFFFF"/>
                 <w:sz w:val="16"/>
               </w:rPr>
-              <w:t>Year 2</w:t>
-            </w:r>
-          </w:p>
-        </w:tc>
-        <w:tc>
-          <w:tcPr>
-            <w:tcW w:type="dxa" w:w="1949"/>
-            <w:shd w:fill="007C8A"/>
-            <w:tcBorders>
-              <w:top w:val="single" w:sz="2" w:space="0" w:color="007C8A"/>
-              <w:bottom w:val="single" w:sz="2" w:space="0" w:color="007C8A"/>
-              <w:left w:val="single" w:sz="2" w:space="0" w:color="007C8A"/>
-              <w:right w:val="single" w:sz="2" w:space="0" w:color="007C8A"/>
-            </w:tcBorders>
-            <w:tcMar>
-              <w:top w:w="45" w:type="dxa"/>
-              <w:bottom w:w="45" w:type="dxa"/>
-              <w:left w:w="80" w:type="dxa"/>
-              <w:right w:w="80" w:type="dxa"/>
-            </w:tcMar>
-          </w:tcPr>
-          <w:p>
-            <w:pPr>
-              <w:jc w:val="center"/>
-            </w:pPr>
-            <w:r/>
-            <w:r>
-              <w:rPr>
-                <w:rFonts w:ascii="Calibri" w:hAnsi="Calibri"/>
-                <w:b/>
-                <w:color w:val="FFFFFF"/>
-                <w:sz w:val="16"/>
-              </w:rPr>
-              <w:t>Year 3</w:t>
-            </w:r>
-          </w:p>
-        </w:tc>
-        <w:tc>
-          <w:tcPr>
-            <w:tcW w:type="dxa" w:w="1949"/>
-            <w:shd w:fill="007C8A"/>
-            <w:tcBorders>
-              <w:top w:val="single" w:sz="2" w:space="0" w:color="007C8A"/>
-              <w:bottom w:val="single" w:sz="2" w:space="0" w:color="007C8A"/>
-              <w:left w:val="single" w:sz="2" w:space="0" w:color="007C8A"/>
-              <w:right w:val="single" w:sz="2" w:space="0" w:color="007C8A"/>
-            </w:tcBorders>
-            <w:tcMar>
-              <w:top w:w="45" w:type="dxa"/>
-              <w:bottom w:w="45" w:type="dxa"/>
-              <w:left w:w="80" w:type="dxa"/>
-              <w:right w:w="80" w:type="dxa"/>
-            </w:tcMar>
-          </w:tcPr>
-          <w:p>
-            <w:pPr>
-              <w:jc w:val="center"/>
-            </w:pPr>
-            <w:r/>
-            <w:r>
-              <w:rPr>
-                <w:rFonts w:ascii="Calibri" w:hAnsi="Calibri"/>
-                <w:b/>
-                <w:color w:val="FFFFFF"/>
-                <w:sz w:val="16"/>
-              </w:rPr>
-              <w:t>Year 5</w:t>
+              <w:t>+Year 2 (new)</w:t>
             </w:r>
           </w:p>
         </w:tc>
@@ -987,7 +977,7 @@
       <w:tr>
         <w:tc>
           <w:tcPr>
-            <w:tcW w:type="dxa" w:w="1949"/>
+            <w:tcW w:type="dxa" w:w="3249"/>
             <w:shd w:fill="FFFFFF"/>
             <w:tcBorders>
               <w:top w:val="single" w:sz="2" w:space="0" w:color="D8D8D8"/>
@@ -1014,13 +1004,13 @@
                 <w:color w:val="0C2340"/>
                 <w:sz w:val="16"/>
               </w:rPr>
-              <w:t>Autologous HSC collections (OncoCel + CCCUPR)</w:t>
+              <w:t>Autologous HSC collections</w:t>
             </w:r>
           </w:p>
         </w:tc>
         <w:tc>
           <w:tcPr>
-            <w:tcW w:type="dxa" w:w="1949"/>
+            <w:tcW w:type="dxa" w:w="3249"/>
             <w:shd w:fill="FFFFFF"/>
             <w:tcBorders>
               <w:top w:val="single" w:sz="2" w:space="0" w:color="D8D8D8"/>
@@ -1043,16 +1033,17 @@
             <w:r>
               <w:rPr>
                 <w:rFonts w:ascii="Calibri" w:hAnsi="Calibri"/>
-                <w:color w:val="333333"/>
+                <w:b/>
+                <w:color w:val="1E8849"/>
                 <w:sz w:val="16"/>
               </w:rPr>
-              <w:t>12–18</w:t>
+              <w:t>+8–10</w:t>
             </w:r>
           </w:p>
         </w:tc>
         <w:tc>
           <w:tcPr>
-            <w:tcW w:type="dxa" w:w="1949"/>
+            <w:tcW w:type="dxa" w:w="3249"/>
             <w:shd w:fill="FFFFFF"/>
             <w:tcBorders>
               <w:top w:val="single" w:sz="2" w:space="0" w:color="D8D8D8"/>
@@ -1075,74 +1066,11 @@
             <w:r>
               <w:rPr>
                 <w:rFonts w:ascii="Calibri" w:hAnsi="Calibri"/>
-                <w:color w:val="333333"/>
+                <w:b/>
+                <w:color w:val="1E8849"/>
                 <w:sz w:val="16"/>
               </w:rPr>
-              <w:t>22–32</w:t>
-            </w:r>
-          </w:p>
-        </w:tc>
-        <w:tc>
-          <w:tcPr>
-            <w:tcW w:type="dxa" w:w="1949"/>
-            <w:shd w:fill="FFFFFF"/>
-            <w:tcBorders>
-              <w:top w:val="single" w:sz="2" w:space="0" w:color="D8D8D8"/>
-              <w:bottom w:val="single" w:sz="2" w:space="0" w:color="D8D8D8"/>
-              <w:left w:val="single" w:sz="2" w:space="0" w:color="D8D8D8"/>
-              <w:right w:val="single" w:sz="2" w:space="0" w:color="D8D8D8"/>
-            </w:tcBorders>
-            <w:tcMar>
-              <w:top w:w="45" w:type="dxa"/>
-              <w:bottom w:w="45" w:type="dxa"/>
-              <w:left w:w="80" w:type="dxa"/>
-              <w:right w:w="80" w:type="dxa"/>
-            </w:tcMar>
-          </w:tcPr>
-          <w:p>
-            <w:pPr>
-              <w:jc w:val="center"/>
-            </w:pPr>
-            <w:r/>
-            <w:r>
-              <w:rPr>
-                <w:rFonts w:ascii="Calibri" w:hAnsi="Calibri"/>
-                <w:color w:val="333333"/>
-                <w:sz w:val="16"/>
-              </w:rPr>
-              <w:t>30–42</w:t>
-            </w:r>
-          </w:p>
-        </w:tc>
-        <w:tc>
-          <w:tcPr>
-            <w:tcW w:type="dxa" w:w="1949"/>
-            <w:shd w:fill="FFFFFF"/>
-            <w:tcBorders>
-              <w:top w:val="single" w:sz="2" w:space="0" w:color="D8D8D8"/>
-              <w:bottom w:val="single" w:sz="2" w:space="0" w:color="D8D8D8"/>
-              <w:left w:val="single" w:sz="2" w:space="0" w:color="D8D8D8"/>
-              <w:right w:val="single" w:sz="2" w:space="0" w:color="D8D8D8"/>
-            </w:tcBorders>
-            <w:tcMar>
-              <w:top w:w="45" w:type="dxa"/>
-              <w:bottom w:w="45" w:type="dxa"/>
-              <w:left w:w="80" w:type="dxa"/>
-              <w:right w:w="80" w:type="dxa"/>
-            </w:tcMar>
-          </w:tcPr>
-          <w:p>
-            <w:pPr>
-              <w:jc w:val="center"/>
-            </w:pPr>
-            <w:r/>
-            <w:r>
-              <w:rPr>
-                <w:rFonts w:ascii="Calibri" w:hAnsi="Calibri"/>
-                <w:color w:val="333333"/>
-                <w:sz w:val="16"/>
-              </w:rPr>
-              <w:t>40–55</w:t>
+              <w:t>+15–20</w:t>
             </w:r>
           </w:p>
         </w:tc>
@@ -1150,7 +1078,7 @@
       <w:tr>
         <w:tc>
           <w:tcPr>
-            <w:tcW w:type="dxa" w:w="1949"/>
+            <w:tcW w:type="dxa" w:w="3249"/>
             <w:shd w:fill="F4F7F8"/>
             <w:tcBorders>
               <w:top w:val="single" w:sz="2" w:space="0" w:color="D8D8D8"/>
@@ -1177,13 +1105,13 @@
                 <w:color w:val="0C2340"/>
                 <w:sz w:val="16"/>
               </w:rPr>
-              <w:t>CAR-T leukapheresis (OncoCel + CCCUPR)</w:t>
+              <w:t>Research CAR-T leukapheresis</w:t>
             </w:r>
           </w:p>
         </w:tc>
         <w:tc>
           <w:tcPr>
-            <w:tcW w:type="dxa" w:w="1949"/>
+            <w:tcW w:type="dxa" w:w="3249"/>
             <w:shd w:fill="F4F7F8"/>
             <w:tcBorders>
               <w:top w:val="single" w:sz="2" w:space="0" w:color="D8D8D8"/>
@@ -1206,16 +1134,17 @@
             <w:r>
               <w:rPr>
                 <w:rFonts w:ascii="Calibri" w:hAnsi="Calibri"/>
-                <w:color w:val="333333"/>
+                <w:b/>
+                <w:color w:val="1E8849"/>
                 <w:sz w:val="16"/>
               </w:rPr>
-              <w:t>4–8</w:t>
+              <w:t>+4–6</w:t>
             </w:r>
           </w:p>
         </w:tc>
         <w:tc>
           <w:tcPr>
-            <w:tcW w:type="dxa" w:w="1949"/>
+            <w:tcW w:type="dxa" w:w="3249"/>
             <w:shd w:fill="F4F7F8"/>
             <w:tcBorders>
               <w:top w:val="single" w:sz="2" w:space="0" w:color="D8D8D8"/>
@@ -1238,74 +1167,11 @@
             <w:r>
               <w:rPr>
                 <w:rFonts w:ascii="Calibri" w:hAnsi="Calibri"/>
-                <w:color w:val="333333"/>
+                <w:b/>
+                <w:color w:val="1E8849"/>
                 <w:sz w:val="16"/>
               </w:rPr>
-              <w:t>10–14</w:t>
-            </w:r>
-          </w:p>
-        </w:tc>
-        <w:tc>
-          <w:tcPr>
-            <w:tcW w:type="dxa" w:w="1949"/>
-            <w:shd w:fill="F4F7F8"/>
-            <w:tcBorders>
-              <w:top w:val="single" w:sz="2" w:space="0" w:color="D8D8D8"/>
-              <w:bottom w:val="single" w:sz="2" w:space="0" w:color="D8D8D8"/>
-              <w:left w:val="single" w:sz="2" w:space="0" w:color="D8D8D8"/>
-              <w:right w:val="single" w:sz="2" w:space="0" w:color="D8D8D8"/>
-            </w:tcBorders>
-            <w:tcMar>
-              <w:top w:w="45" w:type="dxa"/>
-              <w:bottom w:w="45" w:type="dxa"/>
-              <w:left w:w="80" w:type="dxa"/>
-              <w:right w:w="80" w:type="dxa"/>
-            </w:tcMar>
-          </w:tcPr>
-          <w:p>
-            <w:pPr>
-              <w:jc w:val="center"/>
-            </w:pPr>
-            <w:r/>
-            <w:r>
-              <w:rPr>
-                <w:rFonts w:ascii="Calibri" w:hAnsi="Calibri"/>
-                <w:color w:val="333333"/>
-                <w:sz w:val="16"/>
-              </w:rPr>
-              <w:t>16–22</w:t>
-            </w:r>
-          </w:p>
-        </w:tc>
-        <w:tc>
-          <w:tcPr>
-            <w:tcW w:type="dxa" w:w="1949"/>
-            <w:shd w:fill="F4F7F8"/>
-            <w:tcBorders>
-              <w:top w:val="single" w:sz="2" w:space="0" w:color="D8D8D8"/>
-              <w:bottom w:val="single" w:sz="2" w:space="0" w:color="D8D8D8"/>
-              <w:left w:val="single" w:sz="2" w:space="0" w:color="D8D8D8"/>
-              <w:right w:val="single" w:sz="2" w:space="0" w:color="D8D8D8"/>
-            </w:tcBorders>
-            <w:tcMar>
-              <w:top w:w="45" w:type="dxa"/>
-              <w:bottom w:w="45" w:type="dxa"/>
-              <w:left w:w="80" w:type="dxa"/>
-              <w:right w:w="80" w:type="dxa"/>
-            </w:tcMar>
-          </w:tcPr>
-          <w:p>
-            <w:pPr>
-              <w:jc w:val="center"/>
-            </w:pPr>
-            <w:r/>
-            <w:r>
-              <w:rPr>
-                <w:rFonts w:ascii="Calibri" w:hAnsi="Calibri"/>
-                <w:color w:val="333333"/>
-                <w:sz w:val="16"/>
-              </w:rPr>
-              <w:t>30–45</w:t>
+              <w:t>+8–10</w:t>
             </w:r>
           </w:p>
         </w:tc>
@@ -1313,540 +1179,7 @@
       <w:tr>
         <w:tc>
           <w:tcPr>
-            <w:tcW w:type="dxa" w:w="1949"/>
-            <w:shd w:fill="FFFFFF"/>
-            <w:tcBorders>
-              <w:top w:val="single" w:sz="2" w:space="0" w:color="D8D8D8"/>
-              <w:bottom w:val="single" w:sz="2" w:space="0" w:color="D8D8D8"/>
-              <w:left w:val="single" w:sz="2" w:space="0" w:color="D8D8D8"/>
-              <w:right w:val="single" w:sz="2" w:space="0" w:color="D8D8D8"/>
-            </w:tcBorders>
-            <w:tcMar>
-              <w:top w:w="45" w:type="dxa"/>
-              <w:bottom w:w="45" w:type="dxa"/>
-              <w:left w:w="80" w:type="dxa"/>
-              <w:right w:w="80" w:type="dxa"/>
-            </w:tcMar>
-          </w:tcPr>
-          <w:p>
-            <w:pPr>
-              <w:jc w:val="left"/>
-            </w:pPr>
-            <w:r/>
-            <w:r>
-              <w:rPr>
-                <w:rFonts w:ascii="Calibri" w:hAnsi="Calibri"/>
-                <w:b/>
-                <w:color w:val="0C2340"/>
-                <w:sz w:val="16"/>
-              </w:rPr>
-              <w:t>Allo donor collections (HAM — TCT inpatient)</w:t>
-            </w:r>
-          </w:p>
-        </w:tc>
-        <w:tc>
-          <w:tcPr>
-            <w:tcW w:type="dxa" w:w="1949"/>
-            <w:shd w:fill="FFFFFF"/>
-            <w:tcBorders>
-              <w:top w:val="single" w:sz="2" w:space="0" w:color="D8D8D8"/>
-              <w:bottom w:val="single" w:sz="2" w:space="0" w:color="D8D8D8"/>
-              <w:left w:val="single" w:sz="2" w:space="0" w:color="D8D8D8"/>
-              <w:right w:val="single" w:sz="2" w:space="0" w:color="D8D8D8"/>
-            </w:tcBorders>
-            <w:tcMar>
-              <w:top w:w="45" w:type="dxa"/>
-              <w:bottom w:w="45" w:type="dxa"/>
-              <w:left w:w="80" w:type="dxa"/>
-              <w:right w:w="80" w:type="dxa"/>
-            </w:tcMar>
-          </w:tcPr>
-          <w:p>
-            <w:pPr>
-              <w:jc w:val="center"/>
-            </w:pPr>
-            <w:r/>
-            <w:r>
-              <w:rPr>
-                <w:rFonts w:ascii="Calibri" w:hAnsi="Calibri"/>
-                <w:color w:val="333333"/>
-                <w:sz w:val="16"/>
-              </w:rPr>
-              <w:t>4–6</w:t>
-            </w:r>
-          </w:p>
-        </w:tc>
-        <w:tc>
-          <w:tcPr>
-            <w:tcW w:type="dxa" w:w="1949"/>
-            <w:shd w:fill="FFFFFF"/>
-            <w:tcBorders>
-              <w:top w:val="single" w:sz="2" w:space="0" w:color="D8D8D8"/>
-              <w:bottom w:val="single" w:sz="2" w:space="0" w:color="D8D8D8"/>
-              <w:left w:val="single" w:sz="2" w:space="0" w:color="D8D8D8"/>
-              <w:right w:val="single" w:sz="2" w:space="0" w:color="D8D8D8"/>
-            </w:tcBorders>
-            <w:tcMar>
-              <w:top w:w="45" w:type="dxa"/>
-              <w:bottom w:w="45" w:type="dxa"/>
-              <w:left w:w="80" w:type="dxa"/>
-              <w:right w:w="80" w:type="dxa"/>
-            </w:tcMar>
-          </w:tcPr>
-          <w:p>
-            <w:pPr>
-              <w:jc w:val="center"/>
-            </w:pPr>
-            <w:r/>
-            <w:r>
-              <w:rPr>
-                <w:rFonts w:ascii="Calibri" w:hAnsi="Calibri"/>
-                <w:color w:val="333333"/>
-                <w:sz w:val="16"/>
-              </w:rPr>
-              <w:t>8–12</w:t>
-            </w:r>
-          </w:p>
-        </w:tc>
-        <w:tc>
-          <w:tcPr>
-            <w:tcW w:type="dxa" w:w="1949"/>
-            <w:shd w:fill="FFFFFF"/>
-            <w:tcBorders>
-              <w:top w:val="single" w:sz="2" w:space="0" w:color="D8D8D8"/>
-              <w:bottom w:val="single" w:sz="2" w:space="0" w:color="D8D8D8"/>
-              <w:left w:val="single" w:sz="2" w:space="0" w:color="D8D8D8"/>
-              <w:right w:val="single" w:sz="2" w:space="0" w:color="D8D8D8"/>
-            </w:tcBorders>
-            <w:tcMar>
-              <w:top w:w="45" w:type="dxa"/>
-              <w:bottom w:w="45" w:type="dxa"/>
-              <w:left w:w="80" w:type="dxa"/>
-              <w:right w:w="80" w:type="dxa"/>
-            </w:tcMar>
-          </w:tcPr>
-          <w:p>
-            <w:pPr>
-              <w:jc w:val="center"/>
-            </w:pPr>
-            <w:r/>
-            <w:r>
-              <w:rPr>
-                <w:rFonts w:ascii="Calibri" w:hAnsi="Calibri"/>
-                <w:color w:val="333333"/>
-                <w:sz w:val="16"/>
-              </w:rPr>
-              <w:t>10–15</w:t>
-            </w:r>
-          </w:p>
-        </w:tc>
-        <w:tc>
-          <w:tcPr>
-            <w:tcW w:type="dxa" w:w="1949"/>
-            <w:shd w:fill="FFFFFF"/>
-            <w:tcBorders>
-              <w:top w:val="single" w:sz="2" w:space="0" w:color="D8D8D8"/>
-              <w:bottom w:val="single" w:sz="2" w:space="0" w:color="D8D8D8"/>
-              <w:left w:val="single" w:sz="2" w:space="0" w:color="D8D8D8"/>
-              <w:right w:val="single" w:sz="2" w:space="0" w:color="D8D8D8"/>
-            </w:tcBorders>
-            <w:tcMar>
-              <w:top w:w="45" w:type="dxa"/>
-              <w:bottom w:w="45" w:type="dxa"/>
-              <w:left w:w="80" w:type="dxa"/>
-              <w:right w:w="80" w:type="dxa"/>
-            </w:tcMar>
-          </w:tcPr>
-          <w:p>
-            <w:pPr>
-              <w:jc w:val="center"/>
-            </w:pPr>
-            <w:r/>
-            <w:r>
-              <w:rPr>
-                <w:rFonts w:ascii="Calibri" w:hAnsi="Calibri"/>
-                <w:color w:val="333333"/>
-                <w:sz w:val="16"/>
-              </w:rPr>
-              <w:t>15–22</w:t>
-            </w:r>
-          </w:p>
-        </w:tc>
-      </w:tr>
-      <w:tr>
-        <w:tc>
-          <w:tcPr>
-            <w:tcW w:type="dxa" w:w="1949"/>
-            <w:shd w:fill="E6F2F2"/>
-            <w:tcBorders>
-              <w:top w:val="single" w:sz="2" w:space="0" w:color="D8D8D8"/>
-              <w:bottom w:val="single" w:sz="2" w:space="0" w:color="D8D8D8"/>
-              <w:left w:val="single" w:sz="2" w:space="0" w:color="D8D8D8"/>
-              <w:right w:val="single" w:sz="2" w:space="0" w:color="D8D8D8"/>
-            </w:tcBorders>
-            <w:tcMar>
-              <w:top w:w="45" w:type="dxa"/>
-              <w:bottom w:w="45" w:type="dxa"/>
-              <w:left w:w="80" w:type="dxa"/>
-              <w:right w:w="80" w:type="dxa"/>
-            </w:tcMar>
-          </w:tcPr>
-          <w:p>
-            <w:pPr>
-              <w:jc w:val="left"/>
-            </w:pPr>
-            <w:r/>
-            <w:r>
-              <w:rPr>
-                <w:rFonts w:ascii="Calibri" w:hAnsi="Calibri"/>
-                <w:b/>
-                <w:color w:val="007C8A"/>
-                <w:sz w:val="16"/>
-              </w:rPr>
-              <w:t>Total apheresis procedures</w:t>
-            </w:r>
-          </w:p>
-        </w:tc>
-        <w:tc>
-          <w:tcPr>
-            <w:tcW w:type="dxa" w:w="1949"/>
-            <w:shd w:fill="E6F2F2"/>
-            <w:tcBorders>
-              <w:top w:val="single" w:sz="2" w:space="0" w:color="D8D8D8"/>
-              <w:bottom w:val="single" w:sz="2" w:space="0" w:color="D8D8D8"/>
-              <w:left w:val="single" w:sz="2" w:space="0" w:color="D8D8D8"/>
-              <w:right w:val="single" w:sz="2" w:space="0" w:color="D8D8D8"/>
-            </w:tcBorders>
-            <w:tcMar>
-              <w:top w:w="45" w:type="dxa"/>
-              <w:bottom w:w="45" w:type="dxa"/>
-              <w:left w:w="80" w:type="dxa"/>
-              <w:right w:w="80" w:type="dxa"/>
-            </w:tcMar>
-          </w:tcPr>
-          <w:p>
-            <w:pPr>
-              <w:jc w:val="center"/>
-            </w:pPr>
-            <w:r/>
-            <w:r>
-              <w:rPr>
-                <w:rFonts w:ascii="Calibri" w:hAnsi="Calibri"/>
-                <w:b/>
-                <w:color w:val="007C8A"/>
-                <w:sz w:val="16"/>
-              </w:rPr>
-              <w:t>20–32</w:t>
-            </w:r>
-          </w:p>
-        </w:tc>
-        <w:tc>
-          <w:tcPr>
-            <w:tcW w:type="dxa" w:w="1949"/>
-            <w:shd w:fill="E6F2F2"/>
-            <w:tcBorders>
-              <w:top w:val="single" w:sz="2" w:space="0" w:color="D8D8D8"/>
-              <w:bottom w:val="single" w:sz="2" w:space="0" w:color="D8D8D8"/>
-              <w:left w:val="single" w:sz="2" w:space="0" w:color="D8D8D8"/>
-              <w:right w:val="single" w:sz="2" w:space="0" w:color="D8D8D8"/>
-            </w:tcBorders>
-            <w:tcMar>
-              <w:top w:w="45" w:type="dxa"/>
-              <w:bottom w:w="45" w:type="dxa"/>
-              <w:left w:w="80" w:type="dxa"/>
-              <w:right w:w="80" w:type="dxa"/>
-            </w:tcMar>
-          </w:tcPr>
-          <w:p>
-            <w:pPr>
-              <w:jc w:val="center"/>
-            </w:pPr>
-            <w:r/>
-            <w:r>
-              <w:rPr>
-                <w:rFonts w:ascii="Calibri" w:hAnsi="Calibri"/>
-                <w:b/>
-                <w:color w:val="007C8A"/>
-                <w:sz w:val="16"/>
-              </w:rPr>
-              <w:t>40–58</w:t>
-            </w:r>
-          </w:p>
-        </w:tc>
-        <w:tc>
-          <w:tcPr>
-            <w:tcW w:type="dxa" w:w="1949"/>
-            <w:shd w:fill="E6F2F2"/>
-            <w:tcBorders>
-              <w:top w:val="single" w:sz="2" w:space="0" w:color="D8D8D8"/>
-              <w:bottom w:val="single" w:sz="2" w:space="0" w:color="D8D8D8"/>
-              <w:left w:val="single" w:sz="2" w:space="0" w:color="D8D8D8"/>
-              <w:right w:val="single" w:sz="2" w:space="0" w:color="D8D8D8"/>
-            </w:tcBorders>
-            <w:tcMar>
-              <w:top w:w="45" w:type="dxa"/>
-              <w:bottom w:w="45" w:type="dxa"/>
-              <w:left w:w="80" w:type="dxa"/>
-              <w:right w:w="80" w:type="dxa"/>
-            </w:tcMar>
-          </w:tcPr>
-          <w:p>
-            <w:pPr>
-              <w:jc w:val="center"/>
-            </w:pPr>
-            <w:r/>
-            <w:r>
-              <w:rPr>
-                <w:rFonts w:ascii="Calibri" w:hAnsi="Calibri"/>
-                <w:b/>
-                <w:color w:val="007C8A"/>
-                <w:sz w:val="16"/>
-              </w:rPr>
-              <w:t>56–80</w:t>
-            </w:r>
-          </w:p>
-        </w:tc>
-        <w:tc>
-          <w:tcPr>
-            <w:tcW w:type="dxa" w:w="1949"/>
-            <w:shd w:fill="E6F2F2"/>
-            <w:tcBorders>
-              <w:top w:val="single" w:sz="2" w:space="0" w:color="D8D8D8"/>
-              <w:bottom w:val="single" w:sz="2" w:space="0" w:color="D8D8D8"/>
-              <w:left w:val="single" w:sz="2" w:space="0" w:color="D8D8D8"/>
-              <w:right w:val="single" w:sz="2" w:space="0" w:color="D8D8D8"/>
-            </w:tcBorders>
-            <w:tcMar>
-              <w:top w:w="45" w:type="dxa"/>
-              <w:bottom w:w="45" w:type="dxa"/>
-              <w:left w:w="80" w:type="dxa"/>
-              <w:right w:w="80" w:type="dxa"/>
-            </w:tcMar>
-          </w:tcPr>
-          <w:p>
-            <w:pPr>
-              <w:jc w:val="center"/>
-            </w:pPr>
-            <w:r/>
-            <w:r>
-              <w:rPr>
-                <w:rFonts w:ascii="Calibri" w:hAnsi="Calibri"/>
-                <w:b/>
-                <w:color w:val="007C8A"/>
-                <w:sz w:val="16"/>
-              </w:rPr>
-              <w:t>85–122</w:t>
-            </w:r>
-          </w:p>
-        </w:tc>
-      </w:tr>
-    </w:tbl>
-    <w:p>
-      <w:r>
-        <w:rPr>
-          <w:rFonts w:ascii="Calibri" w:hAnsi="Calibri"/>
-          <w:b w:val="0"/>
-          <w:color w:val="333333"/>
-          <w:sz w:val="18"/>
-        </w:rPr>
-      </w:r>
-    </w:p>
-    <w:p>
-      <w:r>
-        <w:rPr>
-          <w:rFonts w:ascii="Calibri" w:hAnsi="Calibri"/>
-          <w:b/>
-          <w:color w:val="1B5E8A"/>
-          <w:sz w:val="18"/>
-        </w:rPr>
-        <w:t>Supporting processing volume:</w:t>
-      </w:r>
-    </w:p>
-    <w:tbl>
-      <w:tblPr>
-        <w:tblW w:type="auto" w:w="0"/>
-        <w:jc w:val="center"/>
-        <w:tblLayout w:type="autofit"/>
-        <w:tblLook w:firstColumn="1" w:firstRow="1" w:lastColumn="0" w:lastRow="0" w:noHBand="0" w:noVBand="1" w:val="04A0"/>
-      </w:tblPr>
-      <w:tblGrid>
-        <w:gridCol w:w="1949"/>
-        <w:gridCol w:w="1949"/>
-        <w:gridCol w:w="1949"/>
-        <w:gridCol w:w="1949"/>
-        <w:gridCol w:w="1949"/>
-      </w:tblGrid>
-      <w:tr>
-        <w:tc>
-          <w:tcPr>
-            <w:tcW w:type="dxa" w:w="1949"/>
-            <w:shd w:fill="0C2340"/>
-            <w:tcBorders>
-              <w:top w:val="single" w:sz="2" w:space="0" w:color="0C2340"/>
-              <w:bottom w:val="single" w:sz="2" w:space="0" w:color="0C2340"/>
-              <w:left w:val="single" w:sz="2" w:space="0" w:color="0C2340"/>
-              <w:right w:val="single" w:sz="2" w:space="0" w:color="0C2340"/>
-            </w:tcBorders>
-            <w:tcMar>
-              <w:top w:w="45" w:type="dxa"/>
-              <w:bottom w:w="45" w:type="dxa"/>
-              <w:left w:w="80" w:type="dxa"/>
-              <w:right w:w="80" w:type="dxa"/>
-            </w:tcMar>
-          </w:tcPr>
-          <w:p>
-            <w:pPr>
-              <w:jc w:val="center"/>
-            </w:pPr>
-            <w:r/>
-            <w:r>
-              <w:rPr>
-                <w:rFonts w:ascii="Calibri" w:hAnsi="Calibri"/>
-                <w:b/>
-                <w:color w:val="FFFFFF"/>
-                <w:sz w:val="16"/>
-              </w:rPr>
-              <w:t>Processing Service</w:t>
-            </w:r>
-          </w:p>
-        </w:tc>
-        <w:tc>
-          <w:tcPr>
-            <w:tcW w:type="dxa" w:w="1949"/>
-            <w:shd w:fill="0C2340"/>
-            <w:tcBorders>
-              <w:top w:val="single" w:sz="2" w:space="0" w:color="0C2340"/>
-              <w:bottom w:val="single" w:sz="2" w:space="0" w:color="0C2340"/>
-              <w:left w:val="single" w:sz="2" w:space="0" w:color="0C2340"/>
-              <w:right w:val="single" w:sz="2" w:space="0" w:color="0C2340"/>
-            </w:tcBorders>
-            <w:tcMar>
-              <w:top w:w="45" w:type="dxa"/>
-              <w:bottom w:w="45" w:type="dxa"/>
-              <w:left w:w="80" w:type="dxa"/>
-              <w:right w:w="80" w:type="dxa"/>
-            </w:tcMar>
-          </w:tcPr>
-          <w:p>
-            <w:pPr>
-              <w:jc w:val="center"/>
-            </w:pPr>
-            <w:r/>
-            <w:r>
-              <w:rPr>
-                <w:rFonts w:ascii="Calibri" w:hAnsi="Calibri"/>
-                <w:b/>
-                <w:color w:val="FFFFFF"/>
-                <w:sz w:val="16"/>
-              </w:rPr>
-              <w:t>Year 1</w:t>
-            </w:r>
-          </w:p>
-        </w:tc>
-        <w:tc>
-          <w:tcPr>
-            <w:tcW w:type="dxa" w:w="1949"/>
-            <w:shd w:fill="0C2340"/>
-            <w:tcBorders>
-              <w:top w:val="single" w:sz="2" w:space="0" w:color="0C2340"/>
-              <w:bottom w:val="single" w:sz="2" w:space="0" w:color="0C2340"/>
-              <w:left w:val="single" w:sz="2" w:space="0" w:color="0C2340"/>
-              <w:right w:val="single" w:sz="2" w:space="0" w:color="0C2340"/>
-            </w:tcBorders>
-            <w:tcMar>
-              <w:top w:w="45" w:type="dxa"/>
-              <w:bottom w:w="45" w:type="dxa"/>
-              <w:left w:w="80" w:type="dxa"/>
-              <w:right w:w="80" w:type="dxa"/>
-            </w:tcMar>
-          </w:tcPr>
-          <w:p>
-            <w:pPr>
-              <w:jc w:val="center"/>
-            </w:pPr>
-            <w:r/>
-            <w:r>
-              <w:rPr>
-                <w:rFonts w:ascii="Calibri" w:hAnsi="Calibri"/>
-                <w:b/>
-                <w:color w:val="FFFFFF"/>
-                <w:sz w:val="16"/>
-              </w:rPr>
-              <w:t>Year 2</w:t>
-            </w:r>
-          </w:p>
-        </w:tc>
-        <w:tc>
-          <w:tcPr>
-            <w:tcW w:type="dxa" w:w="1949"/>
-            <w:shd w:fill="0C2340"/>
-            <w:tcBorders>
-              <w:top w:val="single" w:sz="2" w:space="0" w:color="0C2340"/>
-              <w:bottom w:val="single" w:sz="2" w:space="0" w:color="0C2340"/>
-              <w:left w:val="single" w:sz="2" w:space="0" w:color="0C2340"/>
-              <w:right w:val="single" w:sz="2" w:space="0" w:color="0C2340"/>
-            </w:tcBorders>
-            <w:tcMar>
-              <w:top w:w="45" w:type="dxa"/>
-              <w:bottom w:w="45" w:type="dxa"/>
-              <w:left w:w="80" w:type="dxa"/>
-              <w:right w:w="80" w:type="dxa"/>
-            </w:tcMar>
-          </w:tcPr>
-          <w:p>
-            <w:pPr>
-              <w:jc w:val="center"/>
-            </w:pPr>
-            <w:r/>
-            <w:r>
-              <w:rPr>
-                <w:rFonts w:ascii="Calibri" w:hAnsi="Calibri"/>
-                <w:b/>
-                <w:color w:val="FFFFFF"/>
-                <w:sz w:val="16"/>
-              </w:rPr>
-              <w:t>Year 3</w:t>
-            </w:r>
-          </w:p>
-        </w:tc>
-        <w:tc>
-          <w:tcPr>
-            <w:tcW w:type="dxa" w:w="1949"/>
-            <w:shd w:fill="0C2340"/>
-            <w:tcBorders>
-              <w:top w:val="single" w:sz="2" w:space="0" w:color="0C2340"/>
-              <w:bottom w:val="single" w:sz="2" w:space="0" w:color="0C2340"/>
-              <w:left w:val="single" w:sz="2" w:space="0" w:color="0C2340"/>
-              <w:right w:val="single" w:sz="2" w:space="0" w:color="0C2340"/>
-            </w:tcBorders>
-            <w:tcMar>
-              <w:top w:w="45" w:type="dxa"/>
-              <w:bottom w:w="45" w:type="dxa"/>
-              <w:left w:w="80" w:type="dxa"/>
-              <w:right w:w="80" w:type="dxa"/>
-            </w:tcMar>
-          </w:tcPr>
-          <w:p>
-            <w:pPr>
-              <w:jc w:val="center"/>
-            </w:pPr>
-            <w:r/>
-            <w:r>
-              <w:rPr>
-                <w:rFonts w:ascii="Calibri" w:hAnsi="Calibri"/>
-                <w:b/>
-                <w:color w:val="FFFFFF"/>
-                <w:sz w:val="16"/>
-              </w:rPr>
-              <w:t>Year 5</w:t>
-            </w:r>
-          </w:p>
-        </w:tc>
-      </w:tr>
-      <w:tr>
-        <w:tc>
-          <w:tcPr>
-            <w:tcW w:type="dxa" w:w="1949"/>
+            <w:tcW w:type="dxa" w:w="3249"/>
             <w:shd w:fill="FFFFFF"/>
             <w:tcBorders>
               <w:top w:val="single" w:sz="2" w:space="0" w:color="D8D8D8"/>
@@ -1879,7 +1212,7 @@
         </w:tc>
         <w:tc>
           <w:tcPr>
-            <w:tcW w:type="dxa" w:w="1949"/>
+            <w:tcW w:type="dxa" w:w="3249"/>
             <w:shd w:fill="FFFFFF"/>
             <w:tcBorders>
               <w:top w:val="single" w:sz="2" w:space="0" w:color="D8D8D8"/>
@@ -1902,16 +1235,17 @@
             <w:r>
               <w:rPr>
                 <w:rFonts w:ascii="Calibri" w:hAnsi="Calibri"/>
-                <w:color w:val="333333"/>
+                <w:b/>
+                <w:color w:val="1E8849"/>
                 <w:sz w:val="16"/>
               </w:rPr>
-              <w:t>16–24</w:t>
+              <w:t>+8–10</w:t>
             </w:r>
           </w:p>
         </w:tc>
         <w:tc>
           <w:tcPr>
-            <w:tcW w:type="dxa" w:w="1949"/>
+            <w:tcW w:type="dxa" w:w="3249"/>
             <w:shd w:fill="FFFFFF"/>
             <w:tcBorders>
               <w:top w:val="single" w:sz="2" w:space="0" w:color="D8D8D8"/>
@@ -1934,74 +1268,11 @@
             <w:r>
               <w:rPr>
                 <w:rFonts w:ascii="Calibri" w:hAnsi="Calibri"/>
-                <w:color w:val="333333"/>
+                <w:b/>
+                <w:color w:val="1E8849"/>
                 <w:sz w:val="16"/>
               </w:rPr>
-              <w:t>30–44</w:t>
-            </w:r>
-          </w:p>
-        </w:tc>
-        <w:tc>
-          <w:tcPr>
-            <w:tcW w:type="dxa" w:w="1949"/>
-            <w:shd w:fill="FFFFFF"/>
-            <w:tcBorders>
-              <w:top w:val="single" w:sz="2" w:space="0" w:color="D8D8D8"/>
-              <w:bottom w:val="single" w:sz="2" w:space="0" w:color="D8D8D8"/>
-              <w:left w:val="single" w:sz="2" w:space="0" w:color="D8D8D8"/>
-              <w:right w:val="single" w:sz="2" w:space="0" w:color="D8D8D8"/>
-            </w:tcBorders>
-            <w:tcMar>
-              <w:top w:w="45" w:type="dxa"/>
-              <w:bottom w:w="45" w:type="dxa"/>
-              <w:left w:w="80" w:type="dxa"/>
-              <w:right w:w="80" w:type="dxa"/>
-            </w:tcMar>
-          </w:tcPr>
-          <w:p>
-            <w:pPr>
-              <w:jc w:val="center"/>
-            </w:pPr>
-            <w:r/>
-            <w:r>
-              <w:rPr>
-                <w:rFonts w:ascii="Calibri" w:hAnsi="Calibri"/>
-                <w:color w:val="333333"/>
-                <w:sz w:val="16"/>
-              </w:rPr>
-              <w:t>40–57</w:t>
-            </w:r>
-          </w:p>
-        </w:tc>
-        <w:tc>
-          <w:tcPr>
-            <w:tcW w:type="dxa" w:w="1949"/>
-            <w:shd w:fill="FFFFFF"/>
-            <w:tcBorders>
-              <w:top w:val="single" w:sz="2" w:space="0" w:color="D8D8D8"/>
-              <w:bottom w:val="single" w:sz="2" w:space="0" w:color="D8D8D8"/>
-              <w:left w:val="single" w:sz="2" w:space="0" w:color="D8D8D8"/>
-              <w:right w:val="single" w:sz="2" w:space="0" w:color="D8D8D8"/>
-            </w:tcBorders>
-            <w:tcMar>
-              <w:top w:w="45" w:type="dxa"/>
-              <w:bottom w:w="45" w:type="dxa"/>
-              <w:left w:w="80" w:type="dxa"/>
-              <w:right w:w="80" w:type="dxa"/>
-            </w:tcMar>
-          </w:tcPr>
-          <w:p>
-            <w:pPr>
-              <w:jc w:val="center"/>
-            </w:pPr>
-            <w:r/>
-            <w:r>
-              <w:rPr>
-                <w:rFonts w:ascii="Calibri" w:hAnsi="Calibri"/>
-                <w:color w:val="333333"/>
-                <w:sz w:val="16"/>
-              </w:rPr>
-              <w:t>55–77</w:t>
+              <w:t>+15–20</w:t>
             </w:r>
           </w:p>
         </w:tc>
@@ -2009,7 +1280,7 @@
       <w:tr>
         <w:tc>
           <w:tcPr>
-            <w:tcW w:type="dxa" w:w="1949"/>
+            <w:tcW w:type="dxa" w:w="3249"/>
             <w:shd w:fill="F4F7F8"/>
             <w:tcBorders>
               <w:top w:val="single" w:sz="2" w:space="0" w:color="D8D8D8"/>
@@ -2042,7 +1313,7 @@
         </w:tc>
         <w:tc>
           <w:tcPr>
-            <w:tcW w:type="dxa" w:w="1949"/>
+            <w:tcW w:type="dxa" w:w="3249"/>
             <w:shd w:fill="F4F7F8"/>
             <w:tcBorders>
               <w:top w:val="single" w:sz="2" w:space="0" w:color="D8D8D8"/>
@@ -2065,16 +1336,17 @@
             <w:r>
               <w:rPr>
                 <w:rFonts w:ascii="Calibri" w:hAnsi="Calibri"/>
-                <w:color w:val="333333"/>
+                <w:b/>
+                <w:color w:val="1E8849"/>
                 <w:sz w:val="16"/>
               </w:rPr>
-              <w:t>20–32</w:t>
+              <w:t>+12–16</w:t>
             </w:r>
           </w:p>
         </w:tc>
         <w:tc>
           <w:tcPr>
-            <w:tcW w:type="dxa" w:w="1949"/>
+            <w:tcW w:type="dxa" w:w="3249"/>
             <w:shd w:fill="F4F7F8"/>
             <w:tcBorders>
               <w:top w:val="single" w:sz="2" w:space="0" w:color="D8D8D8"/>
@@ -2097,74 +1369,11 @@
             <w:r>
               <w:rPr>
                 <w:rFonts w:ascii="Calibri" w:hAnsi="Calibri"/>
-                <w:color w:val="333333"/>
+                <w:b/>
+                <w:color w:val="1E8849"/>
                 <w:sz w:val="16"/>
               </w:rPr>
-              <w:t>40–58</w:t>
-            </w:r>
-          </w:p>
-        </w:tc>
-        <w:tc>
-          <w:tcPr>
-            <w:tcW w:type="dxa" w:w="1949"/>
-            <w:shd w:fill="F4F7F8"/>
-            <w:tcBorders>
-              <w:top w:val="single" w:sz="2" w:space="0" w:color="D8D8D8"/>
-              <w:bottom w:val="single" w:sz="2" w:space="0" w:color="D8D8D8"/>
-              <w:left w:val="single" w:sz="2" w:space="0" w:color="D8D8D8"/>
-              <w:right w:val="single" w:sz="2" w:space="0" w:color="D8D8D8"/>
-            </w:tcBorders>
-            <w:tcMar>
-              <w:top w:w="45" w:type="dxa"/>
-              <w:bottom w:w="45" w:type="dxa"/>
-              <w:left w:w="80" w:type="dxa"/>
-              <w:right w:w="80" w:type="dxa"/>
-            </w:tcMar>
-          </w:tcPr>
-          <w:p>
-            <w:pPr>
-              <w:jc w:val="center"/>
-            </w:pPr>
-            <w:r/>
-            <w:r>
-              <w:rPr>
-                <w:rFonts w:ascii="Calibri" w:hAnsi="Calibri"/>
-                <w:color w:val="333333"/>
-                <w:sz w:val="16"/>
-              </w:rPr>
-              <w:t>56–80</w:t>
-            </w:r>
-          </w:p>
-        </w:tc>
-        <w:tc>
-          <w:tcPr>
-            <w:tcW w:type="dxa" w:w="1949"/>
-            <w:shd w:fill="F4F7F8"/>
-            <w:tcBorders>
-              <w:top w:val="single" w:sz="2" w:space="0" w:color="D8D8D8"/>
-              <w:bottom w:val="single" w:sz="2" w:space="0" w:color="D8D8D8"/>
-              <w:left w:val="single" w:sz="2" w:space="0" w:color="D8D8D8"/>
-              <w:right w:val="single" w:sz="2" w:space="0" w:color="D8D8D8"/>
-            </w:tcBorders>
-            <w:tcMar>
-              <w:top w:w="45" w:type="dxa"/>
-              <w:bottom w:w="45" w:type="dxa"/>
-              <w:left w:w="80" w:type="dxa"/>
-              <w:right w:w="80" w:type="dxa"/>
-            </w:tcMar>
-          </w:tcPr>
-          <w:p>
-            <w:pPr>
-              <w:jc w:val="center"/>
-            </w:pPr>
-            <w:r/>
-            <w:r>
-              <w:rPr>
-                <w:rFonts w:ascii="Calibri" w:hAnsi="Calibri"/>
-                <w:color w:val="333333"/>
-                <w:sz w:val="16"/>
-              </w:rPr>
-              <w:t>85–122</w:t>
+              <w:t>+23–30</w:t>
             </w:r>
           </w:p>
         </w:tc>
@@ -2172,7 +1381,7 @@
       <w:tr>
         <w:tc>
           <w:tcPr>
-            <w:tcW w:type="dxa" w:w="1949"/>
+            <w:tcW w:type="dxa" w:w="3249"/>
             <w:shd w:fill="FFFFFF"/>
             <w:tcBorders>
               <w:top w:val="single" w:sz="2" w:space="0" w:color="D8D8D8"/>
@@ -2205,7 +1414,7 @@
         </w:tc>
         <w:tc>
           <w:tcPr>
-            <w:tcW w:type="dxa" w:w="1949"/>
+            <w:tcW w:type="dxa" w:w="3249"/>
             <w:shd w:fill="FFFFFF"/>
             <w:tcBorders>
               <w:top w:val="single" w:sz="2" w:space="0" w:color="D8D8D8"/>
@@ -2228,16 +1437,17 @@
             <w:r>
               <w:rPr>
                 <w:rFonts w:ascii="Calibri" w:hAnsi="Calibri"/>
-                <w:color w:val="333333"/>
+                <w:b/>
+                <w:color w:val="1E8849"/>
                 <w:sz w:val="16"/>
               </w:rPr>
-              <w:t>20–32</w:t>
+              <w:t>+12–16</w:t>
             </w:r>
           </w:p>
         </w:tc>
         <w:tc>
           <w:tcPr>
-            <w:tcW w:type="dxa" w:w="1949"/>
+            <w:tcW w:type="dxa" w:w="3249"/>
             <w:shd w:fill="FFFFFF"/>
             <w:tcBorders>
               <w:top w:val="single" w:sz="2" w:space="0" w:color="D8D8D8"/>
@@ -2260,17 +1470,53 @@
             <w:r>
               <w:rPr>
                 <w:rFonts w:ascii="Calibri" w:hAnsi="Calibri"/>
-                <w:color w:val="333333"/>
+                <w:b/>
+                <w:color w:val="1E8849"/>
                 <w:sz w:val="16"/>
               </w:rPr>
-              <w:t>40–58</w:t>
+              <w:t>+23–30</w:t>
+            </w:r>
+          </w:p>
+        </w:tc>
+      </w:tr>
+      <w:tr>
+        <w:tc>
+          <w:tcPr>
+            <w:tcW w:type="dxa" w:w="3249"/>
+            <w:shd w:fill="E6F2F2"/>
+            <w:tcBorders>
+              <w:top w:val="single" w:sz="2" w:space="0" w:color="D8D8D8"/>
+              <w:bottom w:val="single" w:sz="2" w:space="0" w:color="D8D8D8"/>
+              <w:left w:val="single" w:sz="2" w:space="0" w:color="D8D8D8"/>
+              <w:right w:val="single" w:sz="2" w:space="0" w:color="D8D8D8"/>
+            </w:tcBorders>
+            <w:tcMar>
+              <w:top w:w="45" w:type="dxa"/>
+              <w:bottom w:w="45" w:type="dxa"/>
+              <w:left w:w="80" w:type="dxa"/>
+              <w:right w:w="80" w:type="dxa"/>
+            </w:tcMar>
+          </w:tcPr>
+          <w:p>
+            <w:pPr>
+              <w:jc w:val="left"/>
+            </w:pPr>
+            <w:r/>
+            <w:r>
+              <w:rPr>
+                <w:rFonts w:ascii="Calibri" w:hAnsi="Calibri"/>
+                <w:b/>
+                <w:color w:val="007C8A"/>
+                <w:sz w:val="16"/>
+              </w:rPr>
+              <w:t>Total new ARC procedures (OncoCel)</w:t>
             </w:r>
           </w:p>
         </w:tc>
         <w:tc>
           <w:tcPr>
-            <w:tcW w:type="dxa" w:w="1949"/>
-            <w:shd w:fill="FFFFFF"/>
+            <w:tcW w:type="dxa" w:w="3249"/>
+            <w:shd w:fill="E6F2F2"/>
             <w:tcBorders>
               <w:top w:val="single" w:sz="2" w:space="0" w:color="D8D8D8"/>
               <w:bottom w:val="single" w:sz="2" w:space="0" w:color="D8D8D8"/>
@@ -2292,17 +1538,18 @@
             <w:r>
               <w:rPr>
                 <w:rFonts w:ascii="Calibri" w:hAnsi="Calibri"/>
-                <w:color w:val="333333"/>
+                <w:b/>
+                <w:color w:val="1E8849"/>
                 <w:sz w:val="16"/>
               </w:rPr>
-              <w:t>56–80</w:t>
+              <w:t>+12–16</w:t>
             </w:r>
           </w:p>
         </w:tc>
         <w:tc>
           <w:tcPr>
-            <w:tcW w:type="dxa" w:w="1949"/>
-            <w:shd w:fill="FFFFFF"/>
+            <w:tcW w:type="dxa" w:w="3249"/>
+            <w:shd w:fill="E6F2F2"/>
             <w:tcBorders>
               <w:top w:val="single" w:sz="2" w:space="0" w:color="D8D8D8"/>
               <w:bottom w:val="single" w:sz="2" w:space="0" w:color="D8D8D8"/>
@@ -2324,15 +1571,37 @@
             <w:r>
               <w:rPr>
                 <w:rFonts w:ascii="Calibri" w:hAnsi="Calibri"/>
-                <w:color w:val="333333"/>
+                <w:b/>
+                <w:color w:val="1E8849"/>
                 <w:sz w:val="16"/>
               </w:rPr>
-              <w:t>85–122</w:t>
+              <w:t>+23–30</w:t>
             </w:r>
           </w:p>
         </w:tc>
       </w:tr>
     </w:tbl>
+    <w:p>
+      <w:r>
+        <w:rPr>
+          <w:rFonts w:ascii="Calibri" w:hAnsi="Calibri"/>
+          <w:b w:val="0"/>
+          <w:color w:val="333333"/>
+          <w:sz w:val="18"/>
+        </w:rPr>
+      </w:r>
+    </w:p>
+    <w:p>
+      <w:r>
+        <w:rPr>
+          <w:rFonts w:ascii="Calibri" w:hAnsi="Calibri"/>
+          <w:b w:val="0"/>
+          <w:color w:val="666666"/>
+          <w:sz w:val="16"/>
+        </w:rPr>
+        <w:t>Note: All numbers represent OncoCel ambulatory volume only. Inpatient volumes at CCCUPR and HAM (TCT Oncology) are reported separately by those programs.</w:t>
+      </w:r>
+    </w:p>
     <w:p>
       <w:r>
         <w:rPr>
@@ -2368,7 +1637,7 @@
           <w:color w:val="333333"/>
           <w:sz w:val="18"/>
         </w:rPr>
-        <w:t>OncoCel requests ARC confirm coverage for the following services as the program scales:</w:t>
+        <w:t>OncoCel requests ARC confirm coverage for the following services:</w:t>
       </w:r>
     </w:p>
     <w:tbl>
@@ -2712,7 +1981,7 @@
                 <w:color w:val="0C2340"/>
                 <w:sz w:val="16"/>
               </w:rPr>
-              <w:t>CAR-T leukapheresis &amp; shipment logistics</w:t>
+              <w:t>Research CAR-T leukapheresis &amp; shipment</w:t>
             </w:r>
           </w:p>
         </w:tc>
@@ -2811,7 +2080,7 @@
                 <w:color w:val="0C2340"/>
                 <w:sz w:val="16"/>
               </w:rPr>
-              <w:t>Allogeneic donor collections</w:t>
+              <w:t>Capacity guarantees &amp; turnaround SLA</w:t>
             </w:r>
           </w:p>
         </w:tc>
@@ -2843,7 +2112,7 @@
                 <w:color w:val="333333"/>
                 <w:sz w:val="16"/>
               </w:rPr>
-              <w:t>Plan ahead</w:t>
+              <w:t>Critical</w:t>
             </w:r>
           </w:p>
         </w:tc>
@@ -2875,7 +2144,7 @@
                 <w:color w:val="333333"/>
                 <w:sz w:val="16"/>
               </w:rPr>
-              <w:t>Amendment needed by Year 2 (2028)</w:t>
+              <w:t>Must guarantee slots for emergent collections</w:t>
             </w:r>
           </w:p>
         </w:tc>
@@ -2910,7 +2179,7 @@
                 <w:color w:val="0C2340"/>
                 <w:sz w:val="16"/>
               </w:rPr>
-              <w:t>Capacity guarantees &amp; turnaround SLA</w:t>
+              <w:t>Volume-based pricing</w:t>
             </w:r>
           </w:p>
         </w:tc>
@@ -2942,7 +2211,7 @@
                 <w:color w:val="333333"/>
                 <w:sz w:val="16"/>
               </w:rPr>
-              <w:t>Critical</w:t>
+              <w:t>Discuss</w:t>
             </w:r>
           </w:p>
         </w:tc>
@@ -2974,107 +2243,7 @@
                 <w:color w:val="333333"/>
                 <w:sz w:val="16"/>
               </w:rPr>
-              <w:t>Must guarantee slots for emergent collections</w:t>
-            </w:r>
-          </w:p>
-        </w:tc>
-      </w:tr>
-      <w:tr>
-        <w:tc>
-          <w:tcPr>
-            <w:tcW w:type="dxa" w:w="3249"/>
-            <w:shd w:fill="F4F7F8"/>
-            <w:tcBorders>
-              <w:top w:val="single" w:sz="2" w:space="0" w:color="D8D8D8"/>
-              <w:bottom w:val="single" w:sz="2" w:space="0" w:color="D8D8D8"/>
-              <w:left w:val="single" w:sz="2" w:space="0" w:color="D8D8D8"/>
-              <w:right w:val="single" w:sz="2" w:space="0" w:color="D8D8D8"/>
-            </w:tcBorders>
-            <w:tcMar>
-              <w:top w:w="45" w:type="dxa"/>
-              <w:bottom w:w="45" w:type="dxa"/>
-              <w:left w:w="80" w:type="dxa"/>
-              <w:right w:w="80" w:type="dxa"/>
-            </w:tcMar>
-          </w:tcPr>
-          <w:p>
-            <w:pPr>
-              <w:jc w:val="left"/>
-            </w:pPr>
-            <w:r/>
-            <w:r>
-              <w:rPr>
-                <w:rFonts w:ascii="Calibri" w:hAnsi="Calibri"/>
-                <w:b/>
-                <w:color w:val="0C2340"/>
-                <w:sz w:val="16"/>
-              </w:rPr>
-              <w:t>Volume-based pricing</w:t>
-            </w:r>
-          </w:p>
-        </w:tc>
-        <w:tc>
-          <w:tcPr>
-            <w:tcW w:type="dxa" w:w="3249"/>
-            <w:shd w:fill="F4F7F8"/>
-            <w:tcBorders>
-              <w:top w:val="single" w:sz="2" w:space="0" w:color="D8D8D8"/>
-              <w:bottom w:val="single" w:sz="2" w:space="0" w:color="D8D8D8"/>
-              <w:left w:val="single" w:sz="2" w:space="0" w:color="D8D8D8"/>
-              <w:right w:val="single" w:sz="2" w:space="0" w:color="D8D8D8"/>
-            </w:tcBorders>
-            <w:tcMar>
-              <w:top w:w="45" w:type="dxa"/>
-              <w:bottom w:w="45" w:type="dxa"/>
-              <w:left w:w="80" w:type="dxa"/>
-              <w:right w:w="80" w:type="dxa"/>
-            </w:tcMar>
-          </w:tcPr>
-          <w:p>
-            <w:pPr>
-              <w:jc w:val="center"/>
-            </w:pPr>
-            <w:r/>
-            <w:r>
-              <w:rPr>
-                <w:rFonts w:ascii="Calibri" w:hAnsi="Calibri"/>
-                <w:color w:val="333333"/>
-                <w:sz w:val="16"/>
-              </w:rPr>
-              <w:t>Discuss</w:t>
-            </w:r>
-          </w:p>
-        </w:tc>
-        <w:tc>
-          <w:tcPr>
-            <w:tcW w:type="dxa" w:w="3249"/>
-            <w:shd w:fill="F4F7F8"/>
-            <w:tcBorders>
-              <w:top w:val="single" w:sz="2" w:space="0" w:color="D8D8D8"/>
-              <w:bottom w:val="single" w:sz="2" w:space="0" w:color="D8D8D8"/>
-              <w:left w:val="single" w:sz="2" w:space="0" w:color="D8D8D8"/>
-              <w:right w:val="single" w:sz="2" w:space="0" w:color="D8D8D8"/>
-            </w:tcBorders>
-            <w:tcMar>
-              <w:top w:w="45" w:type="dxa"/>
-              <w:bottom w:w="45" w:type="dxa"/>
-              <w:left w:w="80" w:type="dxa"/>
-              <w:right w:w="80" w:type="dxa"/>
-            </w:tcMar>
-          </w:tcPr>
-          <w:p>
-            <w:pPr>
-              <w:jc w:val="center"/>
-            </w:pPr>
-            <w:r/>
-            <w:r>
-              <w:rPr>
-                <w:rFonts w:ascii="Calibri" w:hAnsi="Calibri"/>
-                <w:b/>
-                <w:color w:val="1E8849"/>
-                <w:sz w:val="16"/>
-              </w:rPr>
-              <w:t>As volume scales from 20 to 85+ procedures/year</w:t>
+              <w:t>As OncoCel + island-wide volume scales</w:t>
             </w:r>
           </w:p>
         </w:tc>
@@ -3097,7 +2266,7 @@
           <w:color w:val="0C2340"/>
           <w:sz w:val="26"/>
         </w:rPr>
-        <w:t>WHY VOLUME IS GROWING</w:t>
+        <w:t>ISLAND-WIDE VOLUME OUTLOOK</w:t>
       </w:r>
     </w:p>
     <w:p>
@@ -3115,7 +2284,7 @@
           <w:color w:val="333333"/>
           <w:sz w:val="18"/>
         </w:rPr>
-        <w:t>Puerto Rico currently has no on-island CAR-T program and limited transplant capacity. Most eligible patients travel to the US mainland or go untreated:</w:t>
+        <w:t>Beyond OncoCel's ambulatory program, the broader cellular therapy network — including TCT Oncology's inpatient programs at CCCUPR and HAM — will transform Puerto Rico's treatment landscape. The table below shows the expected island-wide volume increase as patients who currently fly to the mainland are retained on-island:</w:t>
       </w:r>
     </w:p>
     <w:tbl>
@@ -3126,14 +2295,15 @@
         <w:tblLook w:firstColumn="1" w:firstRow="1" w:lastColumn="0" w:lastRow="0" w:noHBand="0" w:noVBand="1" w:val="04A0"/>
       </w:tblPr>
       <w:tblGrid>
-        <w:gridCol w:w="3249"/>
-        <w:gridCol w:w="3249"/>
-        <w:gridCol w:w="3249"/>
+        <w:gridCol w:w="2436"/>
+        <w:gridCol w:w="2436"/>
+        <w:gridCol w:w="2436"/>
+        <w:gridCol w:w="2436"/>
       </w:tblGrid>
       <w:tr>
         <w:tc>
           <w:tcPr>
-            <w:tcW w:type="dxa" w:w="3249"/>
+            <w:tcW w:type="dxa" w:w="2436"/>
             <w:shd w:fill="0C2340"/>
             <w:tcBorders>
               <w:top w:val="single" w:sz="2" w:space="0" w:color="0C2340"/>
@@ -3166,7 +2336,7 @@
         </w:tc>
         <w:tc>
           <w:tcPr>
-            <w:tcW w:type="dxa" w:w="3249"/>
+            <w:tcW w:type="dxa" w:w="2436"/>
             <w:shd w:fill="0C2340"/>
             <w:tcBorders>
               <w:top w:val="single" w:sz="2" w:space="0" w:color="0C2340"/>
@@ -3193,13 +2363,13 @@
                 <w:color w:val="FFFFFF"/>
                 <w:sz w:val="16"/>
               </w:rPr>
-              <w:t>Current State</w:t>
+              <w:t>Current (Baseline)</w:t>
             </w:r>
           </w:p>
         </w:tc>
         <w:tc>
           <w:tcPr>
-            <w:tcW w:type="dxa" w:w="3249"/>
+            <w:tcW w:type="dxa" w:w="2436"/>
             <w:shd w:fill="0C2340"/>
             <w:tcBorders>
               <w:top w:val="single" w:sz="2" w:space="0" w:color="0C2340"/>
@@ -3226,7 +2396,40 @@
                 <w:color w:val="FFFFFF"/>
                 <w:sz w:val="16"/>
               </w:rPr>
-              <w:t>With OncoCel Program (Year 5)</w:t>
+              <w:t>Projected (Year 2)</w:t>
+            </w:r>
+          </w:p>
+        </w:tc>
+        <w:tc>
+          <w:tcPr>
+            <w:tcW w:type="dxa" w:w="2436"/>
+            <w:shd w:fill="0C2340"/>
+            <w:tcBorders>
+              <w:top w:val="single" w:sz="2" w:space="0" w:color="0C2340"/>
+              <w:bottom w:val="single" w:sz="2" w:space="0" w:color="0C2340"/>
+              <w:left w:val="single" w:sz="2" w:space="0" w:color="0C2340"/>
+              <w:right w:val="single" w:sz="2" w:space="0" w:color="0C2340"/>
+            </w:tcBorders>
+            <w:tcMar>
+              <w:top w:w="45" w:type="dxa"/>
+              <w:bottom w:w="45" w:type="dxa"/>
+              <w:left w:w="80" w:type="dxa"/>
+              <w:right w:w="80" w:type="dxa"/>
+            </w:tcMar>
+          </w:tcPr>
+          <w:p>
+            <w:pPr>
+              <w:jc w:val="center"/>
+            </w:pPr>
+            <w:r/>
+            <w:r>
+              <w:rPr>
+                <w:rFonts w:ascii="Calibri" w:hAnsi="Calibri"/>
+                <w:b/>
+                <w:color w:val="FFFFFF"/>
+                <w:sz w:val="16"/>
+              </w:rPr>
+              <w:t>Change</w:t>
             </w:r>
           </w:p>
         </w:tc>
@@ -3234,7 +2437,7 @@
       <w:tr>
         <w:tc>
           <w:tcPr>
-            <w:tcW w:type="dxa" w:w="3249"/>
+            <w:tcW w:type="dxa" w:w="2436"/>
             <w:shd w:fill="E6F2F2"/>
             <w:tcBorders>
               <w:top w:val="single" w:sz="2" w:space="0" w:color="D8D8D8"/>
@@ -3267,7 +2470,7 @@
         </w:tc>
         <w:tc>
           <w:tcPr>
-            <w:tcW w:type="dxa" w:w="3249"/>
+            <w:tcW w:type="dxa" w:w="2436"/>
             <w:shd w:fill="E6F2F2"/>
             <w:tcBorders>
               <w:top w:val="single" w:sz="2" w:space="0" w:color="D8D8D8"/>
@@ -3300,7 +2503,7 @@
         </w:tc>
         <w:tc>
           <w:tcPr>
-            <w:tcW w:type="dxa" w:w="3249"/>
+            <w:tcW w:type="dxa" w:w="2436"/>
             <w:shd w:fill="E6F2F2"/>
             <w:tcBorders>
               <w:top w:val="single" w:sz="2" w:space="0" w:color="D8D8D8"/>
@@ -3327,7 +2530,40 @@
                 <w:color w:val="007C8A"/>
                 <w:sz w:val="16"/>
               </w:rPr>
-              <w:t>62–83</w:t>
+              <w:t>50–70</w:t>
+            </w:r>
+          </w:p>
+        </w:tc>
+        <w:tc>
+          <w:tcPr>
+            <w:tcW w:type="dxa" w:w="2436"/>
+            <w:shd w:fill="E6F2F2"/>
+            <w:tcBorders>
+              <w:top w:val="single" w:sz="2" w:space="0" w:color="D8D8D8"/>
+              <w:bottom w:val="single" w:sz="2" w:space="0" w:color="D8D8D8"/>
+              <w:left w:val="single" w:sz="2" w:space="0" w:color="D8D8D8"/>
+              <w:right w:val="single" w:sz="2" w:space="0" w:color="D8D8D8"/>
+            </w:tcBorders>
+            <w:tcMar>
+              <w:top w:w="45" w:type="dxa"/>
+              <w:bottom w:w="45" w:type="dxa"/>
+              <w:left w:w="80" w:type="dxa"/>
+              <w:right w:w="80" w:type="dxa"/>
+            </w:tcMar>
+          </w:tcPr>
+          <w:p>
+            <w:pPr>
+              <w:jc w:val="center"/>
+            </w:pPr>
+            <w:r/>
+            <w:r>
+              <w:rPr>
+                <w:rFonts w:ascii="Calibri" w:hAnsi="Calibri"/>
+                <w:b/>
+                <w:color w:val="1E8849"/>
+                <w:sz w:val="16"/>
+              </w:rPr>
+              <w:t>+30–35</w:t>
             </w:r>
           </w:p>
         </w:tc>
@@ -3335,7 +2571,7 @@
       <w:tr>
         <w:tc>
           <w:tcPr>
-            <w:tcW w:type="dxa" w:w="3249"/>
+            <w:tcW w:type="dxa" w:w="2436"/>
             <w:shd w:fill="E6F2F2"/>
             <w:tcBorders>
               <w:top w:val="single" w:sz="2" w:space="0" w:color="D8D8D8"/>
@@ -3362,13 +2598,147 @@
                 <w:color w:val="007C8A"/>
                 <w:sz w:val="16"/>
               </w:rPr>
-              <w:t>Allo-HSCT on-island / year</w:t>
+              <w:t>Research CAR-T on-island / year</w:t>
             </w:r>
           </w:p>
         </w:tc>
         <w:tc>
           <w:tcPr>
-            <w:tcW w:type="dxa" w:w="3249"/>
+            <w:tcW w:type="dxa" w:w="2436"/>
+            <w:shd w:fill="E6F2F2"/>
+            <w:tcBorders>
+              <w:top w:val="single" w:sz="2" w:space="0" w:color="D8D8D8"/>
+              <w:bottom w:val="single" w:sz="2" w:space="0" w:color="D8D8D8"/>
+              <w:left w:val="single" w:sz="2" w:space="0" w:color="D8D8D8"/>
+              <w:right w:val="single" w:sz="2" w:space="0" w:color="D8D8D8"/>
+            </w:tcBorders>
+            <w:tcMar>
+              <w:top w:w="45" w:type="dxa"/>
+              <w:bottom w:w="45" w:type="dxa"/>
+              <w:left w:w="80" w:type="dxa"/>
+              <w:right w:w="80" w:type="dxa"/>
+            </w:tcMar>
+          </w:tcPr>
+          <w:p>
+            <w:pPr>
+              <w:jc w:val="center"/>
+            </w:pPr>
+            <w:r/>
+            <w:r>
+              <w:rPr>
+                <w:rFonts w:ascii="Calibri" w:hAnsi="Calibri"/>
+                <w:b/>
+                <w:color w:val="007C8A"/>
+                <w:sz w:val="16"/>
+              </w:rPr>
+              <w:t>0</w:t>
+            </w:r>
+          </w:p>
+        </w:tc>
+        <w:tc>
+          <w:tcPr>
+            <w:tcW w:type="dxa" w:w="2436"/>
+            <w:shd w:fill="E6F2F2"/>
+            <w:tcBorders>
+              <w:top w:val="single" w:sz="2" w:space="0" w:color="D8D8D8"/>
+              <w:bottom w:val="single" w:sz="2" w:space="0" w:color="D8D8D8"/>
+              <w:left w:val="single" w:sz="2" w:space="0" w:color="D8D8D8"/>
+              <w:right w:val="single" w:sz="2" w:space="0" w:color="D8D8D8"/>
+            </w:tcBorders>
+            <w:tcMar>
+              <w:top w:w="45" w:type="dxa"/>
+              <w:bottom w:w="45" w:type="dxa"/>
+              <w:left w:w="80" w:type="dxa"/>
+              <w:right w:w="80" w:type="dxa"/>
+            </w:tcMar>
+          </w:tcPr>
+          <w:p>
+            <w:pPr>
+              <w:jc w:val="center"/>
+            </w:pPr>
+            <w:r/>
+            <w:r>
+              <w:rPr>
+                <w:rFonts w:ascii="Calibri" w:hAnsi="Calibri"/>
+                <w:b/>
+                <w:color w:val="007C8A"/>
+                <w:sz w:val="16"/>
+              </w:rPr>
+              <w:t>8–10</w:t>
+            </w:r>
+          </w:p>
+        </w:tc>
+        <w:tc>
+          <w:tcPr>
+            <w:tcW w:type="dxa" w:w="2436"/>
+            <w:shd w:fill="E6F2F2"/>
+            <w:tcBorders>
+              <w:top w:val="single" w:sz="2" w:space="0" w:color="D8D8D8"/>
+              <w:bottom w:val="single" w:sz="2" w:space="0" w:color="D8D8D8"/>
+              <w:left w:val="single" w:sz="2" w:space="0" w:color="D8D8D8"/>
+              <w:right w:val="single" w:sz="2" w:space="0" w:color="D8D8D8"/>
+            </w:tcBorders>
+            <w:tcMar>
+              <w:top w:w="45" w:type="dxa"/>
+              <w:bottom w:w="45" w:type="dxa"/>
+              <w:left w:w="80" w:type="dxa"/>
+              <w:right w:w="80" w:type="dxa"/>
+            </w:tcMar>
+          </w:tcPr>
+          <w:p>
+            <w:pPr>
+              <w:jc w:val="center"/>
+            </w:pPr>
+            <w:r/>
+            <w:r>
+              <w:rPr>
+                <w:rFonts w:ascii="Calibri" w:hAnsi="Calibri"/>
+                <w:b/>
+                <w:color w:val="1E8849"/>
+                <w:sz w:val="16"/>
+              </w:rPr>
+              <w:t>+8–10</w:t>
+            </w:r>
+          </w:p>
+        </w:tc>
+      </w:tr>
+      <w:tr>
+        <w:tc>
+          <w:tcPr>
+            <w:tcW w:type="dxa" w:w="2436"/>
+            <w:shd w:fill="E6F2F2"/>
+            <w:tcBorders>
+              <w:top w:val="single" w:sz="2" w:space="0" w:color="D8D8D8"/>
+              <w:bottom w:val="single" w:sz="2" w:space="0" w:color="D8D8D8"/>
+              <w:left w:val="single" w:sz="2" w:space="0" w:color="D8D8D8"/>
+              <w:right w:val="single" w:sz="2" w:space="0" w:color="D8D8D8"/>
+            </w:tcBorders>
+            <w:tcMar>
+              <w:top w:w="45" w:type="dxa"/>
+              <w:bottom w:w="45" w:type="dxa"/>
+              <w:left w:w="80" w:type="dxa"/>
+              <w:right w:w="80" w:type="dxa"/>
+            </w:tcMar>
+          </w:tcPr>
+          <w:p>
+            <w:pPr>
+              <w:jc w:val="left"/>
+            </w:pPr>
+            <w:r/>
+            <w:r>
+              <w:rPr>
+                <w:rFonts w:ascii="Calibri" w:hAnsi="Calibri"/>
+                <w:b/>
+                <w:color w:val="007C8A"/>
+                <w:sz w:val="16"/>
+              </w:rPr>
+              <w:t>Allo-HSCT on-island / year (HAM)</w:t>
+            </w:r>
+          </w:p>
+        </w:tc>
+        <w:tc>
+          <w:tcPr>
+            <w:tcW w:type="dxa" w:w="2436"/>
             <w:shd w:fill="E6F2F2"/>
             <w:tcBorders>
               <w:top w:val="single" w:sz="2" w:space="0" w:color="D8D8D8"/>
@@ -3401,7 +2771,7 @@
         </w:tc>
         <w:tc>
           <w:tcPr>
-            <w:tcW w:type="dxa" w:w="3249"/>
+            <w:tcW w:type="dxa" w:w="2436"/>
             <w:shd w:fill="E6F2F2"/>
             <w:tcBorders>
               <w:top w:val="single" w:sz="2" w:space="0" w:color="D8D8D8"/>
@@ -3428,48 +2798,13 @@
                 <w:color w:val="007C8A"/>
                 <w:sz w:val="16"/>
               </w:rPr>
-              <w:t>25–38</w:t>
-            </w:r>
-          </w:p>
-        </w:tc>
-      </w:tr>
-      <w:tr>
-        <w:tc>
-          <w:tcPr>
-            <w:tcW w:type="dxa" w:w="3249"/>
-            <w:shd w:fill="E6F2F2"/>
-            <w:tcBorders>
-              <w:top w:val="single" w:sz="2" w:space="0" w:color="D8D8D8"/>
-              <w:bottom w:val="single" w:sz="2" w:space="0" w:color="D8D8D8"/>
-              <w:left w:val="single" w:sz="2" w:space="0" w:color="D8D8D8"/>
-              <w:right w:val="single" w:sz="2" w:space="0" w:color="D8D8D8"/>
-            </w:tcBorders>
-            <w:tcMar>
-              <w:top w:w="45" w:type="dxa"/>
-              <w:bottom w:w="45" w:type="dxa"/>
-              <w:left w:w="80" w:type="dxa"/>
-              <w:right w:w="80" w:type="dxa"/>
-            </w:tcMar>
-          </w:tcPr>
-          <w:p>
-            <w:pPr>
-              <w:jc w:val="left"/>
-            </w:pPr>
-            <w:r/>
-            <w:r>
-              <w:rPr>
-                <w:rFonts w:ascii="Calibri" w:hAnsi="Calibri"/>
-                <w:b/>
-                <w:color w:val="007C8A"/>
-                <w:sz w:val="16"/>
-              </w:rPr>
-              <w:t>CAR-T on-island / year</w:t>
+              <w:t>16–24</w:t>
             </w:r>
           </w:p>
         </w:tc>
         <w:tc>
           <w:tcPr>
-            <w:tcW w:type="dxa" w:w="3249"/>
+            <w:tcW w:type="dxa" w:w="2436"/>
             <w:shd w:fill="E6F2F2"/>
             <w:tcBorders>
               <w:top w:val="single" w:sz="2" w:space="0" w:color="D8D8D8"/>
@@ -3493,43 +2828,10 @@
               <w:rPr>
                 <w:rFonts w:ascii="Calibri" w:hAnsi="Calibri"/>
                 <w:b/>
-                <w:color w:val="007C8A"/>
+                <w:color w:val="1E8849"/>
                 <w:sz w:val="16"/>
               </w:rPr>
-              <w:t>0</w:t>
-            </w:r>
-          </w:p>
-        </w:tc>
-        <w:tc>
-          <w:tcPr>
-            <w:tcW w:type="dxa" w:w="3249"/>
-            <w:shd w:fill="E6F2F2"/>
-            <w:tcBorders>
-              <w:top w:val="single" w:sz="2" w:space="0" w:color="D8D8D8"/>
-              <w:bottom w:val="single" w:sz="2" w:space="0" w:color="D8D8D8"/>
-              <w:left w:val="single" w:sz="2" w:space="0" w:color="D8D8D8"/>
-              <w:right w:val="single" w:sz="2" w:space="0" w:color="D8D8D8"/>
-            </w:tcBorders>
-            <w:tcMar>
-              <w:top w:w="45" w:type="dxa"/>
-              <w:bottom w:w="45" w:type="dxa"/>
-              <w:left w:w="80" w:type="dxa"/>
-              <w:right w:w="80" w:type="dxa"/>
-            </w:tcMar>
-          </w:tcPr>
-          <w:p>
-            <w:pPr>
-              <w:jc w:val="center"/>
-            </w:pPr>
-            <w:r/>
-            <w:r>
-              <w:rPr>
-                <w:rFonts w:ascii="Calibri" w:hAnsi="Calibri"/>
-                <w:b/>
-                <w:color w:val="007C8A"/>
-                <w:sz w:val="16"/>
-              </w:rPr>
-              <w:t>30–45</w:t>
+              <w:t>+8–9</w:t>
             </w:r>
           </w:p>
         </w:tc>
@@ -3537,7 +2839,7 @@
       <w:tr>
         <w:tc>
           <w:tcPr>
-            <w:tcW w:type="dxa" w:w="3249"/>
+            <w:tcW w:type="dxa" w:w="2436"/>
             <w:shd w:fill="E6F2F2"/>
             <w:tcBorders>
               <w:top w:val="single" w:sz="2" w:space="0" w:color="D8D8D8"/>
@@ -3570,7 +2872,7 @@
         </w:tc>
         <w:tc>
           <w:tcPr>
-            <w:tcW w:type="dxa" w:w="3249"/>
+            <w:tcW w:type="dxa" w:w="2436"/>
             <w:shd w:fill="E6F2F2"/>
             <w:tcBorders>
               <w:top w:val="single" w:sz="2" w:space="0" w:color="D8D8D8"/>
@@ -3603,7 +2905,7 @@
         </w:tc>
         <w:tc>
           <w:tcPr>
-            <w:tcW w:type="dxa" w:w="3249"/>
+            <w:tcW w:type="dxa" w:w="2436"/>
             <w:shd w:fill="E6F2F2"/>
             <w:tcBorders>
               <w:top w:val="single" w:sz="2" w:space="0" w:color="D8D8D8"/>
@@ -3630,7 +2932,40 @@
                 <w:color w:val="007C8A"/>
                 <w:sz w:val="16"/>
               </w:rPr>
-              <w:t>117–166</w:t>
+              <w:t>74–104</w:t>
+            </w:r>
+          </w:p>
+        </w:tc>
+        <w:tc>
+          <w:tcPr>
+            <w:tcW w:type="dxa" w:w="2436"/>
+            <w:shd w:fill="E6F2F2"/>
+            <w:tcBorders>
+              <w:top w:val="single" w:sz="2" w:space="0" w:color="D8D8D8"/>
+              <w:bottom w:val="single" w:sz="2" w:space="0" w:color="D8D8D8"/>
+              <w:left w:val="single" w:sz="2" w:space="0" w:color="D8D8D8"/>
+              <w:right w:val="single" w:sz="2" w:space="0" w:color="D8D8D8"/>
+            </w:tcBorders>
+            <w:tcMar>
+              <w:top w:w="45" w:type="dxa"/>
+              <w:bottom w:w="45" w:type="dxa"/>
+              <w:left w:w="80" w:type="dxa"/>
+              <w:right w:w="80" w:type="dxa"/>
+            </w:tcMar>
+          </w:tcPr>
+          <w:p>
+            <w:pPr>
+              <w:jc w:val="center"/>
+            </w:pPr>
+            <w:r/>
+            <w:r>
+              <w:rPr>
+                <w:rFonts w:ascii="Calibri" w:hAnsi="Calibri"/>
+                <w:b/>
+                <w:color w:val="1E8849"/>
+                <w:sz w:val="16"/>
+              </w:rPr>
+              <w:t>+46–54</w:t>
             </w:r>
           </w:p>
         </w:tc>
@@ -3638,7 +2973,7 @@
       <w:tr>
         <w:tc>
           <w:tcPr>
-            <w:tcW w:type="dxa" w:w="3249"/>
+            <w:tcW w:type="dxa" w:w="2436"/>
             <w:shd w:fill="FFFFFF"/>
             <w:tcBorders>
               <w:top w:val="single" w:sz="2" w:space="0" w:color="D8D8D8"/>
@@ -3665,13 +3000,13 @@
                 <w:color w:val="0C2340"/>
                 <w:sz w:val="16"/>
               </w:rPr>
-              <w:t>Patients traveling to mainland</w:t>
+              <w:t>Patients flying to mainland / year</w:t>
             </w:r>
           </w:p>
         </w:tc>
         <w:tc>
           <w:tcPr>
-            <w:tcW w:type="dxa" w:w="3249"/>
+            <w:tcW w:type="dxa" w:w="2436"/>
             <w:shd w:fill="FFFFFF"/>
             <w:tcBorders>
               <w:top w:val="single" w:sz="2" w:space="0" w:color="D8D8D8"/>
@@ -3697,13 +3032,13 @@
                 <w:color w:val="333333"/>
                 <w:sz w:val="16"/>
               </w:rPr>
-              <w:t>60–100 / yr</w:t>
+              <w:t>60–100</w:t>
             </w:r>
           </w:p>
         </w:tc>
         <w:tc>
           <w:tcPr>
-            <w:tcW w:type="dxa" w:w="3249"/>
+            <w:tcW w:type="dxa" w:w="2436"/>
             <w:shd w:fill="FFFFFF"/>
             <w:tcBorders>
               <w:top w:val="single" w:sz="2" w:space="0" w:color="D8D8D8"/>
@@ -3729,7 +3064,39 @@
                 <w:color w:val="333333"/>
                 <w:sz w:val="16"/>
               </w:rPr>
-              <w:t>18–31 / yr</w:t>
+              <w:t>30–55</w:t>
+            </w:r>
+          </w:p>
+        </w:tc>
+        <w:tc>
+          <w:tcPr>
+            <w:tcW w:type="dxa" w:w="2436"/>
+            <w:shd w:fill="FFFFFF"/>
+            <w:tcBorders>
+              <w:top w:val="single" w:sz="2" w:space="0" w:color="D8D8D8"/>
+              <w:bottom w:val="single" w:sz="2" w:space="0" w:color="D8D8D8"/>
+              <w:left w:val="single" w:sz="2" w:space="0" w:color="D8D8D8"/>
+              <w:right w:val="single" w:sz="2" w:space="0" w:color="D8D8D8"/>
+            </w:tcBorders>
+            <w:tcMar>
+              <w:top w:w="45" w:type="dxa"/>
+              <w:bottom w:w="45" w:type="dxa"/>
+              <w:left w:w="80" w:type="dxa"/>
+              <w:right w:w="80" w:type="dxa"/>
+            </w:tcMar>
+          </w:tcPr>
+          <w:p>
+            <w:pPr>
+              <w:jc w:val="center"/>
+            </w:pPr>
+            <w:r/>
+            <w:r>
+              <w:rPr>
+                <w:rFonts w:ascii="Calibri" w:hAnsi="Calibri"/>
+                <w:color w:val="BB3333"/>
+                <w:sz w:val="16"/>
+              </w:rPr>
+              <w:t>-30–45</w:t>
             </w:r>
           </w:p>
         </w:tc>
@@ -3737,7 +3104,7 @@
       <w:tr>
         <w:tc>
           <w:tcPr>
-            <w:tcW w:type="dxa" w:w="3249"/>
+            <w:tcW w:type="dxa" w:w="2436"/>
             <w:shd w:fill="E6F2F2"/>
             <w:tcBorders>
               <w:top w:val="single" w:sz="2" w:space="0" w:color="D8D8D8"/>
@@ -3764,13 +3131,13 @@
                 <w:color w:val="007C8A"/>
                 <w:sz w:val="16"/>
               </w:rPr>
-              <w:t>ARC apheresis procedures (new)</w:t>
+              <w:t>Total ARC procedures island-wide</w:t>
             </w:r>
           </w:p>
         </w:tc>
         <w:tc>
           <w:tcPr>
-            <w:tcW w:type="dxa" w:w="3249"/>
+            <w:tcW w:type="dxa" w:w="2436"/>
             <w:shd w:fill="E6F2F2"/>
             <w:tcBorders>
               <w:top w:val="single" w:sz="2" w:space="0" w:color="D8D8D8"/>
@@ -3797,13 +3164,46 @@
                 <w:color w:val="007C8A"/>
                 <w:sz w:val="16"/>
               </w:rPr>
-              <w:t>0</w:t>
+              <w:t>Current baseline</w:t>
             </w:r>
           </w:p>
         </w:tc>
         <w:tc>
           <w:tcPr>
-            <w:tcW w:type="dxa" w:w="3249"/>
+            <w:tcW w:type="dxa" w:w="2436"/>
+            <w:shd w:fill="E6F2F2"/>
+            <w:tcBorders>
+              <w:top w:val="single" w:sz="2" w:space="0" w:color="D8D8D8"/>
+              <w:bottom w:val="single" w:sz="2" w:space="0" w:color="D8D8D8"/>
+              <w:left w:val="single" w:sz="2" w:space="0" w:color="D8D8D8"/>
+              <w:right w:val="single" w:sz="2" w:space="0" w:color="D8D8D8"/>
+            </w:tcBorders>
+            <w:tcMar>
+              <w:top w:w="45" w:type="dxa"/>
+              <w:bottom w:w="45" w:type="dxa"/>
+              <w:left w:w="80" w:type="dxa"/>
+              <w:right w:w="80" w:type="dxa"/>
+            </w:tcMar>
+          </w:tcPr>
+          <w:p>
+            <w:pPr>
+              <w:jc w:val="center"/>
+            </w:pPr>
+            <w:r/>
+            <w:r>
+              <w:rPr>
+                <w:rFonts w:ascii="Calibri" w:hAnsi="Calibri"/>
+                <w:b/>
+                <w:color w:val="1E8849"/>
+                <w:sz w:val="16"/>
+              </w:rPr>
+              <w:t>+35–50 above baseline</w:t>
+            </w:r>
+          </w:p>
+        </w:tc>
+        <w:tc>
+          <w:tcPr>
+            <w:tcW w:type="dxa" w:w="2436"/>
             <w:shd w:fill="E6F2F2"/>
             <w:tcBorders>
               <w:top w:val="single" w:sz="2" w:space="0" w:color="D8D8D8"/>
@@ -3830,7 +3230,7 @@
                 <w:color w:val="007C8A"/>
                 <w:sz w:val="16"/>
               </w:rPr>
-              <w:t>85–122 / yr</w:t>
+              <w:t>Net new</w:t>
             </w:r>
           </w:p>
         </w:tc>
@@ -3860,7 +3260,7 @@
           <w:color w:val="0C2340"/>
           <w:sz w:val="17"/>
         </w:rPr>
-        <w:t>ARC is positioned as the sole on-island partner for this growth. No other FACT-accredited provider in Puerto Rico can support the apheresis and cell processing requirements of OncoCel's ambulatory program and TCT Oncology's inpatient programs at CCCUPR and HAM.</w:t>
+        <w:t>ARC is the sole on-island FACT-accredited provider supporting this growth. As patients are retained in Puerto Rico instead of flying to the mainland, ARC's role becomes increasingly central to the island's cellular therapy infrastructure.</w:t>
       </w:r>
     </w:p>
     <w:p>
@@ -4065,7 +3465,7 @@
                 <w:color w:val="333333"/>
                 <w:sz w:val="16"/>
               </w:rPr>
-              <w:t>TCT inpatient program launches at CCCUPR; OncoCel ambulatory center active</w:t>
+              <w:t>OncoCel ambulatory center active; TCT inpatient launches at CCCUPR</w:t>
             </w:r>
           </w:p>
         </w:tc>
@@ -4164,7 +3564,7 @@
                 <w:color w:val="333333"/>
                 <w:sz w:val="16"/>
               </w:rPr>
-              <w:t>First autologous HSC collections (CCCUPR)</w:t>
+              <w:t>First autologous HSC collections (OncoCel)</w:t>
             </w:r>
           </w:p>
         </w:tc>
@@ -4193,10 +3593,11 @@
             <w:r>
               <w:rPr>
                 <w:rFonts w:ascii="Calibri" w:hAnsi="Calibri"/>
-                <w:color w:val="333333"/>
+                <w:b/>
+                <w:color w:val="1E8849"/>
                 <w:sz w:val="16"/>
               </w:rPr>
-              <w:t>12–18 collections in Year 1</w:t>
+              <w:t>+8–10 collections in Year 1</w:t>
             </w:r>
           </w:p>
         </w:tc>
@@ -4263,7 +3664,7 @@
                 <w:color w:val="333333"/>
                 <w:sz w:val="16"/>
               </w:rPr>
-              <w:t>First CAR-T leukapheresis (CCCUPR)</w:t>
+              <w:t>First research CAR-T leukapheresis (OncoCel)</w:t>
             </w:r>
           </w:p>
         </w:tc>
@@ -4295,7 +3696,7 @@
                 <w:color w:val="333333"/>
                 <w:sz w:val="16"/>
               </w:rPr>
-              <w:t>Contract amendment needed</w:t>
+              <w:t>New service type — contract amendment needed</w:t>
             </w:r>
           </w:p>
         </w:tc>
@@ -4359,10 +3760,11 @@
             <w:r>
               <w:rPr>
                 <w:rFonts w:ascii="Calibri" w:hAnsi="Calibri"/>
-                <w:color w:val="333333"/>
+                <w:b/>
+                <w:color w:val="1E8849"/>
                 <w:sz w:val="16"/>
               </w:rPr>
-              <w:t>Allo-HSCT donor collections ramp (HAM — TCT inpatient)</w:t>
+              <w:t>Year 2 ramp: 15–20 auto + 8–10 CAR-T (OncoCel)</w:t>
             </w:r>
           </w:p>
         </w:tc>
@@ -4391,10 +3793,11 @@
             <w:r>
               <w:rPr>
                 <w:rFonts w:ascii="Calibri" w:hAnsi="Calibri"/>
-                <w:color w:val="333333"/>
+                <w:b/>
+                <w:color w:val="1E8849"/>
                 <w:sz w:val="16"/>
               </w:rPr>
-              <w:t>Donor volume increasing</w:t>
+              <w:t>+23–30 OncoCel procedures above baseline</w:t>
             </w:r>
           </w:p>
         </w:tc>
@@ -4429,7 +3832,7 @@
                 <w:color w:val="0C2340"/>
                 <w:sz w:val="16"/>
               </w:rPr>
-              <w:t>2028–2029</w:t>
+              <w:t>Ongoing</w:t>
             </w:r>
           </w:p>
         </w:tc>
@@ -4461,7 +3864,7 @@
                 <w:color w:val="333333"/>
                 <w:sz w:val="16"/>
               </w:rPr>
-              <w:t>Program reaches 40–58 procedures / year</w:t>
+              <w:t>Island-wide network scales (OncoCel + TCT)</w:t>
             </w:r>
           </w:p>
         </w:tc>
@@ -4490,109 +3893,11 @@
             <w:r>
               <w:rPr>
                 <w:rFonts w:ascii="Calibri" w:hAnsi="Calibri"/>
-                <w:color w:val="333333"/>
+                <w:b/>
+                <w:color w:val="1E8849"/>
                 <w:sz w:val="16"/>
               </w:rPr>
-              <w:t>Volume-based pricing discussion</w:t>
-            </w:r>
-          </w:p>
-        </w:tc>
-      </w:tr>
-      <w:tr>
-        <w:tc>
-          <w:tcPr>
-            <w:tcW w:type="dxa" w:w="3249"/>
-            <w:shd w:fill="F4F7F8"/>
-            <w:tcBorders>
-              <w:top w:val="single" w:sz="2" w:space="0" w:color="D8D8D8"/>
-              <w:bottom w:val="single" w:sz="2" w:space="0" w:color="D8D8D8"/>
-              <w:left w:val="single" w:sz="2" w:space="0" w:color="D8D8D8"/>
-              <w:right w:val="single" w:sz="2" w:space="0" w:color="D8D8D8"/>
-            </w:tcBorders>
-            <w:tcMar>
-              <w:top w:w="45" w:type="dxa"/>
-              <w:bottom w:w="45" w:type="dxa"/>
-              <w:left w:w="80" w:type="dxa"/>
-              <w:right w:w="80" w:type="dxa"/>
-            </w:tcMar>
-          </w:tcPr>
-          <w:p>
-            <w:pPr>
-              <w:jc w:val="left"/>
-            </w:pPr>
-            <w:r/>
-            <w:r>
-              <w:rPr>
-                <w:rFonts w:ascii="Calibri" w:hAnsi="Calibri"/>
-                <w:b/>
-                <w:color w:val="0C2340"/>
-                <w:sz w:val="16"/>
-              </w:rPr>
-              <w:t>2031</w:t>
-            </w:r>
-          </w:p>
-        </w:tc>
-        <w:tc>
-          <w:tcPr>
-            <w:tcW w:type="dxa" w:w="3249"/>
-            <w:shd w:fill="F4F7F8"/>
-            <w:tcBorders>
-              <w:top w:val="single" w:sz="2" w:space="0" w:color="D8D8D8"/>
-              <w:bottom w:val="single" w:sz="2" w:space="0" w:color="D8D8D8"/>
-              <w:left w:val="single" w:sz="2" w:space="0" w:color="D8D8D8"/>
-              <w:right w:val="single" w:sz="2" w:space="0" w:color="D8D8D8"/>
-            </w:tcBorders>
-            <w:tcMar>
-              <w:top w:w="45" w:type="dxa"/>
-              <w:bottom w:w="45" w:type="dxa"/>
-              <w:left w:w="80" w:type="dxa"/>
-              <w:right w:w="80" w:type="dxa"/>
-            </w:tcMar>
-          </w:tcPr>
-          <w:p>
-            <w:pPr>
-              <w:jc w:val="center"/>
-            </w:pPr>
-            <w:r/>
-            <w:r>
-              <w:rPr>
-                <w:rFonts w:ascii="Calibri" w:hAnsi="Calibri"/>
-                <w:color w:val="333333"/>
-                <w:sz w:val="16"/>
-              </w:rPr>
-              <w:t>Full program at 85–122 procedures / year</w:t>
-            </w:r>
-          </w:p>
-        </w:tc>
-        <w:tc>
-          <w:tcPr>
-            <w:tcW w:type="dxa" w:w="3249"/>
-            <w:shd w:fill="F4F7F8"/>
-            <w:tcBorders>
-              <w:top w:val="single" w:sz="2" w:space="0" w:color="D8D8D8"/>
-              <w:bottom w:val="single" w:sz="2" w:space="0" w:color="D8D8D8"/>
-              <w:left w:val="single" w:sz="2" w:space="0" w:color="D8D8D8"/>
-              <w:right w:val="single" w:sz="2" w:space="0" w:color="D8D8D8"/>
-            </w:tcBorders>
-            <w:tcMar>
-              <w:top w:w="45" w:type="dxa"/>
-              <w:bottom w:w="45" w:type="dxa"/>
-              <w:left w:w="80" w:type="dxa"/>
-              <w:right w:w="80" w:type="dxa"/>
-            </w:tcMar>
-          </w:tcPr>
-          <w:p>
-            <w:pPr>
-              <w:jc w:val="center"/>
-            </w:pPr>
-            <w:r/>
-            <w:r>
-              <w:rPr>
-                <w:rFonts w:ascii="Calibri" w:hAnsi="Calibri"/>
-                <w:color w:val="333333"/>
-                <w:sz w:val="16"/>
-              </w:rPr>
-              <w:t>Steady-state capacity planning</w:t>
+              <w:t>+35–50 total island-wide above baseline</w:t>
             </w:r>
           </w:p>
         </w:tc>

</xml_diff>